<commit_message>
implemented printing fixation identification act
</commit_message>
<xml_diff>
--- a/RightholderWorkplace/Templates/F_Наказ на фіксацію.docx
+++ b/RightholderWorkplace/Templates/F_Наказ на фіксацію.docx
@@ -1,6 +1,6 @@
 
 <file path=word/document.xml><?xml version="1.0" encoding="utf-8"?>
-<w:document xmlns:wpc="http://schemas.microsoft.com/office/word/2010/wordprocessingCanvas" xmlns:mc="http://schemas.openxmlformats.org/markup-compatibility/2006" xmlns:o="urn:schemas-microsoft-com:office:office" xmlns:r="http://schemas.openxmlformats.org/officeDocument/2006/relationships" xmlns:m="http://schemas.openxmlformats.org/officeDocument/2006/math" xmlns:v="urn:schemas-microsoft-com:vml" xmlns:wp14="http://schemas.microsoft.com/office/word/2010/wordprocessingDrawing" xmlns:wp="http://schemas.openxmlformats.org/drawingml/2006/wordprocessingDrawing" xmlns:w10="urn:schemas-microsoft-com:office:word" xmlns:w="http://schemas.openxmlformats.org/wordprocessingml/2006/main" xmlns:w14="http://schemas.microsoft.com/office/word/2010/wordml" xmlns:wpg="http://schemas.microsoft.com/office/word/2010/wordprocessingGroup" xmlns:wpi="http://schemas.microsoft.com/office/word/2010/wordprocessingInk" xmlns:wne="http://schemas.microsoft.com/office/word/2006/wordml" xmlns:wps="http://schemas.microsoft.com/office/word/2010/wordprocessingShape" mc:Ignorable="w14 wp14">
+<w:document xmlns:wpc="http://schemas.microsoft.com/office/word/2010/wordprocessingCanvas" xmlns:cx="http://schemas.microsoft.com/office/drawing/2014/chartex" xmlns:cx1="http://schemas.microsoft.com/office/drawing/2015/9/8/chartex" xmlns:cx2="http://schemas.microsoft.com/office/drawing/2015/10/21/chartex" xmlns:cx3="http://schemas.microsoft.com/office/drawing/2016/5/9/chartex" xmlns:cx4="http://schemas.microsoft.com/office/drawing/2016/5/10/chartex" xmlns:cx5="http://schemas.microsoft.com/office/drawing/2016/5/11/chartex" xmlns:cx6="http://schemas.microsoft.com/office/drawing/2016/5/12/chartex" xmlns:cx7="http://schemas.microsoft.com/office/drawing/2016/5/13/chartex" xmlns:cx8="http://schemas.microsoft.com/office/drawing/2016/5/14/chartex" xmlns:mc="http://schemas.openxmlformats.org/markup-compatibility/2006" xmlns:aink="http://schemas.microsoft.com/office/drawing/2016/ink" xmlns:am3d="http://schemas.microsoft.com/office/drawing/2017/model3d" xmlns:o="urn:schemas-microsoft-com:office:office" xmlns:r="http://schemas.openxmlformats.org/officeDocument/2006/relationships" xmlns:m="http://schemas.openxmlformats.org/officeDocument/2006/math" xmlns:v="urn:schemas-microsoft-com:vml" xmlns:wp14="http://schemas.microsoft.com/office/word/2010/wordprocessingDrawing" xmlns:wp="http://schemas.openxmlformats.org/drawingml/2006/wordprocessingDrawing" xmlns:w10="urn:schemas-microsoft-com:office:word" xmlns:w="http://schemas.openxmlformats.org/wordprocessingml/2006/main" xmlns:w14="http://schemas.microsoft.com/office/word/2010/wordml" xmlns:w15="http://schemas.microsoft.com/office/word/2012/wordml" xmlns:w16cid="http://schemas.microsoft.com/office/word/2016/wordml/cid" xmlns:w16se="http://schemas.microsoft.com/office/word/2015/wordml/symex" xmlns:wpg="http://schemas.microsoft.com/office/word/2010/wordprocessingGroup" xmlns:wpi="http://schemas.microsoft.com/office/word/2010/wordprocessingInk" xmlns:wne="http://schemas.microsoft.com/office/word/2006/wordml" xmlns:wps="http://schemas.microsoft.com/office/word/2010/wordprocessingShape" mc:Ignorable="w14 w15 w16se w16cid wp14">
   <w:body>
     <w:p>
       <w:pPr>
@@ -38,9 +38,9 @@
           </v:shapetype>
           <v:shape id="_x0000_i1025" type="#_x0000_t75" style="width:68.25pt;height:59.25pt" o:ole="" filled="t">
             <v:fill color2="black"/>
-            <v:imagedata r:id="rId6" o:title=""/>
+            <v:imagedata r:id="rId5" o:title=""/>
           </v:shape>
-          <o:OLEObject Type="Embed" ProgID="Word.Picture.8" ShapeID="_x0000_i1025" DrawAspect="Content" ObjectID="_1600674976" r:id="rId7"/>
+          <o:OLEObject Type="Embed" ProgID="Word.Picture.8" ShapeID="_x0000_i1025" DrawAspect="Content" ObjectID="_1601213817" r:id="rId6"/>
         </w:object>
       </w:r>
     </w:p>
@@ -213,10 +213,11 @@
           <w:showingPlcHdr/>
           <w:text/>
         </w:sdtPr>
+        <w:sdtEndPr/>
         <w:sdtContent>
           <w:r>
             <w:rPr>
-              <w:rStyle w:val="aa"/>
+              <w:rStyle w:val="a9"/>
             </w:rPr>
             <w:t>Место для ввода текста.</w:t>
           </w:r>
@@ -308,45 +309,16 @@
           <w:color w:val="000000"/>
           <w:sz w:val="28"/>
           <w:szCs w:val="28"/>
-          <w:u w:val="single"/>
-        </w:rPr>
-        <w:t>№Ф/</w:t>
-      </w:r>
-      <w:r>
-        <w:rPr>
-          <w:color w:val="000000"/>
-          <w:sz w:val="28"/>
-          <w:szCs w:val="28"/>
-          <w:u w:val="single"/>
-        </w:rPr>
-        <w:t>1</w:t>
-      </w:r>
-      <w:r>
-        <w:rPr>
-          <w:color w:val="000000"/>
-          <w:sz w:val="28"/>
-          <w:szCs w:val="28"/>
-          <w:u w:val="single"/>
-        </w:rPr>
-        <w:t>9</w:t>
-      </w:r>
-      <w:r>
-        <w:rPr>
-          <w:color w:val="000000"/>
-          <w:sz w:val="28"/>
-          <w:szCs w:val="28"/>
-          <w:u w:val="single"/>
-        </w:rPr>
-        <w:t>/1</w:t>
-      </w:r>
-      <w:r>
-        <w:rPr>
-          <w:color w:val="000000"/>
-          <w:sz w:val="28"/>
-          <w:szCs w:val="28"/>
-          <w:u w:val="single"/>
-        </w:rPr>
-        <w:t>8</w:t>
+        </w:rPr>
+        <w:t>№</w:t>
+      </w:r>
+      <w:r>
+        <w:rPr>
+          <w:color w:val="000000"/>
+          <w:sz w:val="28"/>
+          <w:szCs w:val="28"/>
+        </w:rPr>
+        <w:t xml:space="preserve"> _____</w:t>
       </w:r>
     </w:p>
     <w:p>
@@ -592,10 +564,11 @@
           <w:showingPlcHdr/>
           <w:text/>
         </w:sdtPr>
+        <w:sdtEndPr/>
         <w:sdtContent>
           <w:r>
             <w:rPr>
-              <w:rStyle w:val="aa"/>
+              <w:rStyle w:val="a9"/>
             </w:rPr>
             <w:t>Место для ввода текста.</w:t>
           </w:r>
@@ -625,10 +598,11 @@
           <w:showingPlcHdr/>
           <w:text/>
         </w:sdtPr>
+        <w:sdtEndPr/>
         <w:sdtContent>
           <w:r>
             <w:rPr>
-              <w:rStyle w:val="aa"/>
+              <w:rStyle w:val="a9"/>
             </w:rPr>
             <w:t>Место для ввода текста.</w:t>
           </w:r>
@@ -674,10 +648,11 @@
           <w:showingPlcHdr/>
           <w:text/>
         </w:sdtPr>
+        <w:sdtEndPr/>
         <w:sdtContent>
           <w:r>
             <w:rPr>
-              <w:rStyle w:val="aa"/>
+              <w:rStyle w:val="a9"/>
             </w:rPr>
             <w:t>Место для ввода текста.</w:t>
           </w:r>
@@ -697,25 +672,7 @@
           <w:sz w:val="28"/>
           <w:szCs w:val="28"/>
         </w:rPr>
-        <w:t xml:space="preserve">на фіксацію на матеріальні носії (аудіо </w:t>
-      </w:r>
-      <w:proofErr w:type="spellStart"/>
-      <w:r>
-        <w:rPr>
-          <w:color w:val="000000"/>
-          <w:sz w:val="28"/>
-          <w:szCs w:val="28"/>
-        </w:rPr>
-        <w:t>та\або</w:t>
-      </w:r>
-      <w:proofErr w:type="spellEnd"/>
-      <w:r>
-        <w:rPr>
-          <w:color w:val="000000"/>
-          <w:sz w:val="28"/>
-          <w:szCs w:val="28"/>
-        </w:rPr>
-        <w:t xml:space="preserve"> відео) факту публічного</w:t>
+        <w:t>на фіксацію на матеріальні носії (аудіо та\або відео) факту публічного</w:t>
       </w:r>
       <w:r>
         <w:rPr>
@@ -783,10 +740,11 @@
           <w:showingPlcHdr/>
           <w:text/>
         </w:sdtPr>
+        <w:sdtEndPr/>
         <w:sdtContent>
           <w:r>
             <w:rPr>
-              <w:rStyle w:val="aa"/>
+              <w:rStyle w:val="a9"/>
             </w:rPr>
             <w:t>Место для ввода текста.</w:t>
           </w:r>
@@ -824,10 +782,11 @@
           <w:showingPlcHdr/>
           <w:text/>
         </w:sdtPr>
+        <w:sdtEndPr/>
         <w:sdtContent>
           <w:r>
             <w:rPr>
-              <w:rStyle w:val="aa"/>
+              <w:rStyle w:val="a9"/>
             </w:rPr>
             <w:t>Место для ввода текста.</w:t>
           </w:r>
@@ -875,24 +834,16 @@
           <w:showingPlcHdr/>
           <w:text/>
         </w:sdtPr>
+        <w:sdtEndPr/>
         <w:sdtContent>
           <w:r>
             <w:rPr>
-              <w:rStyle w:val="aa"/>
+              <w:rStyle w:val="a9"/>
             </w:rPr>
             <w:t>Место для ввода текста.</w:t>
           </w:r>
         </w:sdtContent>
       </w:sdt>
-      <w:r>
-        <w:rPr>
-          <w:color w:val="000000"/>
-          <w:sz w:val="28"/>
-          <w:szCs w:val="28"/>
-          <w:lang w:val="ru-RU"/>
-        </w:rPr>
-        <w:t xml:space="preserve"> </w:t>
-      </w:r>
       <w:r>
         <w:rPr>
           <w:color w:val="000000"/>
@@ -925,15 +876,25 @@
           <w:showingPlcHdr/>
           <w:text/>
         </w:sdtPr>
+        <w:sdtEndPr/>
         <w:sdtContent>
           <w:r>
             <w:rPr>
-              <w:rStyle w:val="aa"/>
+              <w:rStyle w:val="a9"/>
             </w:rPr>
             <w:t>Место для ввода текста.</w:t>
           </w:r>
         </w:sdtContent>
       </w:sdt>
+      <w:r>
+        <w:rPr>
+          <w:color w:val="000000"/>
+          <w:sz w:val="28"/>
+          <w:szCs w:val="28"/>
+          <w:lang w:val="ru-RU"/>
+        </w:rPr>
+        <w:t>.</w:t>
+      </w:r>
     </w:p>
     <w:p>
       <w:pPr>
@@ -981,8 +942,6 @@
         </w:rPr>
         <w:t>.</w:t>
       </w:r>
-      <w:bookmarkStart w:id="0" w:name="_GoBack"/>
-      <w:bookmarkEnd w:id="0"/>
     </w:p>
     <w:p>
       <w:pPr>
@@ -1035,23 +994,13 @@
           <w:szCs w:val="28"/>
         </w:rPr>
       </w:pPr>
-      <w:proofErr w:type="spellStart"/>
-      <w:r>
-        <w:rPr>
-          <w:color w:val="000000"/>
-          <w:sz w:val="28"/>
-          <w:szCs w:val="28"/>
-        </w:rPr>
-        <w:t>В.о</w:t>
-      </w:r>
-      <w:proofErr w:type="spellEnd"/>
-      <w:r>
-        <w:rPr>
-          <w:color w:val="000000"/>
-          <w:sz w:val="28"/>
-          <w:szCs w:val="28"/>
-        </w:rPr>
-        <w:t xml:space="preserve">. </w:t>
+      <w:r>
+        <w:rPr>
+          <w:color w:val="000000"/>
+          <w:sz w:val="28"/>
+          <w:szCs w:val="28"/>
+        </w:rPr>
+        <w:t xml:space="preserve">В.о. </w:t>
       </w:r>
       <w:r>
         <w:rPr>
@@ -1865,6 +1814,27 @@
               </w:rPr>
               <w:t xml:space="preserve">____________ </w:t>
             </w:r>
+            <w:r>
+              <w:rPr>
+                <w:b/>
+                <w:bCs/>
+                <w:iCs/>
+                <w:sz w:val="28"/>
+                <w:szCs w:val="28"/>
+                <w:lang w:eastAsia="ru-RU"/>
+              </w:rPr>
+              <w:t>Л.Ю.</w:t>
+            </w:r>
+            <w:r>
+              <w:rPr>
+                <w:bCs/>
+                <w:iCs/>
+                <w:sz w:val="28"/>
+                <w:szCs w:val="28"/>
+                <w:lang w:eastAsia="ru-RU"/>
+              </w:rPr>
+              <w:t xml:space="preserve"> </w:t>
+            </w:r>
             <w:proofErr w:type="spellStart"/>
             <w:r>
               <w:rPr>
@@ -1877,18 +1847,9 @@
               </w:rPr>
               <w:t>Гамарко</w:t>
             </w:r>
+            <w:bookmarkStart w:id="0" w:name="_GoBack"/>
+            <w:bookmarkEnd w:id="0"/>
             <w:proofErr w:type="spellEnd"/>
-            <w:r>
-              <w:rPr>
-                <w:b/>
-                <w:bCs/>
-                <w:iCs/>
-                <w:sz w:val="28"/>
-                <w:szCs w:val="28"/>
-                <w:lang w:eastAsia="ru-RU"/>
-              </w:rPr>
-              <w:t xml:space="preserve"> Л.Ю.</w:t>
-            </w:r>
           </w:p>
         </w:tc>
       </w:tr>
@@ -1913,8 +1874,8 @@
 </file>
 
 <file path=word/numbering.xml><?xml version="1.0" encoding="utf-8"?>
-<w:numbering xmlns:wpc="http://schemas.microsoft.com/office/word/2010/wordprocessingCanvas" xmlns:mc="http://schemas.openxmlformats.org/markup-compatibility/2006" xmlns:o="urn:schemas-microsoft-com:office:office" xmlns:r="http://schemas.openxmlformats.org/officeDocument/2006/relationships" xmlns:m="http://schemas.openxmlformats.org/officeDocument/2006/math" xmlns:v="urn:schemas-microsoft-com:vml" xmlns:wp14="http://schemas.microsoft.com/office/word/2010/wordprocessingDrawing" xmlns:wp="http://schemas.openxmlformats.org/drawingml/2006/wordprocessingDrawing" xmlns:w10="urn:schemas-microsoft-com:office:word" xmlns:w="http://schemas.openxmlformats.org/wordprocessingml/2006/main" xmlns:w14="http://schemas.microsoft.com/office/word/2010/wordml" xmlns:wpg="http://schemas.microsoft.com/office/word/2010/wordprocessingGroup" xmlns:wpi="http://schemas.microsoft.com/office/word/2010/wordprocessingInk" xmlns:wne="http://schemas.microsoft.com/office/word/2006/wordml" xmlns:wps="http://schemas.microsoft.com/office/word/2010/wordprocessingShape" mc:Ignorable="w14 wp14">
-  <w:abstractNum w:abstractNumId="0">
+<w:numbering xmlns:wpc="http://schemas.microsoft.com/office/word/2010/wordprocessingCanvas" xmlns:cx="http://schemas.microsoft.com/office/drawing/2014/chartex" xmlns:cx1="http://schemas.microsoft.com/office/drawing/2015/9/8/chartex" xmlns:cx2="http://schemas.microsoft.com/office/drawing/2015/10/21/chartex" xmlns:cx3="http://schemas.microsoft.com/office/drawing/2016/5/9/chartex" xmlns:cx4="http://schemas.microsoft.com/office/drawing/2016/5/10/chartex" xmlns:cx5="http://schemas.microsoft.com/office/drawing/2016/5/11/chartex" xmlns:cx6="http://schemas.microsoft.com/office/drawing/2016/5/12/chartex" xmlns:cx7="http://schemas.microsoft.com/office/drawing/2016/5/13/chartex" xmlns:cx8="http://schemas.microsoft.com/office/drawing/2016/5/14/chartex" xmlns:mc="http://schemas.openxmlformats.org/markup-compatibility/2006" xmlns:aink="http://schemas.microsoft.com/office/drawing/2016/ink" xmlns:am3d="http://schemas.microsoft.com/office/drawing/2017/model3d" xmlns:o="urn:schemas-microsoft-com:office:office" xmlns:r="http://schemas.openxmlformats.org/officeDocument/2006/relationships" xmlns:m="http://schemas.openxmlformats.org/officeDocument/2006/math" xmlns:v="urn:schemas-microsoft-com:vml" xmlns:wp14="http://schemas.microsoft.com/office/word/2010/wordprocessingDrawing" xmlns:wp="http://schemas.openxmlformats.org/drawingml/2006/wordprocessingDrawing" xmlns:w10="urn:schemas-microsoft-com:office:word" xmlns:w="http://schemas.openxmlformats.org/wordprocessingml/2006/main" xmlns:w14="http://schemas.microsoft.com/office/word/2010/wordml" xmlns:w15="http://schemas.microsoft.com/office/word/2012/wordml" xmlns:w16cid="http://schemas.microsoft.com/office/word/2016/wordml/cid" xmlns:w16se="http://schemas.microsoft.com/office/word/2015/wordml/symex" xmlns:wpg="http://schemas.microsoft.com/office/word/2010/wordprocessingGroup" xmlns:wpi="http://schemas.microsoft.com/office/word/2010/wordprocessingInk" xmlns:wne="http://schemas.microsoft.com/office/word/2006/wordml" xmlns:wps="http://schemas.microsoft.com/office/word/2010/wordprocessingShape" mc:Ignorable="w14 w15 w16se w16cid wp14">
+  <w:abstractNum w:abstractNumId="0" w15:restartNumberingAfterBreak="0">
     <w:nsid w:val="00000001"/>
     <w:multiLevelType w:val="multilevel"/>
     <w:tmpl w:val="00000001"/>
@@ -2036,7 +1997,7 @@
       </w:pPr>
     </w:lvl>
   </w:abstractNum>
-  <w:abstractNum w:abstractNumId="1">
+  <w:abstractNum w:abstractNumId="1" w15:restartNumberingAfterBreak="0">
     <w:nsid w:val="00000002"/>
     <w:multiLevelType w:val="multilevel"/>
     <w:tmpl w:val="00000002"/>
@@ -2160,7 +2121,7 @@
 </file>
 
 <file path=word/styles.xml><?xml version="1.0" encoding="utf-8"?>
-<w:styles xmlns:mc="http://schemas.openxmlformats.org/markup-compatibility/2006" xmlns:r="http://schemas.openxmlformats.org/officeDocument/2006/relationships" xmlns:w="http://schemas.openxmlformats.org/wordprocessingml/2006/main" xmlns:w14="http://schemas.microsoft.com/office/word/2010/wordml" mc:Ignorable="w14">
+<w:styles xmlns:mc="http://schemas.openxmlformats.org/markup-compatibility/2006" xmlns:r="http://schemas.openxmlformats.org/officeDocument/2006/relationships" xmlns:w="http://schemas.openxmlformats.org/wordprocessingml/2006/main" xmlns:w14="http://schemas.microsoft.com/office/word/2010/wordml" xmlns:w15="http://schemas.microsoft.com/office/word/2012/wordml" xmlns:w16cid="http://schemas.microsoft.com/office/word/2016/wordml/cid" xmlns:w16se="http://schemas.microsoft.com/office/word/2015/wordml/symex" mc:Ignorable="w14 w15 w16se w16cid">
   <w:docDefaults>
     <w:rPrDefault>
       <w:rPr>
@@ -2170,144 +2131,382 @@
     </w:rPrDefault>
     <w:pPrDefault/>
   </w:docDefaults>
-  <w:latentStyles w:defLockedState="0" w:defUIPriority="99" w:defSemiHidden="1" w:defUnhideWhenUsed="1" w:defQFormat="0" w:count="267">
-    <w:lsdException w:name="Normal" w:semiHidden="0" w:uiPriority="0" w:unhideWhenUsed="0" w:qFormat="1"/>
-    <w:lsdException w:name="heading 1" w:semiHidden="0" w:uiPriority="9" w:unhideWhenUsed="0" w:qFormat="1"/>
-    <w:lsdException w:name="heading 2" w:semiHidden="0" w:uiPriority="9" w:unhideWhenUsed="0" w:qFormat="1"/>
-    <w:lsdException w:name="heading 3" w:semiHidden="0" w:uiPriority="9" w:unhideWhenUsed="0" w:qFormat="1"/>
-    <w:lsdException w:name="heading 4" w:semiHidden="0" w:uiPriority="9" w:unhideWhenUsed="0" w:qFormat="1"/>
-    <w:lsdException w:name="heading 5" w:semiHidden="0" w:uiPriority="9" w:unhideWhenUsed="0" w:qFormat="1"/>
-    <w:lsdException w:name="heading 6" w:semiHidden="0" w:uiPriority="9" w:unhideWhenUsed="0" w:qFormat="1"/>
-    <w:lsdException w:name="heading 7" w:uiPriority="9" w:qFormat="1"/>
-    <w:lsdException w:name="heading 8" w:uiPriority="9" w:qFormat="1"/>
-    <w:lsdException w:name="heading 9" w:uiPriority="9" w:qFormat="1"/>
-    <w:lsdException w:name="toc 1" w:uiPriority="39"/>
-    <w:lsdException w:name="toc 2" w:uiPriority="39"/>
-    <w:lsdException w:name="toc 3" w:uiPriority="39"/>
-    <w:lsdException w:name="toc 4" w:uiPriority="39"/>
-    <w:lsdException w:name="toc 5" w:uiPriority="39"/>
-    <w:lsdException w:name="toc 6" w:uiPriority="39"/>
-    <w:lsdException w:name="toc 7" w:uiPriority="39"/>
-    <w:lsdException w:name="toc 8" w:uiPriority="39"/>
-    <w:lsdException w:name="toc 9" w:uiPriority="39"/>
-    <w:lsdException w:name="caption" w:semiHidden="0" w:uiPriority="35" w:unhideWhenUsed="0" w:qFormat="1"/>
-    <w:lsdException w:name="Title" w:semiHidden="0" w:uiPriority="10" w:unhideWhenUsed="0" w:qFormat="1"/>
-    <w:lsdException w:name="Default Paragraph Font" w:uiPriority="1"/>
-    <w:lsdException w:name="Subtitle" w:semiHidden="0" w:uiPriority="11" w:unhideWhenUsed="0" w:qFormat="1"/>
-    <w:lsdException w:name="Strong" w:semiHidden="0" w:uiPriority="22" w:unhideWhenUsed="0" w:qFormat="1"/>
-    <w:lsdException w:name="Emphasis" w:semiHidden="0" w:uiPriority="20" w:unhideWhenUsed="0" w:qFormat="1"/>
-    <w:lsdException w:name="Table Grid" w:semiHidden="0" w:uiPriority="59" w:unhideWhenUsed="0"/>
-    <w:lsdException w:name="Placeholder Text" w:unhideWhenUsed="0"/>
-    <w:lsdException w:name="No Spacing" w:semiHidden="0" w:uiPriority="1" w:unhideWhenUsed="0" w:qFormat="1"/>
-    <w:lsdException w:name="Light Shading" w:semiHidden="0" w:uiPriority="60" w:unhideWhenUsed="0"/>
-    <w:lsdException w:name="Light List" w:semiHidden="0" w:uiPriority="61" w:unhideWhenUsed="0"/>
-    <w:lsdException w:name="Light Grid" w:semiHidden="0" w:uiPriority="62" w:unhideWhenUsed="0"/>
-    <w:lsdException w:name="Medium Shading 1" w:semiHidden="0" w:uiPriority="63" w:unhideWhenUsed="0"/>
-    <w:lsdException w:name="Medium Shading 2" w:semiHidden="0" w:uiPriority="64" w:unhideWhenUsed="0"/>
-    <w:lsdException w:name="Medium List 1" w:semiHidden="0" w:uiPriority="65" w:unhideWhenUsed="0"/>
-    <w:lsdException w:name="Medium List 2" w:semiHidden="0" w:uiPriority="66" w:unhideWhenUsed="0"/>
-    <w:lsdException w:name="Medium Grid 1" w:semiHidden="0" w:uiPriority="67" w:unhideWhenUsed="0"/>
-    <w:lsdException w:name="Medium Grid 2" w:semiHidden="0" w:uiPriority="68" w:unhideWhenUsed="0"/>
-    <w:lsdException w:name="Medium Grid 3" w:semiHidden="0" w:uiPriority="69" w:unhideWhenUsed="0"/>
-    <w:lsdException w:name="Dark List" w:semiHidden="0" w:uiPriority="70" w:unhideWhenUsed="0"/>
-    <w:lsdException w:name="Colorful Shading" w:semiHidden="0" w:uiPriority="71" w:unhideWhenUsed="0"/>
-    <w:lsdException w:name="Colorful List" w:semiHidden="0" w:uiPriority="72" w:unhideWhenUsed="0"/>
-    <w:lsdException w:name="Colorful Grid" w:semiHidden="0" w:uiPriority="73" w:unhideWhenUsed="0"/>
-    <w:lsdException w:name="Light Shading Accent 1" w:semiHidden="0" w:uiPriority="60" w:unhideWhenUsed="0"/>
-    <w:lsdException w:name="Light List Accent 1" w:semiHidden="0" w:uiPriority="61" w:unhideWhenUsed="0"/>
-    <w:lsdException w:name="Light Grid Accent 1" w:semiHidden="0" w:uiPriority="62" w:unhideWhenUsed="0"/>
-    <w:lsdException w:name="Medium Shading 1 Accent 1" w:semiHidden="0" w:uiPriority="63" w:unhideWhenUsed="0"/>
-    <w:lsdException w:name="Medium Shading 2 Accent 1" w:semiHidden="0" w:uiPriority="64" w:unhideWhenUsed="0"/>
-    <w:lsdException w:name="Medium List 1 Accent 1" w:semiHidden="0" w:uiPriority="65" w:unhideWhenUsed="0"/>
-    <w:lsdException w:name="Revision" w:unhideWhenUsed="0"/>
-    <w:lsdException w:name="List Paragraph" w:semiHidden="0" w:uiPriority="34" w:unhideWhenUsed="0" w:qFormat="1"/>
-    <w:lsdException w:name="Quote" w:semiHidden="0" w:uiPriority="29" w:unhideWhenUsed="0" w:qFormat="1"/>
-    <w:lsdException w:name="Intense Quote" w:semiHidden="0" w:uiPriority="30" w:unhideWhenUsed="0" w:qFormat="1"/>
-    <w:lsdException w:name="Medium List 2 Accent 1" w:semiHidden="0" w:uiPriority="66" w:unhideWhenUsed="0"/>
-    <w:lsdException w:name="Medium Grid 1 Accent 1" w:semiHidden="0" w:uiPriority="67" w:unhideWhenUsed="0"/>
-    <w:lsdException w:name="Medium Grid 2 Accent 1" w:semiHidden="0" w:uiPriority="68" w:unhideWhenUsed="0"/>
-    <w:lsdException w:name="Medium Grid 3 Accent 1" w:semiHidden="0" w:uiPriority="69" w:unhideWhenUsed="0"/>
-    <w:lsdException w:name="Dark List Accent 1" w:semiHidden="0" w:uiPriority="70" w:unhideWhenUsed="0"/>
-    <w:lsdException w:name="Colorful Shading Accent 1" w:semiHidden="0" w:uiPriority="71" w:unhideWhenUsed="0"/>
-    <w:lsdException w:name="Colorful List Accent 1" w:semiHidden="0" w:uiPriority="72" w:unhideWhenUsed="0"/>
-    <w:lsdException w:name="Colorful Grid Accent 1" w:semiHidden="0" w:uiPriority="73" w:unhideWhenUsed="0"/>
-    <w:lsdException w:name="Light Shading Accent 2" w:semiHidden="0" w:uiPriority="60" w:unhideWhenUsed="0"/>
-    <w:lsdException w:name="Light List Accent 2" w:semiHidden="0" w:uiPriority="61" w:unhideWhenUsed="0"/>
-    <w:lsdException w:name="Light Grid Accent 2" w:semiHidden="0" w:uiPriority="62" w:unhideWhenUsed="0"/>
-    <w:lsdException w:name="Medium Shading 1 Accent 2" w:semiHidden="0" w:uiPriority="63" w:unhideWhenUsed="0"/>
-    <w:lsdException w:name="Medium Shading 2 Accent 2" w:semiHidden="0" w:uiPriority="64" w:unhideWhenUsed="0"/>
-    <w:lsdException w:name="Medium List 1 Accent 2" w:semiHidden="0" w:uiPriority="65" w:unhideWhenUsed="0"/>
-    <w:lsdException w:name="Medium List 2 Accent 2" w:semiHidden="0" w:uiPriority="66" w:unhideWhenUsed="0"/>
-    <w:lsdException w:name="Medium Grid 1 Accent 2" w:semiHidden="0" w:uiPriority="67" w:unhideWhenUsed="0"/>
-    <w:lsdException w:name="Medium Grid 2 Accent 2" w:semiHidden="0" w:uiPriority="68" w:unhideWhenUsed="0"/>
-    <w:lsdException w:name="Medium Grid 3 Accent 2" w:semiHidden="0" w:uiPriority="69" w:unhideWhenUsed="0"/>
-    <w:lsdException w:name="Dark List Accent 2" w:semiHidden="0" w:uiPriority="70" w:unhideWhenUsed="0"/>
-    <w:lsdException w:name="Colorful Shading Accent 2" w:semiHidden="0" w:uiPriority="71" w:unhideWhenUsed="0"/>
-    <w:lsdException w:name="Colorful List Accent 2" w:semiHidden="0" w:uiPriority="72" w:unhideWhenUsed="0"/>
-    <w:lsdException w:name="Colorful Grid Accent 2" w:semiHidden="0" w:uiPriority="73" w:unhideWhenUsed="0"/>
-    <w:lsdException w:name="Light Shading Accent 3" w:semiHidden="0" w:uiPriority="60" w:unhideWhenUsed="0"/>
-    <w:lsdException w:name="Light List Accent 3" w:semiHidden="0" w:uiPriority="61" w:unhideWhenUsed="0"/>
-    <w:lsdException w:name="Light Grid Accent 3" w:semiHidden="0" w:uiPriority="62" w:unhideWhenUsed="0"/>
-    <w:lsdException w:name="Medium Shading 1 Accent 3" w:semiHidden="0" w:uiPriority="63" w:unhideWhenUsed="0"/>
-    <w:lsdException w:name="Medium Shading 2 Accent 3" w:semiHidden="0" w:uiPriority="64" w:unhideWhenUsed="0"/>
-    <w:lsdException w:name="Medium List 1 Accent 3" w:semiHidden="0" w:uiPriority="65" w:unhideWhenUsed="0"/>
-    <w:lsdException w:name="Medium List 2 Accent 3" w:semiHidden="0" w:uiPriority="66" w:unhideWhenUsed="0"/>
-    <w:lsdException w:name="Medium Grid 1 Accent 3" w:semiHidden="0" w:uiPriority="67" w:unhideWhenUsed="0"/>
-    <w:lsdException w:name="Medium Grid 2 Accent 3" w:semiHidden="0" w:uiPriority="68" w:unhideWhenUsed="0"/>
-    <w:lsdException w:name="Medium Grid 3 Accent 3" w:semiHidden="0" w:uiPriority="69" w:unhideWhenUsed="0"/>
-    <w:lsdException w:name="Dark List Accent 3" w:semiHidden="0" w:uiPriority="70" w:unhideWhenUsed="0"/>
-    <w:lsdException w:name="Colorful Shading Accent 3" w:semiHidden="0" w:uiPriority="71" w:unhideWhenUsed="0"/>
-    <w:lsdException w:name="Colorful List Accent 3" w:semiHidden="0" w:uiPriority="72" w:unhideWhenUsed="0"/>
-    <w:lsdException w:name="Colorful Grid Accent 3" w:semiHidden="0" w:uiPriority="73" w:unhideWhenUsed="0"/>
-    <w:lsdException w:name="Light Shading Accent 4" w:semiHidden="0" w:uiPriority="60" w:unhideWhenUsed="0"/>
-    <w:lsdException w:name="Light List Accent 4" w:semiHidden="0" w:uiPriority="61" w:unhideWhenUsed="0"/>
-    <w:lsdException w:name="Light Grid Accent 4" w:semiHidden="0" w:uiPriority="62" w:unhideWhenUsed="0"/>
-    <w:lsdException w:name="Medium Shading 1 Accent 4" w:semiHidden="0" w:uiPriority="63" w:unhideWhenUsed="0"/>
-    <w:lsdException w:name="Medium Shading 2 Accent 4" w:semiHidden="0" w:uiPriority="64" w:unhideWhenUsed="0"/>
-    <w:lsdException w:name="Medium List 1 Accent 4" w:semiHidden="0" w:uiPriority="65" w:unhideWhenUsed="0"/>
-    <w:lsdException w:name="Medium List 2 Accent 4" w:semiHidden="0" w:uiPriority="66" w:unhideWhenUsed="0"/>
-    <w:lsdException w:name="Medium Grid 1 Accent 4" w:semiHidden="0" w:uiPriority="67" w:unhideWhenUsed="0"/>
-    <w:lsdException w:name="Medium Grid 2 Accent 4" w:semiHidden="0" w:uiPriority="68" w:unhideWhenUsed="0"/>
-    <w:lsdException w:name="Medium Grid 3 Accent 4" w:semiHidden="0" w:uiPriority="69" w:unhideWhenUsed="0"/>
-    <w:lsdException w:name="Dark List Accent 4" w:semiHidden="0" w:uiPriority="70" w:unhideWhenUsed="0"/>
-    <w:lsdException w:name="Colorful Shading Accent 4" w:semiHidden="0" w:uiPriority="71" w:unhideWhenUsed="0"/>
-    <w:lsdException w:name="Colorful List Accent 4" w:semiHidden="0" w:uiPriority="72" w:unhideWhenUsed="0"/>
-    <w:lsdException w:name="Colorful Grid Accent 4" w:semiHidden="0" w:uiPriority="73" w:unhideWhenUsed="0"/>
-    <w:lsdException w:name="Light Shading Accent 5" w:semiHidden="0" w:uiPriority="60" w:unhideWhenUsed="0"/>
-    <w:lsdException w:name="Light List Accent 5" w:semiHidden="0" w:uiPriority="61" w:unhideWhenUsed="0"/>
-    <w:lsdException w:name="Light Grid Accent 5" w:semiHidden="0" w:uiPriority="62" w:unhideWhenUsed="0"/>
-    <w:lsdException w:name="Medium Shading 1 Accent 5" w:semiHidden="0" w:uiPriority="63" w:unhideWhenUsed="0"/>
-    <w:lsdException w:name="Medium Shading 2 Accent 5" w:semiHidden="0" w:uiPriority="64" w:unhideWhenUsed="0"/>
-    <w:lsdException w:name="Medium List 1 Accent 5" w:semiHidden="0" w:uiPriority="65" w:unhideWhenUsed="0"/>
-    <w:lsdException w:name="Medium List 2 Accent 5" w:semiHidden="0" w:uiPriority="66" w:unhideWhenUsed="0"/>
-    <w:lsdException w:name="Medium Grid 1 Accent 5" w:semiHidden="0" w:uiPriority="67" w:unhideWhenUsed="0"/>
-    <w:lsdException w:name="Medium Grid 2 Accent 5" w:semiHidden="0" w:uiPriority="68" w:unhideWhenUsed="0"/>
-    <w:lsdException w:name="Medium Grid 3 Accent 5" w:semiHidden="0" w:uiPriority="69" w:unhideWhenUsed="0"/>
-    <w:lsdException w:name="Dark List Accent 5" w:semiHidden="0" w:uiPriority="70" w:unhideWhenUsed="0"/>
-    <w:lsdException w:name="Colorful Shading Accent 5" w:semiHidden="0" w:uiPriority="71" w:unhideWhenUsed="0"/>
-    <w:lsdException w:name="Colorful List Accent 5" w:semiHidden="0" w:uiPriority="72" w:unhideWhenUsed="0"/>
-    <w:lsdException w:name="Colorful Grid Accent 5" w:semiHidden="0" w:uiPriority="73" w:unhideWhenUsed="0"/>
-    <w:lsdException w:name="Light Shading Accent 6" w:semiHidden="0" w:uiPriority="60" w:unhideWhenUsed="0"/>
-    <w:lsdException w:name="Light List Accent 6" w:semiHidden="0" w:uiPriority="61" w:unhideWhenUsed="0"/>
-    <w:lsdException w:name="Light Grid Accent 6" w:semiHidden="0" w:uiPriority="62" w:unhideWhenUsed="0"/>
-    <w:lsdException w:name="Medium Shading 1 Accent 6" w:semiHidden="0" w:uiPriority="63" w:unhideWhenUsed="0"/>
-    <w:lsdException w:name="Medium Shading 2 Accent 6" w:semiHidden="0" w:uiPriority="64" w:unhideWhenUsed="0"/>
-    <w:lsdException w:name="Medium List 1 Accent 6" w:semiHidden="0" w:uiPriority="65" w:unhideWhenUsed="0"/>
-    <w:lsdException w:name="Medium List 2 Accent 6" w:semiHidden="0" w:uiPriority="66" w:unhideWhenUsed="0"/>
-    <w:lsdException w:name="Medium Grid 1 Accent 6" w:semiHidden="0" w:uiPriority="67" w:unhideWhenUsed="0"/>
-    <w:lsdException w:name="Medium Grid 2 Accent 6" w:semiHidden="0" w:uiPriority="68" w:unhideWhenUsed="0"/>
-    <w:lsdException w:name="Medium Grid 3 Accent 6" w:semiHidden="0" w:uiPriority="69" w:unhideWhenUsed="0"/>
-    <w:lsdException w:name="Dark List Accent 6" w:semiHidden="0" w:uiPriority="70" w:unhideWhenUsed="0"/>
-    <w:lsdException w:name="Colorful Shading Accent 6" w:semiHidden="0" w:uiPriority="71" w:unhideWhenUsed="0"/>
-    <w:lsdException w:name="Colorful List Accent 6" w:semiHidden="0" w:uiPriority="72" w:unhideWhenUsed="0"/>
-    <w:lsdException w:name="Colorful Grid Accent 6" w:semiHidden="0" w:uiPriority="73" w:unhideWhenUsed="0"/>
-    <w:lsdException w:name="Subtle Emphasis" w:semiHidden="0" w:uiPriority="19" w:unhideWhenUsed="0" w:qFormat="1"/>
-    <w:lsdException w:name="Intense Emphasis" w:semiHidden="0" w:uiPriority="21" w:unhideWhenUsed="0" w:qFormat="1"/>
-    <w:lsdException w:name="Subtle Reference" w:semiHidden="0" w:uiPriority="31" w:unhideWhenUsed="0" w:qFormat="1"/>
-    <w:lsdException w:name="Intense Reference" w:semiHidden="0" w:uiPriority="32" w:unhideWhenUsed="0" w:qFormat="1"/>
-    <w:lsdException w:name="Book Title" w:semiHidden="0" w:uiPriority="33" w:unhideWhenUsed="0" w:qFormat="1"/>
-    <w:lsdException w:name="Bibliography" w:uiPriority="37"/>
-    <w:lsdException w:name="TOC Heading" w:uiPriority="39" w:qFormat="1"/>
+  <w:latentStyles w:defLockedState="0" w:defUIPriority="99" w:defSemiHidden="0" w:defUnhideWhenUsed="0" w:defQFormat="0" w:count="375">
+    <w:lsdException w:name="Normal" w:uiPriority="0" w:qFormat="1"/>
+    <w:lsdException w:name="heading 1" w:uiPriority="9" w:qFormat="1"/>
+    <w:lsdException w:name="heading 2" w:uiPriority="9" w:qFormat="1"/>
+    <w:lsdException w:name="heading 3" w:uiPriority="9" w:qFormat="1"/>
+    <w:lsdException w:name="heading 4" w:uiPriority="9" w:qFormat="1"/>
+    <w:lsdException w:name="heading 5" w:uiPriority="9" w:qFormat="1"/>
+    <w:lsdException w:name="heading 6" w:uiPriority="9" w:qFormat="1"/>
+    <w:lsdException w:name="heading 7" w:semiHidden="1" w:uiPriority="9" w:unhideWhenUsed="1" w:qFormat="1"/>
+    <w:lsdException w:name="heading 8" w:semiHidden="1" w:uiPriority="9" w:unhideWhenUsed="1" w:qFormat="1"/>
+    <w:lsdException w:name="heading 9" w:semiHidden="1" w:uiPriority="9" w:unhideWhenUsed="1" w:qFormat="1"/>
+    <w:lsdException w:name="index 1" w:semiHidden="1" w:unhideWhenUsed="1"/>
+    <w:lsdException w:name="index 2" w:semiHidden="1" w:unhideWhenUsed="1"/>
+    <w:lsdException w:name="index 3" w:semiHidden="1" w:unhideWhenUsed="1"/>
+    <w:lsdException w:name="index 4" w:semiHidden="1" w:unhideWhenUsed="1"/>
+    <w:lsdException w:name="index 5" w:semiHidden="1" w:unhideWhenUsed="1"/>
+    <w:lsdException w:name="index 6" w:semiHidden="1" w:unhideWhenUsed="1"/>
+    <w:lsdException w:name="index 7" w:semiHidden="1" w:unhideWhenUsed="1"/>
+    <w:lsdException w:name="index 8" w:semiHidden="1" w:unhideWhenUsed="1"/>
+    <w:lsdException w:name="index 9" w:semiHidden="1" w:unhideWhenUsed="1"/>
+    <w:lsdException w:name="toc 1" w:semiHidden="1" w:uiPriority="39" w:unhideWhenUsed="1"/>
+    <w:lsdException w:name="toc 2" w:semiHidden="1" w:uiPriority="39" w:unhideWhenUsed="1"/>
+    <w:lsdException w:name="toc 3" w:semiHidden="1" w:uiPriority="39" w:unhideWhenUsed="1"/>
+    <w:lsdException w:name="toc 4" w:semiHidden="1" w:uiPriority="39" w:unhideWhenUsed="1"/>
+    <w:lsdException w:name="toc 5" w:semiHidden="1" w:uiPriority="39" w:unhideWhenUsed="1"/>
+    <w:lsdException w:name="toc 6" w:semiHidden="1" w:uiPriority="39" w:unhideWhenUsed="1"/>
+    <w:lsdException w:name="toc 7" w:semiHidden="1" w:uiPriority="39" w:unhideWhenUsed="1"/>
+    <w:lsdException w:name="toc 8" w:semiHidden="1" w:uiPriority="39" w:unhideWhenUsed="1"/>
+    <w:lsdException w:name="toc 9" w:semiHidden="1" w:uiPriority="39" w:unhideWhenUsed="1"/>
+    <w:lsdException w:name="Normal Indent" w:semiHidden="1" w:unhideWhenUsed="1"/>
+    <w:lsdException w:name="footnote text" w:semiHidden="1" w:unhideWhenUsed="1"/>
+    <w:lsdException w:name="annotation text" w:semiHidden="1" w:unhideWhenUsed="1"/>
+    <w:lsdException w:name="header" w:semiHidden="1" w:unhideWhenUsed="1"/>
+    <w:lsdException w:name="footer" w:semiHidden="1" w:unhideWhenUsed="1"/>
+    <w:lsdException w:name="index heading" w:semiHidden="1" w:unhideWhenUsed="1"/>
+    <w:lsdException w:name="caption" w:uiPriority="35" w:qFormat="1"/>
+    <w:lsdException w:name="table of figures" w:semiHidden="1" w:unhideWhenUsed="1"/>
+    <w:lsdException w:name="envelope address" w:semiHidden="1" w:unhideWhenUsed="1"/>
+    <w:lsdException w:name="envelope return" w:semiHidden="1" w:unhideWhenUsed="1"/>
+    <w:lsdException w:name="footnote reference" w:semiHidden="1" w:unhideWhenUsed="1"/>
+    <w:lsdException w:name="annotation reference" w:semiHidden="1" w:unhideWhenUsed="1"/>
+    <w:lsdException w:name="line number" w:semiHidden="1" w:unhideWhenUsed="1"/>
+    <w:lsdException w:name="page number" w:semiHidden="1" w:unhideWhenUsed="1"/>
+    <w:lsdException w:name="endnote reference" w:semiHidden="1" w:unhideWhenUsed="1"/>
+    <w:lsdException w:name="endnote text" w:semiHidden="1" w:unhideWhenUsed="1"/>
+    <w:lsdException w:name="table of authorities" w:semiHidden="1" w:unhideWhenUsed="1"/>
+    <w:lsdException w:name="macro" w:semiHidden="1" w:unhideWhenUsed="1"/>
+    <w:lsdException w:name="toa heading" w:semiHidden="1" w:unhideWhenUsed="1"/>
+    <w:lsdException w:name="List" w:semiHidden="1" w:unhideWhenUsed="1"/>
+    <w:lsdException w:name="List Bullet" w:semiHidden="1" w:unhideWhenUsed="1"/>
+    <w:lsdException w:name="List Number" w:semiHidden="1" w:unhideWhenUsed="1"/>
+    <w:lsdException w:name="List 2" w:semiHidden="1" w:unhideWhenUsed="1"/>
+    <w:lsdException w:name="List 3" w:semiHidden="1" w:unhideWhenUsed="1"/>
+    <w:lsdException w:name="List 4" w:semiHidden="1" w:unhideWhenUsed="1"/>
+    <w:lsdException w:name="List 5" w:semiHidden="1" w:unhideWhenUsed="1"/>
+    <w:lsdException w:name="List Bullet 2" w:semiHidden="1" w:unhideWhenUsed="1"/>
+    <w:lsdException w:name="List Bullet 3" w:semiHidden="1" w:unhideWhenUsed="1"/>
+    <w:lsdException w:name="List Bullet 4" w:semiHidden="1" w:unhideWhenUsed="1"/>
+    <w:lsdException w:name="List Bullet 5" w:semiHidden="1" w:unhideWhenUsed="1"/>
+    <w:lsdException w:name="List Number 2" w:semiHidden="1" w:unhideWhenUsed="1"/>
+    <w:lsdException w:name="List Number 3" w:semiHidden="1" w:unhideWhenUsed="1"/>
+    <w:lsdException w:name="List Number 4" w:semiHidden="1" w:unhideWhenUsed="1"/>
+    <w:lsdException w:name="List Number 5" w:semiHidden="1" w:unhideWhenUsed="1"/>
+    <w:lsdException w:name="Title" w:uiPriority="10" w:qFormat="1"/>
+    <w:lsdException w:name="Closing" w:semiHidden="1" w:unhideWhenUsed="1"/>
+    <w:lsdException w:name="Signature" w:semiHidden="1" w:unhideWhenUsed="1"/>
+    <w:lsdException w:name="Default Paragraph Font" w:semiHidden="1" w:uiPriority="1" w:unhideWhenUsed="1"/>
+    <w:lsdException w:name="Body Text" w:semiHidden="1" w:unhideWhenUsed="1"/>
+    <w:lsdException w:name="Body Text Indent" w:semiHidden="1" w:unhideWhenUsed="1"/>
+    <w:lsdException w:name="List Continue" w:semiHidden="1" w:unhideWhenUsed="1"/>
+    <w:lsdException w:name="List Continue 2" w:semiHidden="1" w:unhideWhenUsed="1"/>
+    <w:lsdException w:name="List Continue 3" w:semiHidden="1" w:unhideWhenUsed="1"/>
+    <w:lsdException w:name="List Continue 4" w:semiHidden="1" w:unhideWhenUsed="1"/>
+    <w:lsdException w:name="List Continue 5" w:semiHidden="1" w:unhideWhenUsed="1"/>
+    <w:lsdException w:name="Message Header" w:semiHidden="1" w:unhideWhenUsed="1"/>
+    <w:lsdException w:name="Subtitle" w:uiPriority="11" w:qFormat="1"/>
+    <w:lsdException w:name="Salutation" w:semiHidden="1" w:unhideWhenUsed="1"/>
+    <w:lsdException w:name="Date" w:semiHidden="1" w:unhideWhenUsed="1"/>
+    <w:lsdException w:name="Body Text First Indent" w:semiHidden="1" w:unhideWhenUsed="1"/>
+    <w:lsdException w:name="Body Text First Indent 2" w:semiHidden="1" w:unhideWhenUsed="1"/>
+    <w:lsdException w:name="Note Heading" w:semiHidden="1" w:unhideWhenUsed="1"/>
+    <w:lsdException w:name="Body Text 2" w:semiHidden="1" w:unhideWhenUsed="1"/>
+    <w:lsdException w:name="Body Text 3" w:semiHidden="1" w:unhideWhenUsed="1"/>
+    <w:lsdException w:name="Body Text Indent 2" w:semiHidden="1" w:unhideWhenUsed="1"/>
+    <w:lsdException w:name="Body Text Indent 3" w:semiHidden="1" w:unhideWhenUsed="1"/>
+    <w:lsdException w:name="Block Text" w:semiHidden="1" w:unhideWhenUsed="1"/>
+    <w:lsdException w:name="Hyperlink" w:semiHidden="1" w:unhideWhenUsed="1"/>
+    <w:lsdException w:name="FollowedHyperlink" w:semiHidden="1" w:unhideWhenUsed="1"/>
+    <w:lsdException w:name="Strong" w:uiPriority="22" w:qFormat="1"/>
+    <w:lsdException w:name="Emphasis" w:uiPriority="20" w:qFormat="1"/>
+    <w:lsdException w:name="Document Map" w:semiHidden="1" w:unhideWhenUsed="1"/>
+    <w:lsdException w:name="Plain Text" w:semiHidden="1" w:unhideWhenUsed="1"/>
+    <w:lsdException w:name="E-mail Signature" w:semiHidden="1" w:unhideWhenUsed="1"/>
+    <w:lsdException w:name="HTML Top of Form" w:semiHidden="1" w:unhideWhenUsed="1"/>
+    <w:lsdException w:name="HTML Bottom of Form" w:semiHidden="1" w:unhideWhenUsed="1"/>
+    <w:lsdException w:name="Normal (Web)" w:semiHidden="1" w:unhideWhenUsed="1"/>
+    <w:lsdException w:name="HTML Acronym" w:semiHidden="1" w:unhideWhenUsed="1"/>
+    <w:lsdException w:name="HTML Address" w:semiHidden="1" w:unhideWhenUsed="1"/>
+    <w:lsdException w:name="HTML Cite" w:semiHidden="1" w:unhideWhenUsed="1"/>
+    <w:lsdException w:name="HTML Code" w:semiHidden="1" w:unhideWhenUsed="1"/>
+    <w:lsdException w:name="HTML Definition" w:semiHidden="1" w:unhideWhenUsed="1"/>
+    <w:lsdException w:name="HTML Keyboard" w:semiHidden="1" w:unhideWhenUsed="1"/>
+    <w:lsdException w:name="HTML Preformatted" w:semiHidden="1" w:unhideWhenUsed="1"/>
+    <w:lsdException w:name="HTML Sample" w:semiHidden="1" w:unhideWhenUsed="1"/>
+    <w:lsdException w:name="HTML Typewriter" w:semiHidden="1" w:unhideWhenUsed="1"/>
+    <w:lsdException w:name="HTML Variable" w:semiHidden="1" w:unhideWhenUsed="1"/>
+    <w:lsdException w:name="Normal Table" w:semiHidden="1" w:unhideWhenUsed="1"/>
+    <w:lsdException w:name="annotation subject" w:semiHidden="1" w:unhideWhenUsed="1"/>
+    <w:lsdException w:name="No List" w:semiHidden="1" w:unhideWhenUsed="1"/>
+    <w:lsdException w:name="Outline List 1" w:semiHidden="1" w:unhideWhenUsed="1"/>
+    <w:lsdException w:name="Outline List 2" w:semiHidden="1" w:unhideWhenUsed="1"/>
+    <w:lsdException w:name="Outline List 3" w:semiHidden="1" w:unhideWhenUsed="1"/>
+    <w:lsdException w:name="Table Simple 1" w:semiHidden="1" w:unhideWhenUsed="1"/>
+    <w:lsdException w:name="Table Simple 2" w:semiHidden="1" w:unhideWhenUsed="1"/>
+    <w:lsdException w:name="Table Simple 3" w:semiHidden="1" w:unhideWhenUsed="1"/>
+    <w:lsdException w:name="Table Classic 1" w:semiHidden="1" w:unhideWhenUsed="1"/>
+    <w:lsdException w:name="Table Classic 2" w:semiHidden="1" w:unhideWhenUsed="1"/>
+    <w:lsdException w:name="Table Classic 3" w:semiHidden="1" w:unhideWhenUsed="1"/>
+    <w:lsdException w:name="Table Classic 4" w:semiHidden="1" w:unhideWhenUsed="1"/>
+    <w:lsdException w:name="Table Colorful 1" w:semiHidden="1" w:unhideWhenUsed="1"/>
+    <w:lsdException w:name="Table Colorful 2" w:semiHidden="1" w:unhideWhenUsed="1"/>
+    <w:lsdException w:name="Table Colorful 3" w:semiHidden="1" w:unhideWhenUsed="1"/>
+    <w:lsdException w:name="Table Columns 1" w:semiHidden="1" w:unhideWhenUsed="1"/>
+    <w:lsdException w:name="Table Columns 2" w:semiHidden="1" w:unhideWhenUsed="1"/>
+    <w:lsdException w:name="Table Columns 3" w:semiHidden="1" w:unhideWhenUsed="1"/>
+    <w:lsdException w:name="Table Columns 4" w:semiHidden="1" w:unhideWhenUsed="1"/>
+    <w:lsdException w:name="Table Columns 5" w:semiHidden="1" w:unhideWhenUsed="1"/>
+    <w:lsdException w:name="Table Grid 1" w:semiHidden="1" w:unhideWhenUsed="1"/>
+    <w:lsdException w:name="Table Grid 2" w:semiHidden="1" w:unhideWhenUsed="1"/>
+    <w:lsdException w:name="Table Grid 3" w:semiHidden="1" w:unhideWhenUsed="1"/>
+    <w:lsdException w:name="Table Grid 4" w:semiHidden="1" w:unhideWhenUsed="1"/>
+    <w:lsdException w:name="Table Grid 5" w:semiHidden="1" w:unhideWhenUsed="1"/>
+    <w:lsdException w:name="Table Grid 6" w:semiHidden="1" w:unhideWhenUsed="1"/>
+    <w:lsdException w:name="Table Grid 7" w:semiHidden="1" w:unhideWhenUsed="1"/>
+    <w:lsdException w:name="Table Grid 8" w:semiHidden="1" w:unhideWhenUsed="1"/>
+    <w:lsdException w:name="Table List 1" w:semiHidden="1" w:unhideWhenUsed="1"/>
+    <w:lsdException w:name="Table List 2" w:semiHidden="1" w:unhideWhenUsed="1"/>
+    <w:lsdException w:name="Table List 3" w:semiHidden="1" w:unhideWhenUsed="1"/>
+    <w:lsdException w:name="Table List 4" w:semiHidden="1" w:unhideWhenUsed="1"/>
+    <w:lsdException w:name="Table List 5" w:semiHidden="1" w:unhideWhenUsed="1"/>
+    <w:lsdException w:name="Table List 6" w:semiHidden="1" w:unhideWhenUsed="1"/>
+    <w:lsdException w:name="Table List 7" w:semiHidden="1" w:unhideWhenUsed="1"/>
+    <w:lsdException w:name="Table List 8" w:semiHidden="1" w:unhideWhenUsed="1"/>
+    <w:lsdException w:name="Table 3D effects 1" w:semiHidden="1" w:unhideWhenUsed="1"/>
+    <w:lsdException w:name="Table 3D effects 2" w:semiHidden="1" w:unhideWhenUsed="1"/>
+    <w:lsdException w:name="Table 3D effects 3" w:semiHidden="1" w:unhideWhenUsed="1"/>
+    <w:lsdException w:name="Table Contemporary" w:semiHidden="1" w:unhideWhenUsed="1"/>
+    <w:lsdException w:name="Table Elegant" w:semiHidden="1" w:unhideWhenUsed="1"/>
+    <w:lsdException w:name="Table Professional" w:semiHidden="1" w:unhideWhenUsed="1"/>
+    <w:lsdException w:name="Table Subtle 1" w:semiHidden="1" w:unhideWhenUsed="1"/>
+    <w:lsdException w:name="Table Subtle 2" w:semiHidden="1" w:unhideWhenUsed="1"/>
+    <w:lsdException w:name="Table Web 1" w:semiHidden="1" w:unhideWhenUsed="1"/>
+    <w:lsdException w:name="Table Web 2" w:semiHidden="1" w:unhideWhenUsed="1"/>
+    <w:lsdException w:name="Table Web 3" w:semiHidden="1" w:unhideWhenUsed="1"/>
+    <w:lsdException w:name="Balloon Text" w:semiHidden="1" w:unhideWhenUsed="1"/>
+    <w:lsdException w:name="Table Grid" w:uiPriority="59"/>
+    <w:lsdException w:name="Table Theme" w:semiHidden="1" w:unhideWhenUsed="1"/>
+    <w:lsdException w:name="Placeholder Text" w:semiHidden="1"/>
+    <w:lsdException w:name="No Spacing" w:uiPriority="1" w:qFormat="1"/>
+    <w:lsdException w:name="Light Shading" w:uiPriority="60"/>
+    <w:lsdException w:name="Light List" w:uiPriority="61"/>
+    <w:lsdException w:name="Light Grid" w:uiPriority="62"/>
+    <w:lsdException w:name="Medium Shading 1" w:uiPriority="63"/>
+    <w:lsdException w:name="Medium Shading 2" w:uiPriority="64"/>
+    <w:lsdException w:name="Medium List 1" w:uiPriority="65"/>
+    <w:lsdException w:name="Medium List 2" w:uiPriority="66"/>
+    <w:lsdException w:name="Medium Grid 1" w:uiPriority="67"/>
+    <w:lsdException w:name="Medium Grid 2" w:uiPriority="68"/>
+    <w:lsdException w:name="Medium Grid 3" w:uiPriority="69"/>
+    <w:lsdException w:name="Dark List" w:uiPriority="70"/>
+    <w:lsdException w:name="Colorful Shading" w:uiPriority="71"/>
+    <w:lsdException w:name="Colorful List" w:uiPriority="72"/>
+    <w:lsdException w:name="Colorful Grid" w:uiPriority="73"/>
+    <w:lsdException w:name="Light Shading Accent 1" w:uiPriority="60"/>
+    <w:lsdException w:name="Light List Accent 1" w:uiPriority="61"/>
+    <w:lsdException w:name="Light Grid Accent 1" w:uiPriority="62"/>
+    <w:lsdException w:name="Medium Shading 1 Accent 1" w:uiPriority="63"/>
+    <w:lsdException w:name="Medium Shading 2 Accent 1" w:uiPriority="64"/>
+    <w:lsdException w:name="Medium List 1 Accent 1" w:uiPriority="65"/>
+    <w:lsdException w:name="Revision" w:semiHidden="1"/>
+    <w:lsdException w:name="List Paragraph" w:uiPriority="34" w:qFormat="1"/>
+    <w:lsdException w:name="Quote" w:uiPriority="29" w:qFormat="1"/>
+    <w:lsdException w:name="Intense Quote" w:uiPriority="30" w:qFormat="1"/>
+    <w:lsdException w:name="Medium List 2 Accent 1" w:uiPriority="66"/>
+    <w:lsdException w:name="Medium Grid 1 Accent 1" w:uiPriority="67"/>
+    <w:lsdException w:name="Medium Grid 2 Accent 1" w:uiPriority="68"/>
+    <w:lsdException w:name="Medium Grid 3 Accent 1" w:uiPriority="69"/>
+    <w:lsdException w:name="Dark List Accent 1" w:uiPriority="70"/>
+    <w:lsdException w:name="Colorful Shading Accent 1" w:uiPriority="71"/>
+    <w:lsdException w:name="Colorful List Accent 1" w:uiPriority="72"/>
+    <w:lsdException w:name="Colorful Grid Accent 1" w:uiPriority="73"/>
+    <w:lsdException w:name="Light Shading Accent 2" w:uiPriority="60"/>
+    <w:lsdException w:name="Light List Accent 2" w:uiPriority="61"/>
+    <w:lsdException w:name="Light Grid Accent 2" w:uiPriority="62"/>
+    <w:lsdException w:name="Medium Shading 1 Accent 2" w:uiPriority="63"/>
+    <w:lsdException w:name="Medium Shading 2 Accent 2" w:uiPriority="64"/>
+    <w:lsdException w:name="Medium List 1 Accent 2" w:uiPriority="65"/>
+    <w:lsdException w:name="Medium List 2 Accent 2" w:uiPriority="66"/>
+    <w:lsdException w:name="Medium Grid 1 Accent 2" w:uiPriority="67"/>
+    <w:lsdException w:name="Medium Grid 2 Accent 2" w:uiPriority="68"/>
+    <w:lsdException w:name="Medium Grid 3 Accent 2" w:uiPriority="69"/>
+    <w:lsdException w:name="Dark List Accent 2" w:uiPriority="70"/>
+    <w:lsdException w:name="Colorful Shading Accent 2" w:uiPriority="71"/>
+    <w:lsdException w:name="Colorful List Accent 2" w:uiPriority="72"/>
+    <w:lsdException w:name="Colorful Grid Accent 2" w:uiPriority="73"/>
+    <w:lsdException w:name="Light Shading Accent 3" w:uiPriority="60"/>
+    <w:lsdException w:name="Light List Accent 3" w:uiPriority="61"/>
+    <w:lsdException w:name="Light Grid Accent 3" w:uiPriority="62"/>
+    <w:lsdException w:name="Medium Shading 1 Accent 3" w:uiPriority="63"/>
+    <w:lsdException w:name="Medium Shading 2 Accent 3" w:uiPriority="64"/>
+    <w:lsdException w:name="Medium List 1 Accent 3" w:uiPriority="65"/>
+    <w:lsdException w:name="Medium List 2 Accent 3" w:uiPriority="66"/>
+    <w:lsdException w:name="Medium Grid 1 Accent 3" w:uiPriority="67"/>
+    <w:lsdException w:name="Medium Grid 2 Accent 3" w:uiPriority="68"/>
+    <w:lsdException w:name="Medium Grid 3 Accent 3" w:uiPriority="69"/>
+    <w:lsdException w:name="Dark List Accent 3" w:uiPriority="70"/>
+    <w:lsdException w:name="Colorful Shading Accent 3" w:uiPriority="71"/>
+    <w:lsdException w:name="Colorful List Accent 3" w:uiPriority="72"/>
+    <w:lsdException w:name="Colorful Grid Accent 3" w:uiPriority="73"/>
+    <w:lsdException w:name="Light Shading Accent 4" w:uiPriority="60"/>
+    <w:lsdException w:name="Light List Accent 4" w:uiPriority="61"/>
+    <w:lsdException w:name="Light Grid Accent 4" w:uiPriority="62"/>
+    <w:lsdException w:name="Medium Shading 1 Accent 4" w:uiPriority="63"/>
+    <w:lsdException w:name="Medium Shading 2 Accent 4" w:uiPriority="64"/>
+    <w:lsdException w:name="Medium List 1 Accent 4" w:uiPriority="65"/>
+    <w:lsdException w:name="Medium List 2 Accent 4" w:uiPriority="66"/>
+    <w:lsdException w:name="Medium Grid 1 Accent 4" w:uiPriority="67"/>
+    <w:lsdException w:name="Medium Grid 2 Accent 4" w:uiPriority="68"/>
+    <w:lsdException w:name="Medium Grid 3 Accent 4" w:uiPriority="69"/>
+    <w:lsdException w:name="Dark List Accent 4" w:uiPriority="70"/>
+    <w:lsdException w:name="Colorful Shading Accent 4" w:uiPriority="71"/>
+    <w:lsdException w:name="Colorful List Accent 4" w:uiPriority="72"/>
+    <w:lsdException w:name="Colorful Grid Accent 4" w:uiPriority="73"/>
+    <w:lsdException w:name="Light Shading Accent 5" w:uiPriority="60"/>
+    <w:lsdException w:name="Light List Accent 5" w:uiPriority="61"/>
+    <w:lsdException w:name="Light Grid Accent 5" w:uiPriority="62"/>
+    <w:lsdException w:name="Medium Shading 1 Accent 5" w:uiPriority="63"/>
+    <w:lsdException w:name="Medium Shading 2 Accent 5" w:uiPriority="64"/>
+    <w:lsdException w:name="Medium List 1 Accent 5" w:uiPriority="65"/>
+    <w:lsdException w:name="Medium List 2 Accent 5" w:uiPriority="66"/>
+    <w:lsdException w:name="Medium Grid 1 Accent 5" w:uiPriority="67"/>
+    <w:lsdException w:name="Medium Grid 2 Accent 5" w:uiPriority="68"/>
+    <w:lsdException w:name="Medium Grid 3 Accent 5" w:uiPriority="69"/>
+    <w:lsdException w:name="Dark List Accent 5" w:uiPriority="70"/>
+    <w:lsdException w:name="Colorful Shading Accent 5" w:uiPriority="71"/>
+    <w:lsdException w:name="Colorful List Accent 5" w:uiPriority="72"/>
+    <w:lsdException w:name="Colorful Grid Accent 5" w:uiPriority="73"/>
+    <w:lsdException w:name="Light Shading Accent 6" w:uiPriority="60"/>
+    <w:lsdException w:name="Light List Accent 6" w:uiPriority="61"/>
+    <w:lsdException w:name="Light Grid Accent 6" w:uiPriority="62"/>
+    <w:lsdException w:name="Medium Shading 1 Accent 6" w:uiPriority="63"/>
+    <w:lsdException w:name="Medium Shading 2 Accent 6" w:uiPriority="64"/>
+    <w:lsdException w:name="Medium List 1 Accent 6" w:uiPriority="65"/>
+    <w:lsdException w:name="Medium List 2 Accent 6" w:uiPriority="66"/>
+    <w:lsdException w:name="Medium Grid 1 Accent 6" w:uiPriority="67"/>
+    <w:lsdException w:name="Medium Grid 2 Accent 6" w:uiPriority="68"/>
+    <w:lsdException w:name="Medium Grid 3 Accent 6" w:uiPriority="69"/>
+    <w:lsdException w:name="Dark List Accent 6" w:uiPriority="70"/>
+    <w:lsdException w:name="Colorful Shading Accent 6" w:uiPriority="71"/>
+    <w:lsdException w:name="Colorful List Accent 6" w:uiPriority="72"/>
+    <w:lsdException w:name="Colorful Grid Accent 6" w:uiPriority="73"/>
+    <w:lsdException w:name="Subtle Emphasis" w:uiPriority="19" w:qFormat="1"/>
+    <w:lsdException w:name="Intense Emphasis" w:uiPriority="21" w:qFormat="1"/>
+    <w:lsdException w:name="Subtle Reference" w:uiPriority="31" w:qFormat="1"/>
+    <w:lsdException w:name="Intense Reference" w:uiPriority="32" w:qFormat="1"/>
+    <w:lsdException w:name="Book Title" w:uiPriority="33" w:qFormat="1"/>
+    <w:lsdException w:name="Bibliography" w:semiHidden="1" w:uiPriority="37" w:unhideWhenUsed="1"/>
+    <w:lsdException w:name="TOC Heading" w:semiHidden="1" w:uiPriority="39" w:unhideWhenUsed="1" w:qFormat="1"/>
+    <w:lsdException w:name="Plain Table 1" w:uiPriority="41"/>
+    <w:lsdException w:name="Plain Table 2" w:uiPriority="42"/>
+    <w:lsdException w:name="Plain Table 3" w:uiPriority="43"/>
+    <w:lsdException w:name="Plain Table 4" w:uiPriority="44"/>
+    <w:lsdException w:name="Plain Table 5" w:uiPriority="45"/>
+    <w:lsdException w:name="Grid Table Light" w:uiPriority="40"/>
+    <w:lsdException w:name="Grid Table 1 Light" w:uiPriority="46"/>
+    <w:lsdException w:name="Grid Table 2" w:uiPriority="47"/>
+    <w:lsdException w:name="Grid Table 3" w:uiPriority="48"/>
+    <w:lsdException w:name="Grid Table 4" w:uiPriority="49"/>
+    <w:lsdException w:name="Grid Table 5 Dark" w:uiPriority="50"/>
+    <w:lsdException w:name="Grid Table 6 Colorful" w:uiPriority="51"/>
+    <w:lsdException w:name="Grid Table 7 Colorful" w:uiPriority="52"/>
+    <w:lsdException w:name="Grid Table 1 Light Accent 1" w:uiPriority="46"/>
+    <w:lsdException w:name="Grid Table 2 Accent 1" w:uiPriority="47"/>
+    <w:lsdException w:name="Grid Table 3 Accent 1" w:uiPriority="48"/>
+    <w:lsdException w:name="Grid Table 4 Accent 1" w:uiPriority="49"/>
+    <w:lsdException w:name="Grid Table 5 Dark Accent 1" w:uiPriority="50"/>
+    <w:lsdException w:name="Grid Table 6 Colorful Accent 1" w:uiPriority="51"/>
+    <w:lsdException w:name="Grid Table 7 Colorful Accent 1" w:uiPriority="52"/>
+    <w:lsdException w:name="Grid Table 1 Light Accent 2" w:uiPriority="46"/>
+    <w:lsdException w:name="Grid Table 2 Accent 2" w:uiPriority="47"/>
+    <w:lsdException w:name="Grid Table 3 Accent 2" w:uiPriority="48"/>
+    <w:lsdException w:name="Grid Table 4 Accent 2" w:uiPriority="49"/>
+    <w:lsdException w:name="Grid Table 5 Dark Accent 2" w:uiPriority="50"/>
+    <w:lsdException w:name="Grid Table 6 Colorful Accent 2" w:uiPriority="51"/>
+    <w:lsdException w:name="Grid Table 7 Colorful Accent 2" w:uiPriority="52"/>
+    <w:lsdException w:name="Grid Table 1 Light Accent 3" w:uiPriority="46"/>
+    <w:lsdException w:name="Grid Table 2 Accent 3" w:uiPriority="47"/>
+    <w:lsdException w:name="Grid Table 3 Accent 3" w:uiPriority="48"/>
+    <w:lsdException w:name="Grid Table 4 Accent 3" w:uiPriority="49"/>
+    <w:lsdException w:name="Grid Table 5 Dark Accent 3" w:uiPriority="50"/>
+    <w:lsdException w:name="Grid Table 6 Colorful Accent 3" w:uiPriority="51"/>
+    <w:lsdException w:name="Grid Table 7 Colorful Accent 3" w:uiPriority="52"/>
+    <w:lsdException w:name="Grid Table 1 Light Accent 4" w:uiPriority="46"/>
+    <w:lsdException w:name="Grid Table 2 Accent 4" w:uiPriority="47"/>
+    <w:lsdException w:name="Grid Table 3 Accent 4" w:uiPriority="48"/>
+    <w:lsdException w:name="Grid Table 4 Accent 4" w:uiPriority="49"/>
+    <w:lsdException w:name="Grid Table 5 Dark Accent 4" w:uiPriority="50"/>
+    <w:lsdException w:name="Grid Table 6 Colorful Accent 4" w:uiPriority="51"/>
+    <w:lsdException w:name="Grid Table 7 Colorful Accent 4" w:uiPriority="52"/>
+    <w:lsdException w:name="Grid Table 1 Light Accent 5" w:uiPriority="46"/>
+    <w:lsdException w:name="Grid Table 2 Accent 5" w:uiPriority="47"/>
+    <w:lsdException w:name="Grid Table 3 Accent 5" w:uiPriority="48"/>
+    <w:lsdException w:name="Grid Table 4 Accent 5" w:uiPriority="49"/>
+    <w:lsdException w:name="Grid Table 5 Dark Accent 5" w:uiPriority="50"/>
+    <w:lsdException w:name="Grid Table 6 Colorful Accent 5" w:uiPriority="51"/>
+    <w:lsdException w:name="Grid Table 7 Colorful Accent 5" w:uiPriority="52"/>
+    <w:lsdException w:name="Grid Table 1 Light Accent 6" w:uiPriority="46"/>
+    <w:lsdException w:name="Grid Table 2 Accent 6" w:uiPriority="47"/>
+    <w:lsdException w:name="Grid Table 3 Accent 6" w:uiPriority="48"/>
+    <w:lsdException w:name="Grid Table 4 Accent 6" w:uiPriority="49"/>
+    <w:lsdException w:name="Grid Table 5 Dark Accent 6" w:uiPriority="50"/>
+    <w:lsdException w:name="Grid Table 6 Colorful Accent 6" w:uiPriority="51"/>
+    <w:lsdException w:name="Grid Table 7 Colorful Accent 6" w:uiPriority="52"/>
+    <w:lsdException w:name="List Table 1 Light" w:uiPriority="46"/>
+    <w:lsdException w:name="List Table 2" w:uiPriority="47"/>
+    <w:lsdException w:name="List Table 3" w:uiPriority="48"/>
+    <w:lsdException w:name="List Table 4" w:uiPriority="49"/>
+    <w:lsdException w:name="List Table 5 Dark" w:uiPriority="50"/>
+    <w:lsdException w:name="List Table 6 Colorful" w:uiPriority="51"/>
+    <w:lsdException w:name="List Table 7 Colorful" w:uiPriority="52"/>
+    <w:lsdException w:name="List Table 1 Light Accent 1" w:uiPriority="46"/>
+    <w:lsdException w:name="List Table 2 Accent 1" w:uiPriority="47"/>
+    <w:lsdException w:name="List Table 3 Accent 1" w:uiPriority="48"/>
+    <w:lsdException w:name="List Table 4 Accent 1" w:uiPriority="49"/>
+    <w:lsdException w:name="List Table 5 Dark Accent 1" w:uiPriority="50"/>
+    <w:lsdException w:name="List Table 6 Colorful Accent 1" w:uiPriority="51"/>
+    <w:lsdException w:name="List Table 7 Colorful Accent 1" w:uiPriority="52"/>
+    <w:lsdException w:name="List Table 1 Light Accent 2" w:uiPriority="46"/>
+    <w:lsdException w:name="List Table 2 Accent 2" w:uiPriority="47"/>
+    <w:lsdException w:name="List Table 3 Accent 2" w:uiPriority="48"/>
+    <w:lsdException w:name="List Table 4 Accent 2" w:uiPriority="49"/>
+    <w:lsdException w:name="List Table 5 Dark Accent 2" w:uiPriority="50"/>
+    <w:lsdException w:name="List Table 6 Colorful Accent 2" w:uiPriority="51"/>
+    <w:lsdException w:name="List Table 7 Colorful Accent 2" w:uiPriority="52"/>
+    <w:lsdException w:name="List Table 1 Light Accent 3" w:uiPriority="46"/>
+    <w:lsdException w:name="List Table 2 Accent 3" w:uiPriority="47"/>
+    <w:lsdException w:name="List Table 3 Accent 3" w:uiPriority="48"/>
+    <w:lsdException w:name="List Table 4 Accent 3" w:uiPriority="49"/>
+    <w:lsdException w:name="List Table 5 Dark Accent 3" w:uiPriority="50"/>
+    <w:lsdException w:name="List Table 6 Colorful Accent 3" w:uiPriority="51"/>
+    <w:lsdException w:name="List Table 7 Colorful Accent 3" w:uiPriority="52"/>
+    <w:lsdException w:name="List Table 1 Light Accent 4" w:uiPriority="46"/>
+    <w:lsdException w:name="List Table 2 Accent 4" w:uiPriority="47"/>
+    <w:lsdException w:name="List Table 3 Accent 4" w:uiPriority="48"/>
+    <w:lsdException w:name="List Table 4 Accent 4" w:uiPriority="49"/>
+    <w:lsdException w:name="List Table 5 Dark Accent 4" w:uiPriority="50"/>
+    <w:lsdException w:name="List Table 6 Colorful Accent 4" w:uiPriority="51"/>
+    <w:lsdException w:name="List Table 7 Colorful Accent 4" w:uiPriority="52"/>
+    <w:lsdException w:name="List Table 1 Light Accent 5" w:uiPriority="46"/>
+    <w:lsdException w:name="List Table 2 Accent 5" w:uiPriority="47"/>
+    <w:lsdException w:name="List Table 3 Accent 5" w:uiPriority="48"/>
+    <w:lsdException w:name="List Table 4 Accent 5" w:uiPriority="49"/>
+    <w:lsdException w:name="List Table 5 Dark Accent 5" w:uiPriority="50"/>
+    <w:lsdException w:name="List Table 6 Colorful Accent 5" w:uiPriority="51"/>
+    <w:lsdException w:name="List Table 7 Colorful Accent 5" w:uiPriority="52"/>
+    <w:lsdException w:name="List Table 1 Light Accent 6" w:uiPriority="46"/>
+    <w:lsdException w:name="List Table 2 Accent 6" w:uiPriority="47"/>
+    <w:lsdException w:name="List Table 3 Accent 6" w:uiPriority="48"/>
+    <w:lsdException w:name="List Table 4 Accent 6" w:uiPriority="49"/>
+    <w:lsdException w:name="List Table 5 Dark Accent 6" w:uiPriority="50"/>
+    <w:lsdException w:name="List Table 6 Colorful Accent 6" w:uiPriority="51"/>
+    <w:lsdException w:name="List Table 7 Colorful Accent 6" w:uiPriority="52"/>
+    <w:lsdException w:name="Mention" w:semiHidden="1" w:unhideWhenUsed="1"/>
+    <w:lsdException w:name="Smart Hyperlink" w:semiHidden="1" w:unhideWhenUsed="1"/>
+    <w:lsdException w:name="Hashtag" w:semiHidden="1" w:unhideWhenUsed="1"/>
+    <w:lsdException w:name="Unresolved Mention" w:semiHidden="1" w:unhideWhenUsed="1"/>
   </w:latentStyles>
   <w:style w:type="paragraph" w:default="1" w:styleId="a">
     <w:name w:val="Normal"/>
@@ -2502,10 +2701,10 @@
   <w:style w:type="character" w:customStyle="1" w:styleId="10">
     <w:name w:val="Основной шрифт абзаца1"/>
   </w:style>
-  <w:style w:type="paragraph" w:customStyle="1" w:styleId="a3">
-    <w:name w:val="Заголовок"/>
+  <w:style w:type="paragraph" w:customStyle="1" w:styleId="11">
+    <w:name w:val="Заголовок1"/>
     <w:basedOn w:val="a"/>
-    <w:next w:val="a4"/>
+    <w:next w:val="a3"/>
     <w:pPr>
       <w:keepNext/>
       <w:spacing w:before="240" w:after="120"/>
@@ -2516,7 +2715,7 @@
       <w:szCs w:val="28"/>
     </w:rPr>
   </w:style>
-  <w:style w:type="paragraph" w:styleId="a4">
+  <w:style w:type="paragraph" w:styleId="a3">
     <w:name w:val="Body Text"/>
     <w:basedOn w:val="a"/>
     <w:pPr>
@@ -2526,14 +2725,14 @@
       <w:sz w:val="28"/>
     </w:rPr>
   </w:style>
-  <w:style w:type="paragraph" w:styleId="a5">
+  <w:style w:type="paragraph" w:styleId="a4">
     <w:name w:val="List"/>
-    <w:basedOn w:val="a4"/>
+    <w:basedOn w:val="a3"/>
     <w:rPr>
       <w:rFonts w:cs="Lohit Hindi"/>
     </w:rPr>
   </w:style>
-  <w:style w:type="paragraph" w:styleId="a6">
+  <w:style w:type="paragraph" w:styleId="a5">
     <w:name w:val="caption"/>
     <w:basedOn w:val="a"/>
     <w:qFormat/>
@@ -2549,7 +2748,7 @@
       <w:szCs w:val="24"/>
     </w:rPr>
   </w:style>
-  <w:style w:type="paragraph" w:customStyle="1" w:styleId="11">
+  <w:style w:type="paragraph" w:customStyle="1" w:styleId="12">
     <w:name w:val="Указатель1"/>
     <w:basedOn w:val="a"/>
     <w:pPr>
@@ -2559,7 +2758,7 @@
       <w:rFonts w:cs="Lohit Hindi"/>
     </w:rPr>
   </w:style>
-  <w:style w:type="paragraph" w:styleId="a7">
+  <w:style w:type="paragraph" w:styleId="a6">
     <w:name w:val="header"/>
     <w:basedOn w:val="a"/>
     <w:pPr>
@@ -2569,7 +2768,7 @@
       </w:tabs>
     </w:pPr>
   </w:style>
-  <w:style w:type="paragraph" w:styleId="a8">
+  <w:style w:type="paragraph" w:styleId="a7">
     <w:name w:val="Body Text Indent"/>
     <w:basedOn w:val="a"/>
     <w:pPr>
@@ -2602,7 +2801,7 @@
       <w:lang w:val="en-US"/>
     </w:rPr>
   </w:style>
-  <w:style w:type="paragraph" w:customStyle="1" w:styleId="12">
+  <w:style w:type="paragraph" w:customStyle="1" w:styleId="13">
     <w:name w:val="Цитата1"/>
     <w:basedOn w:val="a"/>
     <w:pPr>
@@ -2621,7 +2820,7 @@
       <w:sz w:val="28"/>
     </w:rPr>
   </w:style>
-  <w:style w:type="paragraph" w:styleId="a9">
+  <w:style w:type="paragraph" w:styleId="a8">
     <w:name w:val="Balloon Text"/>
     <w:basedOn w:val="a"/>
     <w:rPr>
@@ -2630,7 +2829,7 @@
       <w:szCs w:val="16"/>
     </w:rPr>
   </w:style>
-  <w:style w:type="paragraph" w:customStyle="1" w:styleId="13">
+  <w:style w:type="paragraph" w:customStyle="1" w:styleId="14">
     <w:name w:val="Схема документа1"/>
     <w:basedOn w:val="a"/>
     <w:pPr>
@@ -2640,7 +2839,7 @@
       <w:rFonts w:ascii="Tahoma" w:hAnsi="Tahoma" w:cs="Tahoma"/>
     </w:rPr>
   </w:style>
-  <w:style w:type="character" w:styleId="aa">
+  <w:style w:type="character" w:styleId="a9">
     <w:name w:val="Placeholder Text"/>
     <w:basedOn w:val="a0"/>
     <w:uiPriority w:val="99"/>
@@ -2653,502 +2852,8 @@
 </w:styles>
 </file>
 
-<file path=word/stylesWithEffects.xml><?xml version="1.0" encoding="utf-8"?>
-<w:styles xmlns:wpc="http://schemas.microsoft.com/office/word/2010/wordprocessingCanvas" xmlns:mc="http://schemas.openxmlformats.org/markup-compatibility/2006" xmlns:o="urn:schemas-microsoft-com:office:office" xmlns:r="http://schemas.openxmlformats.org/officeDocument/2006/relationships" xmlns:m="http://schemas.openxmlformats.org/officeDocument/2006/math" xmlns:v="urn:schemas-microsoft-com:vml" xmlns:wp14="http://schemas.microsoft.com/office/word/2010/wordprocessingDrawing" xmlns:wp="http://schemas.openxmlformats.org/drawingml/2006/wordprocessingDrawing" xmlns:w10="urn:schemas-microsoft-com:office:word" xmlns:w="http://schemas.openxmlformats.org/wordprocessingml/2006/main" xmlns:w14="http://schemas.microsoft.com/office/word/2010/wordml" xmlns:wpg="http://schemas.microsoft.com/office/word/2010/wordprocessingGroup" xmlns:wpi="http://schemas.microsoft.com/office/word/2010/wordprocessingInk" xmlns:wne="http://schemas.microsoft.com/office/word/2006/wordml" xmlns:wps="http://schemas.microsoft.com/office/word/2010/wordprocessingShape" mc:Ignorable="w14 wp14">
-  <w:docDefaults>
-    <w:rPrDefault>
-      <w:rPr>
-        <w:rFonts w:ascii="Times New Roman" w:eastAsia="Times New Roman" w:hAnsi="Times New Roman" w:cs="Times New Roman"/>
-        <w:lang w:val="ru-RU" w:eastAsia="ru-RU" w:bidi="ar-SA"/>
-      </w:rPr>
-    </w:rPrDefault>
-    <w:pPrDefault/>
-  </w:docDefaults>
-  <w:latentStyles w:defLockedState="0" w:defUIPriority="99" w:defSemiHidden="1" w:defUnhideWhenUsed="1" w:defQFormat="0" w:count="267">
-    <w:lsdException w:name="Normal" w:semiHidden="0" w:uiPriority="0" w:unhideWhenUsed="0" w:qFormat="1"/>
-    <w:lsdException w:name="heading 1" w:semiHidden="0" w:uiPriority="9" w:unhideWhenUsed="0" w:qFormat="1"/>
-    <w:lsdException w:name="heading 2" w:semiHidden="0" w:uiPriority="9" w:unhideWhenUsed="0" w:qFormat="1"/>
-    <w:lsdException w:name="heading 3" w:semiHidden="0" w:uiPriority="9" w:unhideWhenUsed="0" w:qFormat="1"/>
-    <w:lsdException w:name="heading 4" w:semiHidden="0" w:uiPriority="9" w:unhideWhenUsed="0" w:qFormat="1"/>
-    <w:lsdException w:name="heading 5" w:semiHidden="0" w:uiPriority="9" w:unhideWhenUsed="0" w:qFormat="1"/>
-    <w:lsdException w:name="heading 6" w:semiHidden="0" w:uiPriority="9" w:unhideWhenUsed="0" w:qFormat="1"/>
-    <w:lsdException w:name="heading 7" w:uiPriority="9" w:qFormat="1"/>
-    <w:lsdException w:name="heading 8" w:uiPriority="9" w:qFormat="1"/>
-    <w:lsdException w:name="heading 9" w:uiPriority="9" w:qFormat="1"/>
-    <w:lsdException w:name="toc 1" w:uiPriority="39"/>
-    <w:lsdException w:name="toc 2" w:uiPriority="39"/>
-    <w:lsdException w:name="toc 3" w:uiPriority="39"/>
-    <w:lsdException w:name="toc 4" w:uiPriority="39"/>
-    <w:lsdException w:name="toc 5" w:uiPriority="39"/>
-    <w:lsdException w:name="toc 6" w:uiPriority="39"/>
-    <w:lsdException w:name="toc 7" w:uiPriority="39"/>
-    <w:lsdException w:name="toc 8" w:uiPriority="39"/>
-    <w:lsdException w:name="toc 9" w:uiPriority="39"/>
-    <w:lsdException w:name="caption" w:semiHidden="0" w:uiPriority="35" w:unhideWhenUsed="0" w:qFormat="1"/>
-    <w:lsdException w:name="Title" w:semiHidden="0" w:uiPriority="10" w:unhideWhenUsed="0" w:qFormat="1"/>
-    <w:lsdException w:name="Default Paragraph Font" w:uiPriority="1"/>
-    <w:lsdException w:name="Subtitle" w:semiHidden="0" w:uiPriority="11" w:unhideWhenUsed="0" w:qFormat="1"/>
-    <w:lsdException w:name="Strong" w:semiHidden="0" w:uiPriority="22" w:unhideWhenUsed="0" w:qFormat="1"/>
-    <w:lsdException w:name="Emphasis" w:semiHidden="0" w:uiPriority="20" w:unhideWhenUsed="0" w:qFormat="1"/>
-    <w:lsdException w:name="Table Grid" w:semiHidden="0" w:uiPriority="59" w:unhideWhenUsed="0"/>
-    <w:lsdException w:name="Placeholder Text" w:unhideWhenUsed="0"/>
-    <w:lsdException w:name="No Spacing" w:semiHidden="0" w:uiPriority="1" w:unhideWhenUsed="0" w:qFormat="1"/>
-    <w:lsdException w:name="Light Shading" w:semiHidden="0" w:uiPriority="60" w:unhideWhenUsed="0"/>
-    <w:lsdException w:name="Light List" w:semiHidden="0" w:uiPriority="61" w:unhideWhenUsed="0"/>
-    <w:lsdException w:name="Light Grid" w:semiHidden="0" w:uiPriority="62" w:unhideWhenUsed="0"/>
-    <w:lsdException w:name="Medium Shading 1" w:semiHidden="0" w:uiPriority="63" w:unhideWhenUsed="0"/>
-    <w:lsdException w:name="Medium Shading 2" w:semiHidden="0" w:uiPriority="64" w:unhideWhenUsed="0"/>
-    <w:lsdException w:name="Medium List 1" w:semiHidden="0" w:uiPriority="65" w:unhideWhenUsed="0"/>
-    <w:lsdException w:name="Medium List 2" w:semiHidden="0" w:uiPriority="66" w:unhideWhenUsed="0"/>
-    <w:lsdException w:name="Medium Grid 1" w:semiHidden="0" w:uiPriority="67" w:unhideWhenUsed="0"/>
-    <w:lsdException w:name="Medium Grid 2" w:semiHidden="0" w:uiPriority="68" w:unhideWhenUsed="0"/>
-    <w:lsdException w:name="Medium Grid 3" w:semiHidden="0" w:uiPriority="69" w:unhideWhenUsed="0"/>
-    <w:lsdException w:name="Dark List" w:semiHidden="0" w:uiPriority="70" w:unhideWhenUsed="0"/>
-    <w:lsdException w:name="Colorful Shading" w:semiHidden="0" w:uiPriority="71" w:unhideWhenUsed="0"/>
-    <w:lsdException w:name="Colorful List" w:semiHidden="0" w:uiPriority="72" w:unhideWhenUsed="0"/>
-    <w:lsdException w:name="Colorful Grid" w:semiHidden="0" w:uiPriority="73" w:unhideWhenUsed="0"/>
-    <w:lsdException w:name="Light Shading Accent 1" w:semiHidden="0" w:uiPriority="60" w:unhideWhenUsed="0"/>
-    <w:lsdException w:name="Light List Accent 1" w:semiHidden="0" w:uiPriority="61" w:unhideWhenUsed="0"/>
-    <w:lsdException w:name="Light Grid Accent 1" w:semiHidden="0" w:uiPriority="62" w:unhideWhenUsed="0"/>
-    <w:lsdException w:name="Medium Shading 1 Accent 1" w:semiHidden="0" w:uiPriority="63" w:unhideWhenUsed="0"/>
-    <w:lsdException w:name="Medium Shading 2 Accent 1" w:semiHidden="0" w:uiPriority="64" w:unhideWhenUsed="0"/>
-    <w:lsdException w:name="Medium List 1 Accent 1" w:semiHidden="0" w:uiPriority="65" w:unhideWhenUsed="0"/>
-    <w:lsdException w:name="Revision" w:unhideWhenUsed="0"/>
-    <w:lsdException w:name="List Paragraph" w:semiHidden="0" w:uiPriority="34" w:unhideWhenUsed="0" w:qFormat="1"/>
-    <w:lsdException w:name="Quote" w:semiHidden="0" w:uiPriority="29" w:unhideWhenUsed="0" w:qFormat="1"/>
-    <w:lsdException w:name="Intense Quote" w:semiHidden="0" w:uiPriority="30" w:unhideWhenUsed="0" w:qFormat="1"/>
-    <w:lsdException w:name="Medium List 2 Accent 1" w:semiHidden="0" w:uiPriority="66" w:unhideWhenUsed="0"/>
-    <w:lsdException w:name="Medium Grid 1 Accent 1" w:semiHidden="0" w:uiPriority="67" w:unhideWhenUsed="0"/>
-    <w:lsdException w:name="Medium Grid 2 Accent 1" w:semiHidden="0" w:uiPriority="68" w:unhideWhenUsed="0"/>
-    <w:lsdException w:name="Medium Grid 3 Accent 1" w:semiHidden="0" w:uiPriority="69" w:unhideWhenUsed="0"/>
-    <w:lsdException w:name="Dark List Accent 1" w:semiHidden="0" w:uiPriority="70" w:unhideWhenUsed="0"/>
-    <w:lsdException w:name="Colorful Shading Accent 1" w:semiHidden="0" w:uiPriority="71" w:unhideWhenUsed="0"/>
-    <w:lsdException w:name="Colorful List Accent 1" w:semiHidden="0" w:uiPriority="72" w:unhideWhenUsed="0"/>
-    <w:lsdException w:name="Colorful Grid Accent 1" w:semiHidden="0" w:uiPriority="73" w:unhideWhenUsed="0"/>
-    <w:lsdException w:name="Light Shading Accent 2" w:semiHidden="0" w:uiPriority="60" w:unhideWhenUsed="0"/>
-    <w:lsdException w:name="Light List Accent 2" w:semiHidden="0" w:uiPriority="61" w:unhideWhenUsed="0"/>
-    <w:lsdException w:name="Light Grid Accent 2" w:semiHidden="0" w:uiPriority="62" w:unhideWhenUsed="0"/>
-    <w:lsdException w:name="Medium Shading 1 Accent 2" w:semiHidden="0" w:uiPriority="63" w:unhideWhenUsed="0"/>
-    <w:lsdException w:name="Medium Shading 2 Accent 2" w:semiHidden="0" w:uiPriority="64" w:unhideWhenUsed="0"/>
-    <w:lsdException w:name="Medium List 1 Accent 2" w:semiHidden="0" w:uiPriority="65" w:unhideWhenUsed="0"/>
-    <w:lsdException w:name="Medium List 2 Accent 2" w:semiHidden="0" w:uiPriority="66" w:unhideWhenUsed="0"/>
-    <w:lsdException w:name="Medium Grid 1 Accent 2" w:semiHidden="0" w:uiPriority="67" w:unhideWhenUsed="0"/>
-    <w:lsdException w:name="Medium Grid 2 Accent 2" w:semiHidden="0" w:uiPriority="68" w:unhideWhenUsed="0"/>
-    <w:lsdException w:name="Medium Grid 3 Accent 2" w:semiHidden="0" w:uiPriority="69" w:unhideWhenUsed="0"/>
-    <w:lsdException w:name="Dark List Accent 2" w:semiHidden="0" w:uiPriority="70" w:unhideWhenUsed="0"/>
-    <w:lsdException w:name="Colorful Shading Accent 2" w:semiHidden="0" w:uiPriority="71" w:unhideWhenUsed="0"/>
-    <w:lsdException w:name="Colorful List Accent 2" w:semiHidden="0" w:uiPriority="72" w:unhideWhenUsed="0"/>
-    <w:lsdException w:name="Colorful Grid Accent 2" w:semiHidden="0" w:uiPriority="73" w:unhideWhenUsed="0"/>
-    <w:lsdException w:name="Light Shading Accent 3" w:semiHidden="0" w:uiPriority="60" w:unhideWhenUsed="0"/>
-    <w:lsdException w:name="Light List Accent 3" w:semiHidden="0" w:uiPriority="61" w:unhideWhenUsed="0"/>
-    <w:lsdException w:name="Light Grid Accent 3" w:semiHidden="0" w:uiPriority="62" w:unhideWhenUsed="0"/>
-    <w:lsdException w:name="Medium Shading 1 Accent 3" w:semiHidden="0" w:uiPriority="63" w:unhideWhenUsed="0"/>
-    <w:lsdException w:name="Medium Shading 2 Accent 3" w:semiHidden="0" w:uiPriority="64" w:unhideWhenUsed="0"/>
-    <w:lsdException w:name="Medium List 1 Accent 3" w:semiHidden="0" w:uiPriority="65" w:unhideWhenUsed="0"/>
-    <w:lsdException w:name="Medium List 2 Accent 3" w:semiHidden="0" w:uiPriority="66" w:unhideWhenUsed="0"/>
-    <w:lsdException w:name="Medium Grid 1 Accent 3" w:semiHidden="0" w:uiPriority="67" w:unhideWhenUsed="0"/>
-    <w:lsdException w:name="Medium Grid 2 Accent 3" w:semiHidden="0" w:uiPriority="68" w:unhideWhenUsed="0"/>
-    <w:lsdException w:name="Medium Grid 3 Accent 3" w:semiHidden="0" w:uiPriority="69" w:unhideWhenUsed="0"/>
-    <w:lsdException w:name="Dark List Accent 3" w:semiHidden="0" w:uiPriority="70" w:unhideWhenUsed="0"/>
-    <w:lsdException w:name="Colorful Shading Accent 3" w:semiHidden="0" w:uiPriority="71" w:unhideWhenUsed="0"/>
-    <w:lsdException w:name="Colorful List Accent 3" w:semiHidden="0" w:uiPriority="72" w:unhideWhenUsed="0"/>
-    <w:lsdException w:name="Colorful Grid Accent 3" w:semiHidden="0" w:uiPriority="73" w:unhideWhenUsed="0"/>
-    <w:lsdException w:name="Light Shading Accent 4" w:semiHidden="0" w:uiPriority="60" w:unhideWhenUsed="0"/>
-    <w:lsdException w:name="Light List Accent 4" w:semiHidden="0" w:uiPriority="61" w:unhideWhenUsed="0"/>
-    <w:lsdException w:name="Light Grid Accent 4" w:semiHidden="0" w:uiPriority="62" w:unhideWhenUsed="0"/>
-    <w:lsdException w:name="Medium Shading 1 Accent 4" w:semiHidden="0" w:uiPriority="63" w:unhideWhenUsed="0"/>
-    <w:lsdException w:name="Medium Shading 2 Accent 4" w:semiHidden="0" w:uiPriority="64" w:unhideWhenUsed="0"/>
-    <w:lsdException w:name="Medium List 1 Accent 4" w:semiHidden="0" w:uiPriority="65" w:unhideWhenUsed="0"/>
-    <w:lsdException w:name="Medium List 2 Accent 4" w:semiHidden="0" w:uiPriority="66" w:unhideWhenUsed="0"/>
-    <w:lsdException w:name="Medium Grid 1 Accent 4" w:semiHidden="0" w:uiPriority="67" w:unhideWhenUsed="0"/>
-    <w:lsdException w:name="Medium Grid 2 Accent 4" w:semiHidden="0" w:uiPriority="68" w:unhideWhenUsed="0"/>
-    <w:lsdException w:name="Medium Grid 3 Accent 4" w:semiHidden="0" w:uiPriority="69" w:unhideWhenUsed="0"/>
-    <w:lsdException w:name="Dark List Accent 4" w:semiHidden="0" w:uiPriority="70" w:unhideWhenUsed="0"/>
-    <w:lsdException w:name="Colorful Shading Accent 4" w:semiHidden="0" w:uiPriority="71" w:unhideWhenUsed="0"/>
-    <w:lsdException w:name="Colorful List Accent 4" w:semiHidden="0" w:uiPriority="72" w:unhideWhenUsed="0"/>
-    <w:lsdException w:name="Colorful Grid Accent 4" w:semiHidden="0" w:uiPriority="73" w:unhideWhenUsed="0"/>
-    <w:lsdException w:name="Light Shading Accent 5" w:semiHidden="0" w:uiPriority="60" w:unhideWhenUsed="0"/>
-    <w:lsdException w:name="Light List Accent 5" w:semiHidden="0" w:uiPriority="61" w:unhideWhenUsed="0"/>
-    <w:lsdException w:name="Light Grid Accent 5" w:semiHidden="0" w:uiPriority="62" w:unhideWhenUsed="0"/>
-    <w:lsdException w:name="Medium Shading 1 Accent 5" w:semiHidden="0" w:uiPriority="63" w:unhideWhenUsed="0"/>
-    <w:lsdException w:name="Medium Shading 2 Accent 5" w:semiHidden="0" w:uiPriority="64" w:unhideWhenUsed="0"/>
-    <w:lsdException w:name="Medium List 1 Accent 5" w:semiHidden="0" w:uiPriority="65" w:unhideWhenUsed="0"/>
-    <w:lsdException w:name="Medium List 2 Accent 5" w:semiHidden="0" w:uiPriority="66" w:unhideWhenUsed="0"/>
-    <w:lsdException w:name="Medium Grid 1 Accent 5" w:semiHidden="0" w:uiPriority="67" w:unhideWhenUsed="0"/>
-    <w:lsdException w:name="Medium Grid 2 Accent 5" w:semiHidden="0" w:uiPriority="68" w:unhideWhenUsed="0"/>
-    <w:lsdException w:name="Medium Grid 3 Accent 5" w:semiHidden="0" w:uiPriority="69" w:unhideWhenUsed="0"/>
-    <w:lsdException w:name="Dark List Accent 5" w:semiHidden="0" w:uiPriority="70" w:unhideWhenUsed="0"/>
-    <w:lsdException w:name="Colorful Shading Accent 5" w:semiHidden="0" w:uiPriority="71" w:unhideWhenUsed="0"/>
-    <w:lsdException w:name="Colorful List Accent 5" w:semiHidden="0" w:uiPriority="72" w:unhideWhenUsed="0"/>
-    <w:lsdException w:name="Colorful Grid Accent 5" w:semiHidden="0" w:uiPriority="73" w:unhideWhenUsed="0"/>
-    <w:lsdException w:name="Light Shading Accent 6" w:semiHidden="0" w:uiPriority="60" w:unhideWhenUsed="0"/>
-    <w:lsdException w:name="Light List Accent 6" w:semiHidden="0" w:uiPriority="61" w:unhideWhenUsed="0"/>
-    <w:lsdException w:name="Light Grid Accent 6" w:semiHidden="0" w:uiPriority="62" w:unhideWhenUsed="0"/>
-    <w:lsdException w:name="Medium Shading 1 Accent 6" w:semiHidden="0" w:uiPriority="63" w:unhideWhenUsed="0"/>
-    <w:lsdException w:name="Medium Shading 2 Accent 6" w:semiHidden="0" w:uiPriority="64" w:unhideWhenUsed="0"/>
-    <w:lsdException w:name="Medium List 1 Accent 6" w:semiHidden="0" w:uiPriority="65" w:unhideWhenUsed="0"/>
-    <w:lsdException w:name="Medium List 2 Accent 6" w:semiHidden="0" w:uiPriority="66" w:unhideWhenUsed="0"/>
-    <w:lsdException w:name="Medium Grid 1 Accent 6" w:semiHidden="0" w:uiPriority="67" w:unhideWhenUsed="0"/>
-    <w:lsdException w:name="Medium Grid 2 Accent 6" w:semiHidden="0" w:uiPriority="68" w:unhideWhenUsed="0"/>
-    <w:lsdException w:name="Medium Grid 3 Accent 6" w:semiHidden="0" w:uiPriority="69" w:unhideWhenUsed="0"/>
-    <w:lsdException w:name="Dark List Accent 6" w:semiHidden="0" w:uiPriority="70" w:unhideWhenUsed="0"/>
-    <w:lsdException w:name="Colorful Shading Accent 6" w:semiHidden="0" w:uiPriority="71" w:unhideWhenUsed="0"/>
-    <w:lsdException w:name="Colorful List Accent 6" w:semiHidden="0" w:uiPriority="72" w:unhideWhenUsed="0"/>
-    <w:lsdException w:name="Colorful Grid Accent 6" w:semiHidden="0" w:uiPriority="73" w:unhideWhenUsed="0"/>
-    <w:lsdException w:name="Subtle Emphasis" w:semiHidden="0" w:uiPriority="19" w:unhideWhenUsed="0" w:qFormat="1"/>
-    <w:lsdException w:name="Intense Emphasis" w:semiHidden="0" w:uiPriority="21" w:unhideWhenUsed="0" w:qFormat="1"/>
-    <w:lsdException w:name="Subtle Reference" w:semiHidden="0" w:uiPriority="31" w:unhideWhenUsed="0" w:qFormat="1"/>
-    <w:lsdException w:name="Intense Reference" w:semiHidden="0" w:uiPriority="32" w:unhideWhenUsed="0" w:qFormat="1"/>
-    <w:lsdException w:name="Book Title" w:semiHidden="0" w:uiPriority="33" w:unhideWhenUsed="0" w:qFormat="1"/>
-    <w:lsdException w:name="Bibliography" w:uiPriority="37"/>
-    <w:lsdException w:name="TOC Heading" w:uiPriority="39" w:qFormat="1"/>
-  </w:latentStyles>
-  <w:style w:type="paragraph" w:default="1" w:styleId="a">
-    <w:name w:val="Normal"/>
-    <w:qFormat/>
-    <w:pPr>
-      <w:suppressAutoHyphens/>
-    </w:pPr>
-    <w:rPr>
-      <w:lang w:val="uk-UA" w:eastAsia="zh-CN"/>
-    </w:rPr>
-  </w:style>
-  <w:style w:type="paragraph" w:styleId="1">
-    <w:name w:val="heading 1"/>
-    <w:basedOn w:val="a"/>
-    <w:next w:val="a"/>
-    <w:qFormat/>
-    <w:pPr>
-      <w:keepNext/>
-      <w:tabs>
-        <w:tab w:val="num" w:pos="0"/>
-      </w:tabs>
-      <w:ind w:firstLine="567"/>
-      <w:jc w:val="both"/>
-      <w:outlineLvl w:val="0"/>
-    </w:pPr>
-    <w:rPr>
-      <w:sz w:val="28"/>
-    </w:rPr>
-  </w:style>
-  <w:style w:type="paragraph" w:styleId="2">
-    <w:name w:val="heading 2"/>
-    <w:basedOn w:val="a"/>
-    <w:next w:val="a"/>
-    <w:qFormat/>
-    <w:pPr>
-      <w:keepNext/>
-      <w:pBdr>
-        <w:bottom w:val="single" w:sz="12" w:space="1" w:color="000000"/>
-      </w:pBdr>
-      <w:tabs>
-        <w:tab w:val="num" w:pos="0"/>
-      </w:tabs>
-      <w:ind w:right="-1134"/>
-      <w:jc w:val="center"/>
-      <w:outlineLvl w:val="1"/>
-    </w:pPr>
-    <w:rPr>
-      <w:rFonts w:ascii="Arial" w:hAnsi="Arial" w:cs="Arial"/>
-      <w:b/>
-      <w:sz w:val="28"/>
-    </w:rPr>
-  </w:style>
-  <w:style w:type="paragraph" w:styleId="3">
-    <w:name w:val="heading 3"/>
-    <w:basedOn w:val="a"/>
-    <w:next w:val="a"/>
-    <w:qFormat/>
-    <w:pPr>
-      <w:keepNext/>
-      <w:tabs>
-        <w:tab w:val="num" w:pos="0"/>
-      </w:tabs>
-      <w:ind w:firstLine="720"/>
-      <w:jc w:val="both"/>
-      <w:outlineLvl w:val="2"/>
-    </w:pPr>
-    <w:rPr>
-      <w:b/>
-      <w:sz w:val="28"/>
-    </w:rPr>
-  </w:style>
-  <w:style w:type="paragraph" w:styleId="4">
-    <w:name w:val="heading 4"/>
-    <w:basedOn w:val="a"/>
-    <w:next w:val="a"/>
-    <w:qFormat/>
-    <w:pPr>
-      <w:keepNext/>
-      <w:tabs>
-        <w:tab w:val="num" w:pos="0"/>
-      </w:tabs>
-      <w:ind w:firstLine="426"/>
-      <w:jc w:val="both"/>
-      <w:outlineLvl w:val="3"/>
-    </w:pPr>
-    <w:rPr>
-      <w:sz w:val="28"/>
-    </w:rPr>
-  </w:style>
-  <w:style w:type="paragraph" w:styleId="5">
-    <w:name w:val="heading 5"/>
-    <w:basedOn w:val="a"/>
-    <w:next w:val="a"/>
-    <w:qFormat/>
-    <w:pPr>
-      <w:keepNext/>
-      <w:tabs>
-        <w:tab w:val="num" w:pos="0"/>
-      </w:tabs>
-      <w:ind w:right="-284" w:firstLine="426"/>
-      <w:jc w:val="both"/>
-      <w:outlineLvl w:val="4"/>
-    </w:pPr>
-    <w:rPr>
-      <w:sz w:val="28"/>
-    </w:rPr>
-  </w:style>
-  <w:style w:type="paragraph" w:styleId="6">
-    <w:name w:val="heading 6"/>
-    <w:basedOn w:val="a"/>
-    <w:next w:val="a"/>
-    <w:qFormat/>
-    <w:pPr>
-      <w:keepNext/>
-      <w:tabs>
-        <w:tab w:val="num" w:pos="0"/>
-      </w:tabs>
-      <w:ind w:left="-426" w:right="141" w:firstLine="710"/>
-      <w:jc w:val="both"/>
-      <w:outlineLvl w:val="5"/>
-    </w:pPr>
-    <w:rPr>
-      <w:sz w:val="28"/>
-    </w:rPr>
-  </w:style>
-  <w:style w:type="character" w:default="1" w:styleId="a0">
-    <w:name w:val="Default Paragraph Font"/>
-    <w:uiPriority w:val="1"/>
-    <w:semiHidden/>
-    <w:unhideWhenUsed/>
-  </w:style>
-  <w:style w:type="table" w:default="1" w:styleId="a1">
-    <w:name w:val="Normal Table"/>
-    <w:uiPriority w:val="99"/>
-    <w:semiHidden/>
-    <w:unhideWhenUsed/>
-    <w:tblPr>
-      <w:tblInd w:w="0" w:type="dxa"/>
-      <w:tblCellMar>
-        <w:top w:w="0" w:type="dxa"/>
-        <w:left w:w="108" w:type="dxa"/>
-        <w:bottom w:w="0" w:type="dxa"/>
-        <w:right w:w="108" w:type="dxa"/>
-      </w:tblCellMar>
-    </w:tblPr>
-  </w:style>
-  <w:style w:type="numbering" w:default="1" w:styleId="a2">
-    <w:name w:val="No List"/>
-    <w:uiPriority w:val="99"/>
-    <w:semiHidden/>
-    <w:unhideWhenUsed/>
-  </w:style>
-  <w:style w:type="character" w:customStyle="1" w:styleId="Absatz-Standardschriftart">
-    <w:name w:val="Absatz-Standardschriftart"/>
-  </w:style>
-  <w:style w:type="character" w:customStyle="1" w:styleId="WW-Absatz-Standardschriftart">
-    <w:name w:val="WW-Absatz-Standardschriftart"/>
-  </w:style>
-  <w:style w:type="character" w:customStyle="1" w:styleId="WW-Absatz-Standardschriftart1">
-    <w:name w:val="WW-Absatz-Standardschriftart1"/>
-  </w:style>
-  <w:style w:type="character" w:customStyle="1" w:styleId="WW-Absatz-Standardschriftart11">
-    <w:name w:val="WW-Absatz-Standardschriftart11"/>
-  </w:style>
-  <w:style w:type="character" w:customStyle="1" w:styleId="WW-Absatz-Standardschriftart111">
-    <w:name w:val="WW-Absatz-Standardschriftart111"/>
-  </w:style>
-  <w:style w:type="character" w:customStyle="1" w:styleId="WW8Num3z0">
-    <w:name w:val="WW8Num3z0"/>
-    <w:rPr>
-      <w:rFonts w:ascii="Times New Roman" w:eastAsia="Times New Roman" w:hAnsi="Times New Roman" w:cs="Times New Roman"/>
-    </w:rPr>
-  </w:style>
-  <w:style w:type="character" w:customStyle="1" w:styleId="WW8Num3z1">
-    <w:name w:val="WW8Num3z1"/>
-    <w:rPr>
-      <w:rFonts w:ascii="Courier New" w:hAnsi="Courier New" w:cs="Courier New"/>
-    </w:rPr>
-  </w:style>
-  <w:style w:type="character" w:customStyle="1" w:styleId="WW8Num3z2">
-    <w:name w:val="WW8Num3z2"/>
-    <w:rPr>
-      <w:rFonts w:ascii="Wingdings" w:hAnsi="Wingdings" w:cs="Wingdings"/>
-    </w:rPr>
-  </w:style>
-  <w:style w:type="character" w:customStyle="1" w:styleId="WW8Num3z3">
-    <w:name w:val="WW8Num3z3"/>
-    <w:rPr>
-      <w:rFonts w:ascii="Symbol" w:hAnsi="Symbol" w:cs="Symbol"/>
-    </w:rPr>
-  </w:style>
-  <w:style w:type="character" w:customStyle="1" w:styleId="10">
-    <w:name w:val="Основной шрифт абзаца1"/>
-  </w:style>
-  <w:style w:type="paragraph" w:customStyle="1" w:styleId="a3">
-    <w:name w:val="Заголовок"/>
-    <w:basedOn w:val="a"/>
-    <w:next w:val="a4"/>
-    <w:pPr>
-      <w:keepNext/>
-      <w:spacing w:before="240" w:after="120"/>
-    </w:pPr>
-    <w:rPr>
-      <w:rFonts w:ascii="Arial" w:eastAsia="WenQuanYi Micro Hei" w:hAnsi="Arial" w:cs="Lohit Hindi"/>
-      <w:sz w:val="28"/>
-      <w:szCs w:val="28"/>
-    </w:rPr>
-  </w:style>
-  <w:style w:type="paragraph" w:styleId="a4">
-    <w:name w:val="Body Text"/>
-    <w:basedOn w:val="a"/>
-    <w:pPr>
-      <w:jc w:val="both"/>
-    </w:pPr>
-    <w:rPr>
-      <w:sz w:val="28"/>
-    </w:rPr>
-  </w:style>
-  <w:style w:type="paragraph" w:styleId="a5">
-    <w:name w:val="List"/>
-    <w:basedOn w:val="a4"/>
-    <w:rPr>
-      <w:rFonts w:cs="Lohit Hindi"/>
-    </w:rPr>
-  </w:style>
-  <w:style w:type="paragraph" w:styleId="a6">
-    <w:name w:val="caption"/>
-    <w:basedOn w:val="a"/>
-    <w:qFormat/>
-    <w:pPr>
-      <w:suppressLineNumbers/>
-      <w:spacing w:before="120" w:after="120"/>
-    </w:pPr>
-    <w:rPr>
-      <w:rFonts w:cs="Lohit Hindi"/>
-      <w:i/>
-      <w:iCs/>
-      <w:sz w:val="24"/>
-      <w:szCs w:val="24"/>
-    </w:rPr>
-  </w:style>
-  <w:style w:type="paragraph" w:customStyle="1" w:styleId="11">
-    <w:name w:val="Указатель1"/>
-    <w:basedOn w:val="a"/>
-    <w:pPr>
-      <w:suppressLineNumbers/>
-    </w:pPr>
-    <w:rPr>
-      <w:rFonts w:cs="Lohit Hindi"/>
-    </w:rPr>
-  </w:style>
-  <w:style w:type="paragraph" w:styleId="a7">
-    <w:name w:val="header"/>
-    <w:basedOn w:val="a"/>
-    <w:pPr>
-      <w:tabs>
-        <w:tab w:val="center" w:pos="4153"/>
-        <w:tab w:val="right" w:pos="8306"/>
-      </w:tabs>
-    </w:pPr>
-  </w:style>
-  <w:style w:type="paragraph" w:styleId="a8">
-    <w:name w:val="Body Text Indent"/>
-    <w:basedOn w:val="a"/>
-    <w:pPr>
-      <w:ind w:firstLine="567"/>
-      <w:jc w:val="both"/>
-    </w:pPr>
-    <w:rPr>
-      <w:sz w:val="28"/>
-    </w:rPr>
-  </w:style>
-  <w:style w:type="paragraph" w:customStyle="1" w:styleId="21">
-    <w:name w:val="Основной текст с отступом 21"/>
-    <w:basedOn w:val="a"/>
-    <w:pPr>
-      <w:ind w:firstLine="567"/>
-    </w:pPr>
-    <w:rPr>
-      <w:sz w:val="28"/>
-    </w:rPr>
-  </w:style>
-  <w:style w:type="paragraph" w:customStyle="1" w:styleId="31">
-    <w:name w:val="Основной текст с отступом 31"/>
-    <w:basedOn w:val="a"/>
-    <w:pPr>
-      <w:ind w:firstLine="709"/>
-      <w:jc w:val="both"/>
-    </w:pPr>
-    <w:rPr>
-      <w:sz w:val="28"/>
-      <w:lang w:val="en-US"/>
-    </w:rPr>
-  </w:style>
-  <w:style w:type="paragraph" w:customStyle="1" w:styleId="12">
-    <w:name w:val="Цитата1"/>
-    <w:basedOn w:val="a"/>
-    <w:pPr>
-      <w:ind w:left="-426" w:right="-284" w:firstLine="710"/>
-      <w:jc w:val="both"/>
-    </w:pPr>
-    <w:rPr>
-      <w:sz w:val="28"/>
-      <w:lang w:val="en-US"/>
-    </w:rPr>
-  </w:style>
-  <w:style w:type="paragraph" w:customStyle="1" w:styleId="210">
-    <w:name w:val="Основной текст 21"/>
-    <w:basedOn w:val="a"/>
-    <w:rPr>
-      <w:sz w:val="28"/>
-    </w:rPr>
-  </w:style>
-  <w:style w:type="paragraph" w:styleId="a9">
-    <w:name w:val="Balloon Text"/>
-    <w:basedOn w:val="a"/>
-    <w:rPr>
-      <w:rFonts w:ascii="Tahoma" w:hAnsi="Tahoma" w:cs="Tahoma"/>
-      <w:sz w:val="16"/>
-      <w:szCs w:val="16"/>
-    </w:rPr>
-  </w:style>
-  <w:style w:type="paragraph" w:customStyle="1" w:styleId="13">
-    <w:name w:val="Схема документа1"/>
-    <w:basedOn w:val="a"/>
-    <w:pPr>
-      <w:shd w:val="clear" w:color="auto" w:fill="000080"/>
-    </w:pPr>
-    <w:rPr>
-      <w:rFonts w:ascii="Tahoma" w:hAnsi="Tahoma" w:cs="Tahoma"/>
-    </w:rPr>
-  </w:style>
-  <w:style w:type="character" w:styleId="aa">
-    <w:name w:val="Placeholder Text"/>
-    <w:basedOn w:val="a0"/>
-    <w:uiPriority w:val="99"/>
-    <w:semiHidden/>
-    <w:rsid w:val="00480549"/>
-    <w:rPr>
-      <w:color w:val="808080"/>
-    </w:rPr>
-  </w:style>
-</w:styles>
-</file>
-
 <file path=word/glossary/document.xml><?xml version="1.0" encoding="utf-8"?>
-<w:glossaryDocument xmlns:wpc="http://schemas.microsoft.com/office/word/2010/wordprocessingCanvas" xmlns:mc="http://schemas.openxmlformats.org/markup-compatibility/2006" xmlns:o="urn:schemas-microsoft-com:office:office" xmlns:r="http://schemas.openxmlformats.org/officeDocument/2006/relationships" xmlns:m="http://schemas.openxmlformats.org/officeDocument/2006/math" xmlns:v="urn:schemas-microsoft-com:vml" xmlns:wp14="http://schemas.microsoft.com/office/word/2010/wordprocessingDrawing" xmlns:wp="http://schemas.openxmlformats.org/drawingml/2006/wordprocessingDrawing" xmlns:w10="urn:schemas-microsoft-com:office:word" xmlns:w="http://schemas.openxmlformats.org/wordprocessingml/2006/main" xmlns:w14="http://schemas.microsoft.com/office/word/2010/wordml" xmlns:wpg="http://schemas.microsoft.com/office/word/2010/wordprocessingGroup" xmlns:wpi="http://schemas.microsoft.com/office/word/2010/wordprocessingInk" xmlns:wne="http://schemas.microsoft.com/office/word/2006/wordml" xmlns:wps="http://schemas.microsoft.com/office/word/2010/wordprocessingShape" mc:Ignorable="w14 wp14">
+<w:glossaryDocument xmlns:wpc="http://schemas.microsoft.com/office/word/2010/wordprocessingCanvas" xmlns:cx="http://schemas.microsoft.com/office/drawing/2014/chartex" xmlns:cx1="http://schemas.microsoft.com/office/drawing/2015/9/8/chartex" xmlns:cx2="http://schemas.microsoft.com/office/drawing/2015/10/21/chartex" xmlns:cx3="http://schemas.microsoft.com/office/drawing/2016/5/9/chartex" xmlns:cx4="http://schemas.microsoft.com/office/drawing/2016/5/10/chartex" xmlns:cx5="http://schemas.microsoft.com/office/drawing/2016/5/11/chartex" xmlns:cx6="http://schemas.microsoft.com/office/drawing/2016/5/12/chartex" xmlns:cx7="http://schemas.microsoft.com/office/drawing/2016/5/13/chartex" xmlns:cx8="http://schemas.microsoft.com/office/drawing/2016/5/14/chartex" xmlns:mc="http://schemas.openxmlformats.org/markup-compatibility/2006" xmlns:aink="http://schemas.microsoft.com/office/drawing/2016/ink" xmlns:am3d="http://schemas.microsoft.com/office/drawing/2017/model3d" xmlns:o="urn:schemas-microsoft-com:office:office" xmlns:r="http://schemas.openxmlformats.org/officeDocument/2006/relationships" xmlns:m="http://schemas.openxmlformats.org/officeDocument/2006/math" xmlns:v="urn:schemas-microsoft-com:vml" xmlns:wp14="http://schemas.microsoft.com/office/word/2010/wordprocessingDrawing" xmlns:wp="http://schemas.openxmlformats.org/drawingml/2006/wordprocessingDrawing" xmlns:w10="urn:schemas-microsoft-com:office:word" xmlns:w="http://schemas.openxmlformats.org/wordprocessingml/2006/main" xmlns:w14="http://schemas.microsoft.com/office/word/2010/wordml" xmlns:w15="http://schemas.microsoft.com/office/word/2012/wordml" xmlns:w16cid="http://schemas.microsoft.com/office/word/2016/wordml/cid" xmlns:w16se="http://schemas.microsoft.com/office/word/2015/wordml/symex" xmlns:wpg="http://schemas.microsoft.com/office/word/2010/wordprocessingGroup" xmlns:wpi="http://schemas.microsoft.com/office/word/2010/wordprocessingInk" xmlns:wne="http://schemas.microsoft.com/office/word/2006/wordml" xmlns:wps="http://schemas.microsoft.com/office/word/2010/wordprocessingShape" mc:Ignorable="w14 w15 w16se w16cid wp14">
   <w:docParts>
     <w:docPart>
       <w:docPartPr>
@@ -3181,27 +2886,27 @@
 </file>
 
 <file path=word/glossary/fontTable.xml><?xml version="1.0" encoding="utf-8"?>
-<w:fonts xmlns:mc="http://schemas.openxmlformats.org/markup-compatibility/2006" xmlns:r="http://schemas.openxmlformats.org/officeDocument/2006/relationships" xmlns:w="http://schemas.openxmlformats.org/wordprocessingml/2006/main" xmlns:w14="http://schemas.microsoft.com/office/word/2010/wordml" mc:Ignorable="w14">
+<w:fonts xmlns:mc="http://schemas.openxmlformats.org/markup-compatibility/2006" xmlns:r="http://schemas.openxmlformats.org/officeDocument/2006/relationships" xmlns:w="http://schemas.openxmlformats.org/wordprocessingml/2006/main" xmlns:w14="http://schemas.microsoft.com/office/word/2010/wordml" xmlns:w15="http://schemas.microsoft.com/office/word/2012/wordml" xmlns:w16cid="http://schemas.microsoft.com/office/word/2016/wordml/cid" xmlns:w16se="http://schemas.microsoft.com/office/word/2015/wordml/symex" mc:Ignorable="w14 w15 w16se w16cid">
   <w:font w:name="Times New Roman">
     <w:panose1 w:val="02020603050405020304"/>
     <w:charset w:val="CC"/>
     <w:family w:val="roman"/>
     <w:pitch w:val="variable"/>
-    <w:sig w:usb0="E0002AFF" w:usb1="C0007841" w:usb2="00000009" w:usb3="00000000" w:csb0="000001FF" w:csb1="00000000"/>
+    <w:sig w:usb0="E0002EFF" w:usb1="C000785B" w:usb2="00000009" w:usb3="00000000" w:csb0="000001FF" w:csb1="00000000"/>
   </w:font>
   <w:font w:name="Arial">
     <w:panose1 w:val="020B0604020202020204"/>
     <w:charset w:val="CC"/>
     <w:family w:val="swiss"/>
     <w:pitch w:val="variable"/>
-    <w:sig w:usb0="E0002AFF" w:usb1="C0007843" w:usb2="00000009" w:usb3="00000000" w:csb0="000001FF" w:csb1="00000000"/>
+    <w:sig w:usb0="E0002EFF" w:usb1="C000785B" w:usb2="00000009" w:usb3="00000000" w:csb0="000001FF" w:csb1="00000000"/>
   </w:font>
   <w:font w:name="Courier New">
     <w:panose1 w:val="02070309020205020404"/>
     <w:charset w:val="CC"/>
     <w:family w:val="modern"/>
     <w:pitch w:val="fixed"/>
-    <w:sig w:usb0="E0002AFF" w:usb1="C0007843" w:usb2="00000009" w:usb3="00000000" w:csb0="000001FF" w:csb1="00000000"/>
+    <w:sig w:usb0="E0002EFF" w:usb1="C0007843" w:usb2="00000009" w:usb3="00000000" w:csb0="000001FF" w:csb1="00000000"/>
   </w:font>
   <w:font w:name="Wingdings">
     <w:panose1 w:val="05000000000000000000"/>
@@ -3247,13 +2952,20 @@
     <w:charset w:val="CC"/>
     <w:family w:val="swiss"/>
     <w:pitch w:val="variable"/>
-    <w:sig w:usb0="E00002FF" w:usb1="4000ACFF" w:usb2="00000001" w:usb3="00000000" w:csb0="0000019F" w:csb1="00000000"/>
+    <w:sig w:usb0="E0002AFF" w:usb1="C000247B" w:usb2="00000009" w:usb3="00000000" w:csb0="000001FF" w:csb1="00000000"/>
+  </w:font>
+  <w:font w:name="Calibri Light">
+    <w:panose1 w:val="020F0302020204030204"/>
+    <w:charset w:val="CC"/>
+    <w:family w:val="swiss"/>
+    <w:pitch w:val="variable"/>
+    <w:sig w:usb0="E0002AFF" w:usb1="C000247B" w:usb2="00000009" w:usb3="00000000" w:csb0="000001FF" w:csb1="00000000"/>
   </w:font>
 </w:fonts>
 </file>
 
 <file path=word/glossary/settings.xml><?xml version="1.0" encoding="utf-8"?>
-<w:settings xmlns:mc="http://schemas.openxmlformats.org/markup-compatibility/2006" xmlns:o="urn:schemas-microsoft-com:office:office" xmlns:r="http://schemas.openxmlformats.org/officeDocument/2006/relationships" xmlns:m="http://schemas.openxmlformats.org/officeDocument/2006/math" xmlns:v="urn:schemas-microsoft-com:vml" xmlns:w10="urn:schemas-microsoft-com:office:word" xmlns:w="http://schemas.openxmlformats.org/wordprocessingml/2006/main" xmlns:w14="http://schemas.microsoft.com/office/word/2010/wordml" xmlns:sl="http://schemas.openxmlformats.org/schemaLibrary/2006/main" mc:Ignorable="w14">
+<w:settings xmlns:mc="http://schemas.openxmlformats.org/markup-compatibility/2006" xmlns:o="urn:schemas-microsoft-com:office:office" xmlns:r="http://schemas.openxmlformats.org/officeDocument/2006/relationships" xmlns:m="http://schemas.openxmlformats.org/officeDocument/2006/math" xmlns:v="urn:schemas-microsoft-com:vml" xmlns:w10="urn:schemas-microsoft-com:office:word" xmlns:w="http://schemas.openxmlformats.org/wordprocessingml/2006/main" xmlns:w14="http://schemas.microsoft.com/office/word/2010/wordml" xmlns:w15="http://schemas.microsoft.com/office/word/2012/wordml" xmlns:w16cid="http://schemas.microsoft.com/office/word/2016/wordml/cid" xmlns:w16se="http://schemas.microsoft.com/office/word/2015/wordml/symex" xmlns:sl="http://schemas.openxmlformats.org/schemaLibrary/2006/main" mc:Ignorable="w14 w15 w16se w16cid">
   <w:view w:val="normal"/>
   <w:defaultTabStop w:val="708"/>
   <w:characterSpacingControl w:val="doNotCompress"/>
@@ -3263,6 +2975,7 @@
     <w:compatSetting w:name="overrideTableStyleFontSizeAndJustification" w:uri="http://schemas.microsoft.com/office/word" w:val="1"/>
     <w:compatSetting w:name="enableOpenTypeFeatures" w:uri="http://schemas.microsoft.com/office/word" w:val="1"/>
     <w:compatSetting w:name="doNotFlipMirrorIndents" w:uri="http://schemas.microsoft.com/office/word" w:val="1"/>
+    <w:compatSetting w:name="useWord2013TrackBottomHyphenation" w:uri="http://schemas.microsoft.com/office/word" w:val="1"/>
   </w:compat>
   <w:rsids>
     <w:rsidRoot w:val="00322B09"/>
@@ -3289,7 +3002,7 @@
 </file>
 
 <file path=word/glossary/styles.xml><?xml version="1.0" encoding="utf-8"?>
-<w:styles xmlns:mc="http://schemas.openxmlformats.org/markup-compatibility/2006" xmlns:r="http://schemas.openxmlformats.org/officeDocument/2006/relationships" xmlns:w="http://schemas.openxmlformats.org/wordprocessingml/2006/main" xmlns:w14="http://schemas.microsoft.com/office/word/2010/wordml" mc:Ignorable="w14">
+<w:styles xmlns:mc="http://schemas.openxmlformats.org/markup-compatibility/2006" xmlns:r="http://schemas.openxmlformats.org/officeDocument/2006/relationships" xmlns:w="http://schemas.openxmlformats.org/wordprocessingml/2006/main" xmlns:w14="http://schemas.microsoft.com/office/word/2010/wordml" xmlns:w15="http://schemas.microsoft.com/office/word/2012/wordml" xmlns:w16cid="http://schemas.microsoft.com/office/word/2016/wordml/cid" xmlns:w16se="http://schemas.microsoft.com/office/word/2015/wordml/symex" mc:Ignorable="w14 w15 w16se w16cid">
   <w:docDefaults>
     <w:rPrDefault>
       <w:rPr>
@@ -3305,144 +3018,382 @@
       </w:pPr>
     </w:pPrDefault>
   </w:docDefaults>
-  <w:latentStyles w:defLockedState="0" w:defUIPriority="99" w:defSemiHidden="1" w:defUnhideWhenUsed="1" w:defQFormat="0" w:count="267">
-    <w:lsdException w:name="Normal" w:semiHidden="0" w:uiPriority="0" w:unhideWhenUsed="0" w:qFormat="1"/>
-    <w:lsdException w:name="heading 1" w:semiHidden="0" w:uiPriority="9" w:unhideWhenUsed="0" w:qFormat="1"/>
-    <w:lsdException w:name="heading 2" w:uiPriority="9" w:qFormat="1"/>
-    <w:lsdException w:name="heading 3" w:uiPriority="9" w:qFormat="1"/>
-    <w:lsdException w:name="heading 4" w:uiPriority="9" w:qFormat="1"/>
-    <w:lsdException w:name="heading 5" w:uiPriority="9" w:qFormat="1"/>
-    <w:lsdException w:name="heading 6" w:uiPriority="9" w:qFormat="1"/>
-    <w:lsdException w:name="heading 7" w:uiPriority="9" w:qFormat="1"/>
-    <w:lsdException w:name="heading 8" w:uiPriority="9" w:qFormat="1"/>
-    <w:lsdException w:name="heading 9" w:uiPriority="9" w:qFormat="1"/>
-    <w:lsdException w:name="toc 1" w:uiPriority="39"/>
-    <w:lsdException w:name="toc 2" w:uiPriority="39"/>
-    <w:lsdException w:name="toc 3" w:uiPriority="39"/>
-    <w:lsdException w:name="toc 4" w:uiPriority="39"/>
-    <w:lsdException w:name="toc 5" w:uiPriority="39"/>
-    <w:lsdException w:name="toc 6" w:uiPriority="39"/>
-    <w:lsdException w:name="toc 7" w:uiPriority="39"/>
-    <w:lsdException w:name="toc 8" w:uiPriority="39"/>
-    <w:lsdException w:name="toc 9" w:uiPriority="39"/>
-    <w:lsdException w:name="caption" w:uiPriority="35" w:qFormat="1"/>
-    <w:lsdException w:name="Title" w:semiHidden="0" w:uiPriority="10" w:unhideWhenUsed="0" w:qFormat="1"/>
-    <w:lsdException w:name="Default Paragraph Font" w:uiPriority="1"/>
-    <w:lsdException w:name="Subtitle" w:semiHidden="0" w:uiPriority="11" w:unhideWhenUsed="0" w:qFormat="1"/>
-    <w:lsdException w:name="Strong" w:semiHidden="0" w:uiPriority="22" w:unhideWhenUsed="0" w:qFormat="1"/>
-    <w:lsdException w:name="Emphasis" w:semiHidden="0" w:uiPriority="20" w:unhideWhenUsed="0" w:qFormat="1"/>
-    <w:lsdException w:name="Table Grid" w:semiHidden="0" w:uiPriority="59" w:unhideWhenUsed="0"/>
-    <w:lsdException w:name="Placeholder Text" w:unhideWhenUsed="0"/>
-    <w:lsdException w:name="No Spacing" w:semiHidden="0" w:uiPriority="1" w:unhideWhenUsed="0" w:qFormat="1"/>
-    <w:lsdException w:name="Light Shading" w:semiHidden="0" w:uiPriority="60" w:unhideWhenUsed="0"/>
-    <w:lsdException w:name="Light List" w:semiHidden="0" w:uiPriority="61" w:unhideWhenUsed="0"/>
-    <w:lsdException w:name="Light Grid" w:semiHidden="0" w:uiPriority="62" w:unhideWhenUsed="0"/>
-    <w:lsdException w:name="Medium Shading 1" w:semiHidden="0" w:uiPriority="63" w:unhideWhenUsed="0"/>
-    <w:lsdException w:name="Medium Shading 2" w:semiHidden="0" w:uiPriority="64" w:unhideWhenUsed="0"/>
-    <w:lsdException w:name="Medium List 1" w:semiHidden="0" w:uiPriority="65" w:unhideWhenUsed="0"/>
-    <w:lsdException w:name="Medium List 2" w:semiHidden="0" w:uiPriority="66" w:unhideWhenUsed="0"/>
-    <w:lsdException w:name="Medium Grid 1" w:semiHidden="0" w:uiPriority="67" w:unhideWhenUsed="0"/>
-    <w:lsdException w:name="Medium Grid 2" w:semiHidden="0" w:uiPriority="68" w:unhideWhenUsed="0"/>
-    <w:lsdException w:name="Medium Grid 3" w:semiHidden="0" w:uiPriority="69" w:unhideWhenUsed="0"/>
-    <w:lsdException w:name="Dark List" w:semiHidden="0" w:uiPriority="70" w:unhideWhenUsed="0"/>
-    <w:lsdException w:name="Colorful Shading" w:semiHidden="0" w:uiPriority="71" w:unhideWhenUsed="0"/>
-    <w:lsdException w:name="Colorful List" w:semiHidden="0" w:uiPriority="72" w:unhideWhenUsed="0"/>
-    <w:lsdException w:name="Colorful Grid" w:semiHidden="0" w:uiPriority="73" w:unhideWhenUsed="0"/>
-    <w:lsdException w:name="Light Shading Accent 1" w:semiHidden="0" w:uiPriority="60" w:unhideWhenUsed="0"/>
-    <w:lsdException w:name="Light List Accent 1" w:semiHidden="0" w:uiPriority="61" w:unhideWhenUsed="0"/>
-    <w:lsdException w:name="Light Grid Accent 1" w:semiHidden="0" w:uiPriority="62" w:unhideWhenUsed="0"/>
-    <w:lsdException w:name="Medium Shading 1 Accent 1" w:semiHidden="0" w:uiPriority="63" w:unhideWhenUsed="0"/>
-    <w:lsdException w:name="Medium Shading 2 Accent 1" w:semiHidden="0" w:uiPriority="64" w:unhideWhenUsed="0"/>
-    <w:lsdException w:name="Medium List 1 Accent 1" w:semiHidden="0" w:uiPriority="65" w:unhideWhenUsed="0"/>
-    <w:lsdException w:name="Revision" w:unhideWhenUsed="0"/>
-    <w:lsdException w:name="List Paragraph" w:semiHidden="0" w:uiPriority="34" w:unhideWhenUsed="0" w:qFormat="1"/>
-    <w:lsdException w:name="Quote" w:semiHidden="0" w:uiPriority="29" w:unhideWhenUsed="0" w:qFormat="1"/>
-    <w:lsdException w:name="Intense Quote" w:semiHidden="0" w:uiPriority="30" w:unhideWhenUsed="0" w:qFormat="1"/>
-    <w:lsdException w:name="Medium List 2 Accent 1" w:semiHidden="0" w:uiPriority="66" w:unhideWhenUsed="0"/>
-    <w:lsdException w:name="Medium Grid 1 Accent 1" w:semiHidden="0" w:uiPriority="67" w:unhideWhenUsed="0"/>
-    <w:lsdException w:name="Medium Grid 2 Accent 1" w:semiHidden="0" w:uiPriority="68" w:unhideWhenUsed="0"/>
-    <w:lsdException w:name="Medium Grid 3 Accent 1" w:semiHidden="0" w:uiPriority="69" w:unhideWhenUsed="0"/>
-    <w:lsdException w:name="Dark List Accent 1" w:semiHidden="0" w:uiPriority="70" w:unhideWhenUsed="0"/>
-    <w:lsdException w:name="Colorful Shading Accent 1" w:semiHidden="0" w:uiPriority="71" w:unhideWhenUsed="0"/>
-    <w:lsdException w:name="Colorful List Accent 1" w:semiHidden="0" w:uiPriority="72" w:unhideWhenUsed="0"/>
-    <w:lsdException w:name="Colorful Grid Accent 1" w:semiHidden="0" w:uiPriority="73" w:unhideWhenUsed="0"/>
-    <w:lsdException w:name="Light Shading Accent 2" w:semiHidden="0" w:uiPriority="60" w:unhideWhenUsed="0"/>
-    <w:lsdException w:name="Light List Accent 2" w:semiHidden="0" w:uiPriority="61" w:unhideWhenUsed="0"/>
-    <w:lsdException w:name="Light Grid Accent 2" w:semiHidden="0" w:uiPriority="62" w:unhideWhenUsed="0"/>
-    <w:lsdException w:name="Medium Shading 1 Accent 2" w:semiHidden="0" w:uiPriority="63" w:unhideWhenUsed="0"/>
-    <w:lsdException w:name="Medium Shading 2 Accent 2" w:semiHidden="0" w:uiPriority="64" w:unhideWhenUsed="0"/>
-    <w:lsdException w:name="Medium List 1 Accent 2" w:semiHidden="0" w:uiPriority="65" w:unhideWhenUsed="0"/>
-    <w:lsdException w:name="Medium List 2 Accent 2" w:semiHidden="0" w:uiPriority="66" w:unhideWhenUsed="0"/>
-    <w:lsdException w:name="Medium Grid 1 Accent 2" w:semiHidden="0" w:uiPriority="67" w:unhideWhenUsed="0"/>
-    <w:lsdException w:name="Medium Grid 2 Accent 2" w:semiHidden="0" w:uiPriority="68" w:unhideWhenUsed="0"/>
-    <w:lsdException w:name="Medium Grid 3 Accent 2" w:semiHidden="0" w:uiPriority="69" w:unhideWhenUsed="0"/>
-    <w:lsdException w:name="Dark List Accent 2" w:semiHidden="0" w:uiPriority="70" w:unhideWhenUsed="0"/>
-    <w:lsdException w:name="Colorful Shading Accent 2" w:semiHidden="0" w:uiPriority="71" w:unhideWhenUsed="0"/>
-    <w:lsdException w:name="Colorful List Accent 2" w:semiHidden="0" w:uiPriority="72" w:unhideWhenUsed="0"/>
-    <w:lsdException w:name="Colorful Grid Accent 2" w:semiHidden="0" w:uiPriority="73" w:unhideWhenUsed="0"/>
-    <w:lsdException w:name="Light Shading Accent 3" w:semiHidden="0" w:uiPriority="60" w:unhideWhenUsed="0"/>
-    <w:lsdException w:name="Light List Accent 3" w:semiHidden="0" w:uiPriority="61" w:unhideWhenUsed="0"/>
-    <w:lsdException w:name="Light Grid Accent 3" w:semiHidden="0" w:uiPriority="62" w:unhideWhenUsed="0"/>
-    <w:lsdException w:name="Medium Shading 1 Accent 3" w:semiHidden="0" w:uiPriority="63" w:unhideWhenUsed="0"/>
-    <w:lsdException w:name="Medium Shading 2 Accent 3" w:semiHidden="0" w:uiPriority="64" w:unhideWhenUsed="0"/>
-    <w:lsdException w:name="Medium List 1 Accent 3" w:semiHidden="0" w:uiPriority="65" w:unhideWhenUsed="0"/>
-    <w:lsdException w:name="Medium List 2 Accent 3" w:semiHidden="0" w:uiPriority="66" w:unhideWhenUsed="0"/>
-    <w:lsdException w:name="Medium Grid 1 Accent 3" w:semiHidden="0" w:uiPriority="67" w:unhideWhenUsed="0"/>
-    <w:lsdException w:name="Medium Grid 2 Accent 3" w:semiHidden="0" w:uiPriority="68" w:unhideWhenUsed="0"/>
-    <w:lsdException w:name="Medium Grid 3 Accent 3" w:semiHidden="0" w:uiPriority="69" w:unhideWhenUsed="0"/>
-    <w:lsdException w:name="Dark List Accent 3" w:semiHidden="0" w:uiPriority="70" w:unhideWhenUsed="0"/>
-    <w:lsdException w:name="Colorful Shading Accent 3" w:semiHidden="0" w:uiPriority="71" w:unhideWhenUsed="0"/>
-    <w:lsdException w:name="Colorful List Accent 3" w:semiHidden="0" w:uiPriority="72" w:unhideWhenUsed="0"/>
-    <w:lsdException w:name="Colorful Grid Accent 3" w:semiHidden="0" w:uiPriority="73" w:unhideWhenUsed="0"/>
-    <w:lsdException w:name="Light Shading Accent 4" w:semiHidden="0" w:uiPriority="60" w:unhideWhenUsed="0"/>
-    <w:lsdException w:name="Light List Accent 4" w:semiHidden="0" w:uiPriority="61" w:unhideWhenUsed="0"/>
-    <w:lsdException w:name="Light Grid Accent 4" w:semiHidden="0" w:uiPriority="62" w:unhideWhenUsed="0"/>
-    <w:lsdException w:name="Medium Shading 1 Accent 4" w:semiHidden="0" w:uiPriority="63" w:unhideWhenUsed="0"/>
-    <w:lsdException w:name="Medium Shading 2 Accent 4" w:semiHidden="0" w:uiPriority="64" w:unhideWhenUsed="0"/>
-    <w:lsdException w:name="Medium List 1 Accent 4" w:semiHidden="0" w:uiPriority="65" w:unhideWhenUsed="0"/>
-    <w:lsdException w:name="Medium List 2 Accent 4" w:semiHidden="0" w:uiPriority="66" w:unhideWhenUsed="0"/>
-    <w:lsdException w:name="Medium Grid 1 Accent 4" w:semiHidden="0" w:uiPriority="67" w:unhideWhenUsed="0"/>
-    <w:lsdException w:name="Medium Grid 2 Accent 4" w:semiHidden="0" w:uiPriority="68" w:unhideWhenUsed="0"/>
-    <w:lsdException w:name="Medium Grid 3 Accent 4" w:semiHidden="0" w:uiPriority="69" w:unhideWhenUsed="0"/>
-    <w:lsdException w:name="Dark List Accent 4" w:semiHidden="0" w:uiPriority="70" w:unhideWhenUsed="0"/>
-    <w:lsdException w:name="Colorful Shading Accent 4" w:semiHidden="0" w:uiPriority="71" w:unhideWhenUsed="0"/>
-    <w:lsdException w:name="Colorful List Accent 4" w:semiHidden="0" w:uiPriority="72" w:unhideWhenUsed="0"/>
-    <w:lsdException w:name="Colorful Grid Accent 4" w:semiHidden="0" w:uiPriority="73" w:unhideWhenUsed="0"/>
-    <w:lsdException w:name="Light Shading Accent 5" w:semiHidden="0" w:uiPriority="60" w:unhideWhenUsed="0"/>
-    <w:lsdException w:name="Light List Accent 5" w:semiHidden="0" w:uiPriority="61" w:unhideWhenUsed="0"/>
-    <w:lsdException w:name="Light Grid Accent 5" w:semiHidden="0" w:uiPriority="62" w:unhideWhenUsed="0"/>
-    <w:lsdException w:name="Medium Shading 1 Accent 5" w:semiHidden="0" w:uiPriority="63" w:unhideWhenUsed="0"/>
-    <w:lsdException w:name="Medium Shading 2 Accent 5" w:semiHidden="0" w:uiPriority="64" w:unhideWhenUsed="0"/>
-    <w:lsdException w:name="Medium List 1 Accent 5" w:semiHidden="0" w:uiPriority="65" w:unhideWhenUsed="0"/>
-    <w:lsdException w:name="Medium List 2 Accent 5" w:semiHidden="0" w:uiPriority="66" w:unhideWhenUsed="0"/>
-    <w:lsdException w:name="Medium Grid 1 Accent 5" w:semiHidden="0" w:uiPriority="67" w:unhideWhenUsed="0"/>
-    <w:lsdException w:name="Medium Grid 2 Accent 5" w:semiHidden="0" w:uiPriority="68" w:unhideWhenUsed="0"/>
-    <w:lsdException w:name="Medium Grid 3 Accent 5" w:semiHidden="0" w:uiPriority="69" w:unhideWhenUsed="0"/>
-    <w:lsdException w:name="Dark List Accent 5" w:semiHidden="0" w:uiPriority="70" w:unhideWhenUsed="0"/>
-    <w:lsdException w:name="Colorful Shading Accent 5" w:semiHidden="0" w:uiPriority="71" w:unhideWhenUsed="0"/>
-    <w:lsdException w:name="Colorful List Accent 5" w:semiHidden="0" w:uiPriority="72" w:unhideWhenUsed="0"/>
-    <w:lsdException w:name="Colorful Grid Accent 5" w:semiHidden="0" w:uiPriority="73" w:unhideWhenUsed="0"/>
-    <w:lsdException w:name="Light Shading Accent 6" w:semiHidden="0" w:uiPriority="60" w:unhideWhenUsed="0"/>
-    <w:lsdException w:name="Light List Accent 6" w:semiHidden="0" w:uiPriority="61" w:unhideWhenUsed="0"/>
-    <w:lsdException w:name="Light Grid Accent 6" w:semiHidden="0" w:uiPriority="62" w:unhideWhenUsed="0"/>
-    <w:lsdException w:name="Medium Shading 1 Accent 6" w:semiHidden="0" w:uiPriority="63" w:unhideWhenUsed="0"/>
-    <w:lsdException w:name="Medium Shading 2 Accent 6" w:semiHidden="0" w:uiPriority="64" w:unhideWhenUsed="0"/>
-    <w:lsdException w:name="Medium List 1 Accent 6" w:semiHidden="0" w:uiPriority="65" w:unhideWhenUsed="0"/>
-    <w:lsdException w:name="Medium List 2 Accent 6" w:semiHidden="0" w:uiPriority="66" w:unhideWhenUsed="0"/>
-    <w:lsdException w:name="Medium Grid 1 Accent 6" w:semiHidden="0" w:uiPriority="67" w:unhideWhenUsed="0"/>
-    <w:lsdException w:name="Medium Grid 2 Accent 6" w:semiHidden="0" w:uiPriority="68" w:unhideWhenUsed="0"/>
-    <w:lsdException w:name="Medium Grid 3 Accent 6" w:semiHidden="0" w:uiPriority="69" w:unhideWhenUsed="0"/>
-    <w:lsdException w:name="Dark List Accent 6" w:semiHidden="0" w:uiPriority="70" w:unhideWhenUsed="0"/>
-    <w:lsdException w:name="Colorful Shading Accent 6" w:semiHidden="0" w:uiPriority="71" w:unhideWhenUsed="0"/>
-    <w:lsdException w:name="Colorful List Accent 6" w:semiHidden="0" w:uiPriority="72" w:unhideWhenUsed="0"/>
-    <w:lsdException w:name="Colorful Grid Accent 6" w:semiHidden="0" w:uiPriority="73" w:unhideWhenUsed="0"/>
-    <w:lsdException w:name="Subtle Emphasis" w:semiHidden="0" w:uiPriority="19" w:unhideWhenUsed="0" w:qFormat="1"/>
-    <w:lsdException w:name="Intense Emphasis" w:semiHidden="0" w:uiPriority="21" w:unhideWhenUsed="0" w:qFormat="1"/>
-    <w:lsdException w:name="Subtle Reference" w:semiHidden="0" w:uiPriority="31" w:unhideWhenUsed="0" w:qFormat="1"/>
-    <w:lsdException w:name="Intense Reference" w:semiHidden="0" w:uiPriority="32" w:unhideWhenUsed="0" w:qFormat="1"/>
-    <w:lsdException w:name="Book Title" w:semiHidden="0" w:uiPriority="33" w:unhideWhenUsed="0" w:qFormat="1"/>
-    <w:lsdException w:name="Bibliography" w:uiPriority="37"/>
-    <w:lsdException w:name="TOC Heading" w:uiPriority="39" w:qFormat="1"/>
+  <w:latentStyles w:defLockedState="0" w:defUIPriority="99" w:defSemiHidden="0" w:defUnhideWhenUsed="0" w:defQFormat="0" w:count="375">
+    <w:lsdException w:name="Normal" w:uiPriority="0" w:qFormat="1"/>
+    <w:lsdException w:name="heading 1" w:uiPriority="9" w:qFormat="1"/>
+    <w:lsdException w:name="heading 2" w:semiHidden="1" w:uiPriority="9" w:unhideWhenUsed="1" w:qFormat="1"/>
+    <w:lsdException w:name="heading 3" w:semiHidden="1" w:uiPriority="9" w:unhideWhenUsed="1" w:qFormat="1"/>
+    <w:lsdException w:name="heading 4" w:semiHidden="1" w:uiPriority="9" w:unhideWhenUsed="1" w:qFormat="1"/>
+    <w:lsdException w:name="heading 5" w:semiHidden="1" w:uiPriority="9" w:unhideWhenUsed="1" w:qFormat="1"/>
+    <w:lsdException w:name="heading 6" w:semiHidden="1" w:uiPriority="9" w:unhideWhenUsed="1" w:qFormat="1"/>
+    <w:lsdException w:name="heading 7" w:semiHidden="1" w:uiPriority="9" w:unhideWhenUsed="1" w:qFormat="1"/>
+    <w:lsdException w:name="heading 8" w:semiHidden="1" w:uiPriority="9" w:unhideWhenUsed="1" w:qFormat="1"/>
+    <w:lsdException w:name="heading 9" w:semiHidden="1" w:uiPriority="9" w:unhideWhenUsed="1" w:qFormat="1"/>
+    <w:lsdException w:name="index 1" w:semiHidden="1" w:unhideWhenUsed="1"/>
+    <w:lsdException w:name="index 2" w:semiHidden="1" w:unhideWhenUsed="1"/>
+    <w:lsdException w:name="index 3" w:semiHidden="1" w:unhideWhenUsed="1"/>
+    <w:lsdException w:name="index 4" w:semiHidden="1" w:unhideWhenUsed="1"/>
+    <w:lsdException w:name="index 5" w:semiHidden="1" w:unhideWhenUsed="1"/>
+    <w:lsdException w:name="index 6" w:semiHidden="1" w:unhideWhenUsed="1"/>
+    <w:lsdException w:name="index 7" w:semiHidden="1" w:unhideWhenUsed="1"/>
+    <w:lsdException w:name="index 8" w:semiHidden="1" w:unhideWhenUsed="1"/>
+    <w:lsdException w:name="index 9" w:semiHidden="1" w:unhideWhenUsed="1"/>
+    <w:lsdException w:name="toc 1" w:semiHidden="1" w:uiPriority="39" w:unhideWhenUsed="1"/>
+    <w:lsdException w:name="toc 2" w:semiHidden="1" w:uiPriority="39" w:unhideWhenUsed="1"/>
+    <w:lsdException w:name="toc 3" w:semiHidden="1" w:uiPriority="39" w:unhideWhenUsed="1"/>
+    <w:lsdException w:name="toc 4" w:semiHidden="1" w:uiPriority="39" w:unhideWhenUsed="1"/>
+    <w:lsdException w:name="toc 5" w:semiHidden="1" w:uiPriority="39" w:unhideWhenUsed="1"/>
+    <w:lsdException w:name="toc 6" w:semiHidden="1" w:uiPriority="39" w:unhideWhenUsed="1"/>
+    <w:lsdException w:name="toc 7" w:semiHidden="1" w:uiPriority="39" w:unhideWhenUsed="1"/>
+    <w:lsdException w:name="toc 8" w:semiHidden="1" w:uiPriority="39" w:unhideWhenUsed="1"/>
+    <w:lsdException w:name="toc 9" w:semiHidden="1" w:uiPriority="39" w:unhideWhenUsed="1"/>
+    <w:lsdException w:name="Normal Indent" w:semiHidden="1" w:unhideWhenUsed="1"/>
+    <w:lsdException w:name="footnote text" w:semiHidden="1" w:unhideWhenUsed="1"/>
+    <w:lsdException w:name="annotation text" w:semiHidden="1" w:unhideWhenUsed="1"/>
+    <w:lsdException w:name="header" w:semiHidden="1" w:unhideWhenUsed="1"/>
+    <w:lsdException w:name="footer" w:semiHidden="1" w:unhideWhenUsed="1"/>
+    <w:lsdException w:name="index heading" w:semiHidden="1" w:unhideWhenUsed="1"/>
+    <w:lsdException w:name="caption" w:semiHidden="1" w:uiPriority="35" w:unhideWhenUsed="1" w:qFormat="1"/>
+    <w:lsdException w:name="table of figures" w:semiHidden="1" w:unhideWhenUsed="1"/>
+    <w:lsdException w:name="envelope address" w:semiHidden="1" w:unhideWhenUsed="1"/>
+    <w:lsdException w:name="envelope return" w:semiHidden="1" w:unhideWhenUsed="1"/>
+    <w:lsdException w:name="footnote reference" w:semiHidden="1" w:unhideWhenUsed="1"/>
+    <w:lsdException w:name="annotation reference" w:semiHidden="1" w:unhideWhenUsed="1"/>
+    <w:lsdException w:name="line number" w:semiHidden="1" w:unhideWhenUsed="1"/>
+    <w:lsdException w:name="page number" w:semiHidden="1" w:unhideWhenUsed="1"/>
+    <w:lsdException w:name="endnote reference" w:semiHidden="1" w:unhideWhenUsed="1"/>
+    <w:lsdException w:name="endnote text" w:semiHidden="1" w:unhideWhenUsed="1"/>
+    <w:lsdException w:name="table of authorities" w:semiHidden="1" w:unhideWhenUsed="1"/>
+    <w:lsdException w:name="macro" w:semiHidden="1" w:unhideWhenUsed="1"/>
+    <w:lsdException w:name="toa heading" w:semiHidden="1" w:unhideWhenUsed="1"/>
+    <w:lsdException w:name="List" w:semiHidden="1" w:unhideWhenUsed="1"/>
+    <w:lsdException w:name="List Bullet" w:semiHidden="1" w:unhideWhenUsed="1"/>
+    <w:lsdException w:name="List Number" w:semiHidden="1" w:unhideWhenUsed="1"/>
+    <w:lsdException w:name="List 2" w:semiHidden="1" w:unhideWhenUsed="1"/>
+    <w:lsdException w:name="List 3" w:semiHidden="1" w:unhideWhenUsed="1"/>
+    <w:lsdException w:name="List 4" w:semiHidden="1" w:unhideWhenUsed="1"/>
+    <w:lsdException w:name="List 5" w:semiHidden="1" w:unhideWhenUsed="1"/>
+    <w:lsdException w:name="List Bullet 2" w:semiHidden="1" w:unhideWhenUsed="1"/>
+    <w:lsdException w:name="List Bullet 3" w:semiHidden="1" w:unhideWhenUsed="1"/>
+    <w:lsdException w:name="List Bullet 4" w:semiHidden="1" w:unhideWhenUsed="1"/>
+    <w:lsdException w:name="List Bullet 5" w:semiHidden="1" w:unhideWhenUsed="1"/>
+    <w:lsdException w:name="List Number 2" w:semiHidden="1" w:unhideWhenUsed="1"/>
+    <w:lsdException w:name="List Number 3" w:semiHidden="1" w:unhideWhenUsed="1"/>
+    <w:lsdException w:name="List Number 4" w:semiHidden="1" w:unhideWhenUsed="1"/>
+    <w:lsdException w:name="List Number 5" w:semiHidden="1" w:unhideWhenUsed="1"/>
+    <w:lsdException w:name="Title" w:uiPriority="10" w:qFormat="1"/>
+    <w:lsdException w:name="Closing" w:semiHidden="1" w:unhideWhenUsed="1"/>
+    <w:lsdException w:name="Signature" w:semiHidden="1" w:unhideWhenUsed="1"/>
+    <w:lsdException w:name="Default Paragraph Font" w:semiHidden="1" w:uiPriority="1" w:unhideWhenUsed="1"/>
+    <w:lsdException w:name="Body Text" w:semiHidden="1" w:unhideWhenUsed="1"/>
+    <w:lsdException w:name="Body Text Indent" w:semiHidden="1" w:unhideWhenUsed="1"/>
+    <w:lsdException w:name="List Continue" w:semiHidden="1" w:unhideWhenUsed="1"/>
+    <w:lsdException w:name="List Continue 2" w:semiHidden="1" w:unhideWhenUsed="1"/>
+    <w:lsdException w:name="List Continue 3" w:semiHidden="1" w:unhideWhenUsed="1"/>
+    <w:lsdException w:name="List Continue 4" w:semiHidden="1" w:unhideWhenUsed="1"/>
+    <w:lsdException w:name="List Continue 5" w:semiHidden="1" w:unhideWhenUsed="1"/>
+    <w:lsdException w:name="Message Header" w:semiHidden="1" w:unhideWhenUsed="1"/>
+    <w:lsdException w:name="Subtitle" w:uiPriority="11" w:qFormat="1"/>
+    <w:lsdException w:name="Salutation" w:semiHidden="1" w:unhideWhenUsed="1"/>
+    <w:lsdException w:name="Date" w:semiHidden="1" w:unhideWhenUsed="1"/>
+    <w:lsdException w:name="Body Text First Indent" w:semiHidden="1" w:unhideWhenUsed="1"/>
+    <w:lsdException w:name="Body Text First Indent 2" w:semiHidden="1" w:unhideWhenUsed="1"/>
+    <w:lsdException w:name="Note Heading" w:semiHidden="1" w:unhideWhenUsed="1"/>
+    <w:lsdException w:name="Body Text 2" w:semiHidden="1" w:unhideWhenUsed="1"/>
+    <w:lsdException w:name="Body Text 3" w:semiHidden="1" w:unhideWhenUsed="1"/>
+    <w:lsdException w:name="Body Text Indent 2" w:semiHidden="1" w:unhideWhenUsed="1"/>
+    <w:lsdException w:name="Body Text Indent 3" w:semiHidden="1" w:unhideWhenUsed="1"/>
+    <w:lsdException w:name="Block Text" w:semiHidden="1" w:unhideWhenUsed="1"/>
+    <w:lsdException w:name="Hyperlink" w:semiHidden="1" w:unhideWhenUsed="1"/>
+    <w:lsdException w:name="FollowedHyperlink" w:semiHidden="1" w:unhideWhenUsed="1"/>
+    <w:lsdException w:name="Strong" w:uiPriority="22" w:qFormat="1"/>
+    <w:lsdException w:name="Emphasis" w:uiPriority="20" w:qFormat="1"/>
+    <w:lsdException w:name="Document Map" w:semiHidden="1" w:unhideWhenUsed="1"/>
+    <w:lsdException w:name="Plain Text" w:semiHidden="1" w:unhideWhenUsed="1"/>
+    <w:lsdException w:name="E-mail Signature" w:semiHidden="1" w:unhideWhenUsed="1"/>
+    <w:lsdException w:name="HTML Top of Form" w:semiHidden="1" w:unhideWhenUsed="1"/>
+    <w:lsdException w:name="HTML Bottom of Form" w:semiHidden="1" w:unhideWhenUsed="1"/>
+    <w:lsdException w:name="Normal (Web)" w:semiHidden="1" w:unhideWhenUsed="1"/>
+    <w:lsdException w:name="HTML Acronym" w:semiHidden="1" w:unhideWhenUsed="1"/>
+    <w:lsdException w:name="HTML Address" w:semiHidden="1" w:unhideWhenUsed="1"/>
+    <w:lsdException w:name="HTML Cite" w:semiHidden="1" w:unhideWhenUsed="1"/>
+    <w:lsdException w:name="HTML Code" w:semiHidden="1" w:unhideWhenUsed="1"/>
+    <w:lsdException w:name="HTML Definition" w:semiHidden="1" w:unhideWhenUsed="1"/>
+    <w:lsdException w:name="HTML Keyboard" w:semiHidden="1" w:unhideWhenUsed="1"/>
+    <w:lsdException w:name="HTML Preformatted" w:semiHidden="1" w:unhideWhenUsed="1"/>
+    <w:lsdException w:name="HTML Sample" w:semiHidden="1" w:unhideWhenUsed="1"/>
+    <w:lsdException w:name="HTML Typewriter" w:semiHidden="1" w:unhideWhenUsed="1"/>
+    <w:lsdException w:name="HTML Variable" w:semiHidden="1" w:unhideWhenUsed="1"/>
+    <w:lsdException w:name="Normal Table" w:semiHidden="1" w:unhideWhenUsed="1"/>
+    <w:lsdException w:name="annotation subject" w:semiHidden="1" w:unhideWhenUsed="1"/>
+    <w:lsdException w:name="No List" w:semiHidden="1" w:unhideWhenUsed="1"/>
+    <w:lsdException w:name="Outline List 1" w:semiHidden="1" w:unhideWhenUsed="1"/>
+    <w:lsdException w:name="Outline List 2" w:semiHidden="1" w:unhideWhenUsed="1"/>
+    <w:lsdException w:name="Outline List 3" w:semiHidden="1" w:unhideWhenUsed="1"/>
+    <w:lsdException w:name="Table Simple 1" w:semiHidden="1" w:unhideWhenUsed="1"/>
+    <w:lsdException w:name="Table Simple 2" w:semiHidden="1" w:unhideWhenUsed="1"/>
+    <w:lsdException w:name="Table Simple 3" w:semiHidden="1" w:unhideWhenUsed="1"/>
+    <w:lsdException w:name="Table Classic 1" w:semiHidden="1" w:unhideWhenUsed="1"/>
+    <w:lsdException w:name="Table Classic 2" w:semiHidden="1" w:unhideWhenUsed="1"/>
+    <w:lsdException w:name="Table Classic 3" w:semiHidden="1" w:unhideWhenUsed="1"/>
+    <w:lsdException w:name="Table Classic 4" w:semiHidden="1" w:unhideWhenUsed="1"/>
+    <w:lsdException w:name="Table Colorful 1" w:semiHidden="1" w:unhideWhenUsed="1"/>
+    <w:lsdException w:name="Table Colorful 2" w:semiHidden="1" w:unhideWhenUsed="1"/>
+    <w:lsdException w:name="Table Colorful 3" w:semiHidden="1" w:unhideWhenUsed="1"/>
+    <w:lsdException w:name="Table Columns 1" w:semiHidden="1" w:unhideWhenUsed="1"/>
+    <w:lsdException w:name="Table Columns 2" w:semiHidden="1" w:unhideWhenUsed="1"/>
+    <w:lsdException w:name="Table Columns 3" w:semiHidden="1" w:unhideWhenUsed="1"/>
+    <w:lsdException w:name="Table Columns 4" w:semiHidden="1" w:unhideWhenUsed="1"/>
+    <w:lsdException w:name="Table Columns 5" w:semiHidden="1" w:unhideWhenUsed="1"/>
+    <w:lsdException w:name="Table Grid 1" w:semiHidden="1" w:unhideWhenUsed="1"/>
+    <w:lsdException w:name="Table Grid 2" w:semiHidden="1" w:unhideWhenUsed="1"/>
+    <w:lsdException w:name="Table Grid 3" w:semiHidden="1" w:unhideWhenUsed="1"/>
+    <w:lsdException w:name="Table Grid 4" w:semiHidden="1" w:unhideWhenUsed="1"/>
+    <w:lsdException w:name="Table Grid 5" w:semiHidden="1" w:unhideWhenUsed="1"/>
+    <w:lsdException w:name="Table Grid 6" w:semiHidden="1" w:unhideWhenUsed="1"/>
+    <w:lsdException w:name="Table Grid 7" w:semiHidden="1" w:unhideWhenUsed="1"/>
+    <w:lsdException w:name="Table Grid 8" w:semiHidden="1" w:unhideWhenUsed="1"/>
+    <w:lsdException w:name="Table List 1" w:semiHidden="1" w:unhideWhenUsed="1"/>
+    <w:lsdException w:name="Table List 2" w:semiHidden="1" w:unhideWhenUsed="1"/>
+    <w:lsdException w:name="Table List 3" w:semiHidden="1" w:unhideWhenUsed="1"/>
+    <w:lsdException w:name="Table List 4" w:semiHidden="1" w:unhideWhenUsed="1"/>
+    <w:lsdException w:name="Table List 5" w:semiHidden="1" w:unhideWhenUsed="1"/>
+    <w:lsdException w:name="Table List 6" w:semiHidden="1" w:unhideWhenUsed="1"/>
+    <w:lsdException w:name="Table List 7" w:semiHidden="1" w:unhideWhenUsed="1"/>
+    <w:lsdException w:name="Table List 8" w:semiHidden="1" w:unhideWhenUsed="1"/>
+    <w:lsdException w:name="Table 3D effects 1" w:semiHidden="1" w:unhideWhenUsed="1"/>
+    <w:lsdException w:name="Table 3D effects 2" w:semiHidden="1" w:unhideWhenUsed="1"/>
+    <w:lsdException w:name="Table 3D effects 3" w:semiHidden="1" w:unhideWhenUsed="1"/>
+    <w:lsdException w:name="Table Contemporary" w:semiHidden="1" w:unhideWhenUsed="1"/>
+    <w:lsdException w:name="Table Elegant" w:semiHidden="1" w:unhideWhenUsed="1"/>
+    <w:lsdException w:name="Table Professional" w:semiHidden="1" w:unhideWhenUsed="1"/>
+    <w:lsdException w:name="Table Subtle 1" w:semiHidden="1" w:unhideWhenUsed="1"/>
+    <w:lsdException w:name="Table Subtle 2" w:semiHidden="1" w:unhideWhenUsed="1"/>
+    <w:lsdException w:name="Table Web 1" w:semiHidden="1" w:unhideWhenUsed="1"/>
+    <w:lsdException w:name="Table Web 2" w:semiHidden="1" w:unhideWhenUsed="1"/>
+    <w:lsdException w:name="Table Web 3" w:semiHidden="1" w:unhideWhenUsed="1"/>
+    <w:lsdException w:name="Balloon Text" w:semiHidden="1" w:unhideWhenUsed="1"/>
+    <w:lsdException w:name="Table Grid" w:uiPriority="59"/>
+    <w:lsdException w:name="Table Theme" w:semiHidden="1" w:unhideWhenUsed="1"/>
+    <w:lsdException w:name="Placeholder Text" w:semiHidden="1"/>
+    <w:lsdException w:name="No Spacing" w:uiPriority="1" w:qFormat="1"/>
+    <w:lsdException w:name="Light Shading" w:uiPriority="60"/>
+    <w:lsdException w:name="Light List" w:uiPriority="61"/>
+    <w:lsdException w:name="Light Grid" w:uiPriority="62"/>
+    <w:lsdException w:name="Medium Shading 1" w:uiPriority="63"/>
+    <w:lsdException w:name="Medium Shading 2" w:uiPriority="64"/>
+    <w:lsdException w:name="Medium List 1" w:uiPriority="65"/>
+    <w:lsdException w:name="Medium List 2" w:uiPriority="66"/>
+    <w:lsdException w:name="Medium Grid 1" w:uiPriority="67"/>
+    <w:lsdException w:name="Medium Grid 2" w:uiPriority="68"/>
+    <w:lsdException w:name="Medium Grid 3" w:uiPriority="69"/>
+    <w:lsdException w:name="Dark List" w:uiPriority="70"/>
+    <w:lsdException w:name="Colorful Shading" w:uiPriority="71"/>
+    <w:lsdException w:name="Colorful List" w:uiPriority="72"/>
+    <w:lsdException w:name="Colorful Grid" w:uiPriority="73"/>
+    <w:lsdException w:name="Light Shading Accent 1" w:uiPriority="60"/>
+    <w:lsdException w:name="Light List Accent 1" w:uiPriority="61"/>
+    <w:lsdException w:name="Light Grid Accent 1" w:uiPriority="62"/>
+    <w:lsdException w:name="Medium Shading 1 Accent 1" w:uiPriority="63"/>
+    <w:lsdException w:name="Medium Shading 2 Accent 1" w:uiPriority="64"/>
+    <w:lsdException w:name="Medium List 1 Accent 1" w:uiPriority="65"/>
+    <w:lsdException w:name="Revision" w:semiHidden="1"/>
+    <w:lsdException w:name="List Paragraph" w:uiPriority="34" w:qFormat="1"/>
+    <w:lsdException w:name="Quote" w:uiPriority="29" w:qFormat="1"/>
+    <w:lsdException w:name="Intense Quote" w:uiPriority="30" w:qFormat="1"/>
+    <w:lsdException w:name="Medium List 2 Accent 1" w:uiPriority="66"/>
+    <w:lsdException w:name="Medium Grid 1 Accent 1" w:uiPriority="67"/>
+    <w:lsdException w:name="Medium Grid 2 Accent 1" w:uiPriority="68"/>
+    <w:lsdException w:name="Medium Grid 3 Accent 1" w:uiPriority="69"/>
+    <w:lsdException w:name="Dark List Accent 1" w:uiPriority="70"/>
+    <w:lsdException w:name="Colorful Shading Accent 1" w:uiPriority="71"/>
+    <w:lsdException w:name="Colorful List Accent 1" w:uiPriority="72"/>
+    <w:lsdException w:name="Colorful Grid Accent 1" w:uiPriority="73"/>
+    <w:lsdException w:name="Light Shading Accent 2" w:uiPriority="60"/>
+    <w:lsdException w:name="Light List Accent 2" w:uiPriority="61"/>
+    <w:lsdException w:name="Light Grid Accent 2" w:uiPriority="62"/>
+    <w:lsdException w:name="Medium Shading 1 Accent 2" w:uiPriority="63"/>
+    <w:lsdException w:name="Medium Shading 2 Accent 2" w:uiPriority="64"/>
+    <w:lsdException w:name="Medium List 1 Accent 2" w:uiPriority="65"/>
+    <w:lsdException w:name="Medium List 2 Accent 2" w:uiPriority="66"/>
+    <w:lsdException w:name="Medium Grid 1 Accent 2" w:uiPriority="67"/>
+    <w:lsdException w:name="Medium Grid 2 Accent 2" w:uiPriority="68"/>
+    <w:lsdException w:name="Medium Grid 3 Accent 2" w:uiPriority="69"/>
+    <w:lsdException w:name="Dark List Accent 2" w:uiPriority="70"/>
+    <w:lsdException w:name="Colorful Shading Accent 2" w:uiPriority="71"/>
+    <w:lsdException w:name="Colorful List Accent 2" w:uiPriority="72"/>
+    <w:lsdException w:name="Colorful Grid Accent 2" w:uiPriority="73"/>
+    <w:lsdException w:name="Light Shading Accent 3" w:uiPriority="60"/>
+    <w:lsdException w:name="Light List Accent 3" w:uiPriority="61"/>
+    <w:lsdException w:name="Light Grid Accent 3" w:uiPriority="62"/>
+    <w:lsdException w:name="Medium Shading 1 Accent 3" w:uiPriority="63"/>
+    <w:lsdException w:name="Medium Shading 2 Accent 3" w:uiPriority="64"/>
+    <w:lsdException w:name="Medium List 1 Accent 3" w:uiPriority="65"/>
+    <w:lsdException w:name="Medium List 2 Accent 3" w:uiPriority="66"/>
+    <w:lsdException w:name="Medium Grid 1 Accent 3" w:uiPriority="67"/>
+    <w:lsdException w:name="Medium Grid 2 Accent 3" w:uiPriority="68"/>
+    <w:lsdException w:name="Medium Grid 3 Accent 3" w:uiPriority="69"/>
+    <w:lsdException w:name="Dark List Accent 3" w:uiPriority="70"/>
+    <w:lsdException w:name="Colorful Shading Accent 3" w:uiPriority="71"/>
+    <w:lsdException w:name="Colorful List Accent 3" w:uiPriority="72"/>
+    <w:lsdException w:name="Colorful Grid Accent 3" w:uiPriority="73"/>
+    <w:lsdException w:name="Light Shading Accent 4" w:uiPriority="60"/>
+    <w:lsdException w:name="Light List Accent 4" w:uiPriority="61"/>
+    <w:lsdException w:name="Light Grid Accent 4" w:uiPriority="62"/>
+    <w:lsdException w:name="Medium Shading 1 Accent 4" w:uiPriority="63"/>
+    <w:lsdException w:name="Medium Shading 2 Accent 4" w:uiPriority="64"/>
+    <w:lsdException w:name="Medium List 1 Accent 4" w:uiPriority="65"/>
+    <w:lsdException w:name="Medium List 2 Accent 4" w:uiPriority="66"/>
+    <w:lsdException w:name="Medium Grid 1 Accent 4" w:uiPriority="67"/>
+    <w:lsdException w:name="Medium Grid 2 Accent 4" w:uiPriority="68"/>
+    <w:lsdException w:name="Medium Grid 3 Accent 4" w:uiPriority="69"/>
+    <w:lsdException w:name="Dark List Accent 4" w:uiPriority="70"/>
+    <w:lsdException w:name="Colorful Shading Accent 4" w:uiPriority="71"/>
+    <w:lsdException w:name="Colorful List Accent 4" w:uiPriority="72"/>
+    <w:lsdException w:name="Colorful Grid Accent 4" w:uiPriority="73"/>
+    <w:lsdException w:name="Light Shading Accent 5" w:uiPriority="60"/>
+    <w:lsdException w:name="Light List Accent 5" w:uiPriority="61"/>
+    <w:lsdException w:name="Light Grid Accent 5" w:uiPriority="62"/>
+    <w:lsdException w:name="Medium Shading 1 Accent 5" w:uiPriority="63"/>
+    <w:lsdException w:name="Medium Shading 2 Accent 5" w:uiPriority="64"/>
+    <w:lsdException w:name="Medium List 1 Accent 5" w:uiPriority="65"/>
+    <w:lsdException w:name="Medium List 2 Accent 5" w:uiPriority="66"/>
+    <w:lsdException w:name="Medium Grid 1 Accent 5" w:uiPriority="67"/>
+    <w:lsdException w:name="Medium Grid 2 Accent 5" w:uiPriority="68"/>
+    <w:lsdException w:name="Medium Grid 3 Accent 5" w:uiPriority="69"/>
+    <w:lsdException w:name="Dark List Accent 5" w:uiPriority="70"/>
+    <w:lsdException w:name="Colorful Shading Accent 5" w:uiPriority="71"/>
+    <w:lsdException w:name="Colorful List Accent 5" w:uiPriority="72"/>
+    <w:lsdException w:name="Colorful Grid Accent 5" w:uiPriority="73"/>
+    <w:lsdException w:name="Light Shading Accent 6" w:uiPriority="60"/>
+    <w:lsdException w:name="Light List Accent 6" w:uiPriority="61"/>
+    <w:lsdException w:name="Light Grid Accent 6" w:uiPriority="62"/>
+    <w:lsdException w:name="Medium Shading 1 Accent 6" w:uiPriority="63"/>
+    <w:lsdException w:name="Medium Shading 2 Accent 6" w:uiPriority="64"/>
+    <w:lsdException w:name="Medium List 1 Accent 6" w:uiPriority="65"/>
+    <w:lsdException w:name="Medium List 2 Accent 6" w:uiPriority="66"/>
+    <w:lsdException w:name="Medium Grid 1 Accent 6" w:uiPriority="67"/>
+    <w:lsdException w:name="Medium Grid 2 Accent 6" w:uiPriority="68"/>
+    <w:lsdException w:name="Medium Grid 3 Accent 6" w:uiPriority="69"/>
+    <w:lsdException w:name="Dark List Accent 6" w:uiPriority="70"/>
+    <w:lsdException w:name="Colorful Shading Accent 6" w:uiPriority="71"/>
+    <w:lsdException w:name="Colorful List Accent 6" w:uiPriority="72"/>
+    <w:lsdException w:name="Colorful Grid Accent 6" w:uiPriority="73"/>
+    <w:lsdException w:name="Subtle Emphasis" w:uiPriority="19" w:qFormat="1"/>
+    <w:lsdException w:name="Intense Emphasis" w:uiPriority="21" w:qFormat="1"/>
+    <w:lsdException w:name="Subtle Reference" w:uiPriority="31" w:qFormat="1"/>
+    <w:lsdException w:name="Intense Reference" w:uiPriority="32" w:qFormat="1"/>
+    <w:lsdException w:name="Book Title" w:uiPriority="33" w:qFormat="1"/>
+    <w:lsdException w:name="Bibliography" w:semiHidden="1" w:uiPriority="37" w:unhideWhenUsed="1"/>
+    <w:lsdException w:name="TOC Heading" w:semiHidden="1" w:uiPriority="39" w:unhideWhenUsed="1" w:qFormat="1"/>
+    <w:lsdException w:name="Plain Table 1" w:uiPriority="41"/>
+    <w:lsdException w:name="Plain Table 2" w:uiPriority="42"/>
+    <w:lsdException w:name="Plain Table 3" w:uiPriority="43"/>
+    <w:lsdException w:name="Plain Table 4" w:uiPriority="44"/>
+    <w:lsdException w:name="Plain Table 5" w:uiPriority="45"/>
+    <w:lsdException w:name="Grid Table Light" w:uiPriority="40"/>
+    <w:lsdException w:name="Grid Table 1 Light" w:uiPriority="46"/>
+    <w:lsdException w:name="Grid Table 2" w:uiPriority="47"/>
+    <w:lsdException w:name="Grid Table 3" w:uiPriority="48"/>
+    <w:lsdException w:name="Grid Table 4" w:uiPriority="49"/>
+    <w:lsdException w:name="Grid Table 5 Dark" w:uiPriority="50"/>
+    <w:lsdException w:name="Grid Table 6 Colorful" w:uiPriority="51"/>
+    <w:lsdException w:name="Grid Table 7 Colorful" w:uiPriority="52"/>
+    <w:lsdException w:name="Grid Table 1 Light Accent 1" w:uiPriority="46"/>
+    <w:lsdException w:name="Grid Table 2 Accent 1" w:uiPriority="47"/>
+    <w:lsdException w:name="Grid Table 3 Accent 1" w:uiPriority="48"/>
+    <w:lsdException w:name="Grid Table 4 Accent 1" w:uiPriority="49"/>
+    <w:lsdException w:name="Grid Table 5 Dark Accent 1" w:uiPriority="50"/>
+    <w:lsdException w:name="Grid Table 6 Colorful Accent 1" w:uiPriority="51"/>
+    <w:lsdException w:name="Grid Table 7 Colorful Accent 1" w:uiPriority="52"/>
+    <w:lsdException w:name="Grid Table 1 Light Accent 2" w:uiPriority="46"/>
+    <w:lsdException w:name="Grid Table 2 Accent 2" w:uiPriority="47"/>
+    <w:lsdException w:name="Grid Table 3 Accent 2" w:uiPriority="48"/>
+    <w:lsdException w:name="Grid Table 4 Accent 2" w:uiPriority="49"/>
+    <w:lsdException w:name="Grid Table 5 Dark Accent 2" w:uiPriority="50"/>
+    <w:lsdException w:name="Grid Table 6 Colorful Accent 2" w:uiPriority="51"/>
+    <w:lsdException w:name="Grid Table 7 Colorful Accent 2" w:uiPriority="52"/>
+    <w:lsdException w:name="Grid Table 1 Light Accent 3" w:uiPriority="46"/>
+    <w:lsdException w:name="Grid Table 2 Accent 3" w:uiPriority="47"/>
+    <w:lsdException w:name="Grid Table 3 Accent 3" w:uiPriority="48"/>
+    <w:lsdException w:name="Grid Table 4 Accent 3" w:uiPriority="49"/>
+    <w:lsdException w:name="Grid Table 5 Dark Accent 3" w:uiPriority="50"/>
+    <w:lsdException w:name="Grid Table 6 Colorful Accent 3" w:uiPriority="51"/>
+    <w:lsdException w:name="Grid Table 7 Colorful Accent 3" w:uiPriority="52"/>
+    <w:lsdException w:name="Grid Table 1 Light Accent 4" w:uiPriority="46"/>
+    <w:lsdException w:name="Grid Table 2 Accent 4" w:uiPriority="47"/>
+    <w:lsdException w:name="Grid Table 3 Accent 4" w:uiPriority="48"/>
+    <w:lsdException w:name="Grid Table 4 Accent 4" w:uiPriority="49"/>
+    <w:lsdException w:name="Grid Table 5 Dark Accent 4" w:uiPriority="50"/>
+    <w:lsdException w:name="Grid Table 6 Colorful Accent 4" w:uiPriority="51"/>
+    <w:lsdException w:name="Grid Table 7 Colorful Accent 4" w:uiPriority="52"/>
+    <w:lsdException w:name="Grid Table 1 Light Accent 5" w:uiPriority="46"/>
+    <w:lsdException w:name="Grid Table 2 Accent 5" w:uiPriority="47"/>
+    <w:lsdException w:name="Grid Table 3 Accent 5" w:uiPriority="48"/>
+    <w:lsdException w:name="Grid Table 4 Accent 5" w:uiPriority="49"/>
+    <w:lsdException w:name="Grid Table 5 Dark Accent 5" w:uiPriority="50"/>
+    <w:lsdException w:name="Grid Table 6 Colorful Accent 5" w:uiPriority="51"/>
+    <w:lsdException w:name="Grid Table 7 Colorful Accent 5" w:uiPriority="52"/>
+    <w:lsdException w:name="Grid Table 1 Light Accent 6" w:uiPriority="46"/>
+    <w:lsdException w:name="Grid Table 2 Accent 6" w:uiPriority="47"/>
+    <w:lsdException w:name="Grid Table 3 Accent 6" w:uiPriority="48"/>
+    <w:lsdException w:name="Grid Table 4 Accent 6" w:uiPriority="49"/>
+    <w:lsdException w:name="Grid Table 5 Dark Accent 6" w:uiPriority="50"/>
+    <w:lsdException w:name="Grid Table 6 Colorful Accent 6" w:uiPriority="51"/>
+    <w:lsdException w:name="Grid Table 7 Colorful Accent 6" w:uiPriority="52"/>
+    <w:lsdException w:name="List Table 1 Light" w:uiPriority="46"/>
+    <w:lsdException w:name="List Table 2" w:uiPriority="47"/>
+    <w:lsdException w:name="List Table 3" w:uiPriority="48"/>
+    <w:lsdException w:name="List Table 4" w:uiPriority="49"/>
+    <w:lsdException w:name="List Table 5 Dark" w:uiPriority="50"/>
+    <w:lsdException w:name="List Table 6 Colorful" w:uiPriority="51"/>
+    <w:lsdException w:name="List Table 7 Colorful" w:uiPriority="52"/>
+    <w:lsdException w:name="List Table 1 Light Accent 1" w:uiPriority="46"/>
+    <w:lsdException w:name="List Table 2 Accent 1" w:uiPriority="47"/>
+    <w:lsdException w:name="List Table 3 Accent 1" w:uiPriority="48"/>
+    <w:lsdException w:name="List Table 4 Accent 1" w:uiPriority="49"/>
+    <w:lsdException w:name="List Table 5 Dark Accent 1" w:uiPriority="50"/>
+    <w:lsdException w:name="List Table 6 Colorful Accent 1" w:uiPriority="51"/>
+    <w:lsdException w:name="List Table 7 Colorful Accent 1" w:uiPriority="52"/>
+    <w:lsdException w:name="List Table 1 Light Accent 2" w:uiPriority="46"/>
+    <w:lsdException w:name="List Table 2 Accent 2" w:uiPriority="47"/>
+    <w:lsdException w:name="List Table 3 Accent 2" w:uiPriority="48"/>
+    <w:lsdException w:name="List Table 4 Accent 2" w:uiPriority="49"/>
+    <w:lsdException w:name="List Table 5 Dark Accent 2" w:uiPriority="50"/>
+    <w:lsdException w:name="List Table 6 Colorful Accent 2" w:uiPriority="51"/>
+    <w:lsdException w:name="List Table 7 Colorful Accent 2" w:uiPriority="52"/>
+    <w:lsdException w:name="List Table 1 Light Accent 3" w:uiPriority="46"/>
+    <w:lsdException w:name="List Table 2 Accent 3" w:uiPriority="47"/>
+    <w:lsdException w:name="List Table 3 Accent 3" w:uiPriority="48"/>
+    <w:lsdException w:name="List Table 4 Accent 3" w:uiPriority="49"/>
+    <w:lsdException w:name="List Table 5 Dark Accent 3" w:uiPriority="50"/>
+    <w:lsdException w:name="List Table 6 Colorful Accent 3" w:uiPriority="51"/>
+    <w:lsdException w:name="List Table 7 Colorful Accent 3" w:uiPriority="52"/>
+    <w:lsdException w:name="List Table 1 Light Accent 4" w:uiPriority="46"/>
+    <w:lsdException w:name="List Table 2 Accent 4" w:uiPriority="47"/>
+    <w:lsdException w:name="List Table 3 Accent 4" w:uiPriority="48"/>
+    <w:lsdException w:name="List Table 4 Accent 4" w:uiPriority="49"/>
+    <w:lsdException w:name="List Table 5 Dark Accent 4" w:uiPriority="50"/>
+    <w:lsdException w:name="List Table 6 Colorful Accent 4" w:uiPriority="51"/>
+    <w:lsdException w:name="List Table 7 Colorful Accent 4" w:uiPriority="52"/>
+    <w:lsdException w:name="List Table 1 Light Accent 5" w:uiPriority="46"/>
+    <w:lsdException w:name="List Table 2 Accent 5" w:uiPriority="47"/>
+    <w:lsdException w:name="List Table 3 Accent 5" w:uiPriority="48"/>
+    <w:lsdException w:name="List Table 4 Accent 5" w:uiPriority="49"/>
+    <w:lsdException w:name="List Table 5 Dark Accent 5" w:uiPriority="50"/>
+    <w:lsdException w:name="List Table 6 Colorful Accent 5" w:uiPriority="51"/>
+    <w:lsdException w:name="List Table 7 Colorful Accent 5" w:uiPriority="52"/>
+    <w:lsdException w:name="List Table 1 Light Accent 6" w:uiPriority="46"/>
+    <w:lsdException w:name="List Table 2 Accent 6" w:uiPriority="47"/>
+    <w:lsdException w:name="List Table 3 Accent 6" w:uiPriority="48"/>
+    <w:lsdException w:name="List Table 4 Accent 6" w:uiPriority="49"/>
+    <w:lsdException w:name="List Table 5 Dark Accent 6" w:uiPriority="50"/>
+    <w:lsdException w:name="List Table 6 Colorful Accent 6" w:uiPriority="51"/>
+    <w:lsdException w:name="List Table 7 Colorful Accent 6" w:uiPriority="52"/>
+    <w:lsdException w:name="Mention" w:semiHidden="1" w:unhideWhenUsed="1"/>
+    <w:lsdException w:name="Smart Hyperlink" w:semiHidden="1" w:unhideWhenUsed="1"/>
+    <w:lsdException w:name="Hashtag" w:semiHidden="1" w:unhideWhenUsed="1"/>
+    <w:lsdException w:name="Unresolved Mention" w:semiHidden="1" w:unhideWhenUsed="1"/>
   </w:latentStyles>
   <w:style w:type="paragraph" w:default="1" w:styleId="a">
     <w:name w:val="Normal"/>
@@ -3488,208 +3439,8 @@
 </w:styles>
 </file>
 
-<file path=word/glossary/stylesWithEffects.xml><?xml version="1.0" encoding="utf-8"?>
-<w:styles xmlns:wpc="http://schemas.microsoft.com/office/word/2010/wordprocessingCanvas" xmlns:mc="http://schemas.openxmlformats.org/markup-compatibility/2006" xmlns:o="urn:schemas-microsoft-com:office:office" xmlns:r="http://schemas.openxmlformats.org/officeDocument/2006/relationships" xmlns:m="http://schemas.openxmlformats.org/officeDocument/2006/math" xmlns:v="urn:schemas-microsoft-com:vml" xmlns:wp14="http://schemas.microsoft.com/office/word/2010/wordprocessingDrawing" xmlns:wp="http://schemas.openxmlformats.org/drawingml/2006/wordprocessingDrawing" xmlns:w10="urn:schemas-microsoft-com:office:word" xmlns:w="http://schemas.openxmlformats.org/wordprocessingml/2006/main" xmlns:w14="http://schemas.microsoft.com/office/word/2010/wordml" xmlns:wpg="http://schemas.microsoft.com/office/word/2010/wordprocessingGroup" xmlns:wpi="http://schemas.microsoft.com/office/word/2010/wordprocessingInk" xmlns:wne="http://schemas.microsoft.com/office/word/2006/wordml" xmlns:wps="http://schemas.microsoft.com/office/word/2010/wordprocessingShape" mc:Ignorable="w14 wp14">
-  <w:docDefaults>
-    <w:rPrDefault>
-      <w:rPr>
-        <w:rFonts w:asciiTheme="minorHAnsi" w:eastAsiaTheme="minorEastAsia" w:hAnsiTheme="minorHAnsi" w:cstheme="minorBidi"/>
-        <w:sz w:val="22"/>
-        <w:szCs w:val="22"/>
-        <w:lang w:val="ru-RU" w:eastAsia="ru-RU" w:bidi="ar-SA"/>
-      </w:rPr>
-    </w:rPrDefault>
-    <w:pPrDefault>
-      <w:pPr>
-        <w:spacing w:after="200" w:line="276" w:lineRule="auto"/>
-      </w:pPr>
-    </w:pPrDefault>
-  </w:docDefaults>
-  <w:latentStyles w:defLockedState="0" w:defUIPriority="99" w:defSemiHidden="1" w:defUnhideWhenUsed="1" w:defQFormat="0" w:count="267">
-    <w:lsdException w:name="Normal" w:semiHidden="0" w:uiPriority="0" w:unhideWhenUsed="0" w:qFormat="1"/>
-    <w:lsdException w:name="heading 1" w:semiHidden="0" w:uiPriority="9" w:unhideWhenUsed="0" w:qFormat="1"/>
-    <w:lsdException w:name="heading 2" w:uiPriority="9" w:qFormat="1"/>
-    <w:lsdException w:name="heading 3" w:uiPriority="9" w:qFormat="1"/>
-    <w:lsdException w:name="heading 4" w:uiPriority="9" w:qFormat="1"/>
-    <w:lsdException w:name="heading 5" w:uiPriority="9" w:qFormat="1"/>
-    <w:lsdException w:name="heading 6" w:uiPriority="9" w:qFormat="1"/>
-    <w:lsdException w:name="heading 7" w:uiPriority="9" w:qFormat="1"/>
-    <w:lsdException w:name="heading 8" w:uiPriority="9" w:qFormat="1"/>
-    <w:lsdException w:name="heading 9" w:uiPriority="9" w:qFormat="1"/>
-    <w:lsdException w:name="toc 1" w:uiPriority="39"/>
-    <w:lsdException w:name="toc 2" w:uiPriority="39"/>
-    <w:lsdException w:name="toc 3" w:uiPriority="39"/>
-    <w:lsdException w:name="toc 4" w:uiPriority="39"/>
-    <w:lsdException w:name="toc 5" w:uiPriority="39"/>
-    <w:lsdException w:name="toc 6" w:uiPriority="39"/>
-    <w:lsdException w:name="toc 7" w:uiPriority="39"/>
-    <w:lsdException w:name="toc 8" w:uiPriority="39"/>
-    <w:lsdException w:name="toc 9" w:uiPriority="39"/>
-    <w:lsdException w:name="caption" w:uiPriority="35" w:qFormat="1"/>
-    <w:lsdException w:name="Title" w:semiHidden="0" w:uiPriority="10" w:unhideWhenUsed="0" w:qFormat="1"/>
-    <w:lsdException w:name="Default Paragraph Font" w:uiPriority="1"/>
-    <w:lsdException w:name="Subtitle" w:semiHidden="0" w:uiPriority="11" w:unhideWhenUsed="0" w:qFormat="1"/>
-    <w:lsdException w:name="Strong" w:semiHidden="0" w:uiPriority="22" w:unhideWhenUsed="0" w:qFormat="1"/>
-    <w:lsdException w:name="Emphasis" w:semiHidden="0" w:uiPriority="20" w:unhideWhenUsed="0" w:qFormat="1"/>
-    <w:lsdException w:name="Table Grid" w:semiHidden="0" w:uiPriority="59" w:unhideWhenUsed="0"/>
-    <w:lsdException w:name="Placeholder Text" w:unhideWhenUsed="0"/>
-    <w:lsdException w:name="No Spacing" w:semiHidden="0" w:uiPriority="1" w:unhideWhenUsed="0" w:qFormat="1"/>
-    <w:lsdException w:name="Light Shading" w:semiHidden="0" w:uiPriority="60" w:unhideWhenUsed="0"/>
-    <w:lsdException w:name="Light List" w:semiHidden="0" w:uiPriority="61" w:unhideWhenUsed="0"/>
-    <w:lsdException w:name="Light Grid" w:semiHidden="0" w:uiPriority="62" w:unhideWhenUsed="0"/>
-    <w:lsdException w:name="Medium Shading 1" w:semiHidden="0" w:uiPriority="63" w:unhideWhenUsed="0"/>
-    <w:lsdException w:name="Medium Shading 2" w:semiHidden="0" w:uiPriority="64" w:unhideWhenUsed="0"/>
-    <w:lsdException w:name="Medium List 1" w:semiHidden="0" w:uiPriority="65" w:unhideWhenUsed="0"/>
-    <w:lsdException w:name="Medium List 2" w:semiHidden="0" w:uiPriority="66" w:unhideWhenUsed="0"/>
-    <w:lsdException w:name="Medium Grid 1" w:semiHidden="0" w:uiPriority="67" w:unhideWhenUsed="0"/>
-    <w:lsdException w:name="Medium Grid 2" w:semiHidden="0" w:uiPriority="68" w:unhideWhenUsed="0"/>
-    <w:lsdException w:name="Medium Grid 3" w:semiHidden="0" w:uiPriority="69" w:unhideWhenUsed="0"/>
-    <w:lsdException w:name="Dark List" w:semiHidden="0" w:uiPriority="70" w:unhideWhenUsed="0"/>
-    <w:lsdException w:name="Colorful Shading" w:semiHidden="0" w:uiPriority="71" w:unhideWhenUsed="0"/>
-    <w:lsdException w:name="Colorful List" w:semiHidden="0" w:uiPriority="72" w:unhideWhenUsed="0"/>
-    <w:lsdException w:name="Colorful Grid" w:semiHidden="0" w:uiPriority="73" w:unhideWhenUsed="0"/>
-    <w:lsdException w:name="Light Shading Accent 1" w:semiHidden="0" w:uiPriority="60" w:unhideWhenUsed="0"/>
-    <w:lsdException w:name="Light List Accent 1" w:semiHidden="0" w:uiPriority="61" w:unhideWhenUsed="0"/>
-    <w:lsdException w:name="Light Grid Accent 1" w:semiHidden="0" w:uiPriority="62" w:unhideWhenUsed="0"/>
-    <w:lsdException w:name="Medium Shading 1 Accent 1" w:semiHidden="0" w:uiPriority="63" w:unhideWhenUsed="0"/>
-    <w:lsdException w:name="Medium Shading 2 Accent 1" w:semiHidden="0" w:uiPriority="64" w:unhideWhenUsed="0"/>
-    <w:lsdException w:name="Medium List 1 Accent 1" w:semiHidden="0" w:uiPriority="65" w:unhideWhenUsed="0"/>
-    <w:lsdException w:name="Revision" w:unhideWhenUsed="0"/>
-    <w:lsdException w:name="List Paragraph" w:semiHidden="0" w:uiPriority="34" w:unhideWhenUsed="0" w:qFormat="1"/>
-    <w:lsdException w:name="Quote" w:semiHidden="0" w:uiPriority="29" w:unhideWhenUsed="0" w:qFormat="1"/>
-    <w:lsdException w:name="Intense Quote" w:semiHidden="0" w:uiPriority="30" w:unhideWhenUsed="0" w:qFormat="1"/>
-    <w:lsdException w:name="Medium List 2 Accent 1" w:semiHidden="0" w:uiPriority="66" w:unhideWhenUsed="0"/>
-    <w:lsdException w:name="Medium Grid 1 Accent 1" w:semiHidden="0" w:uiPriority="67" w:unhideWhenUsed="0"/>
-    <w:lsdException w:name="Medium Grid 2 Accent 1" w:semiHidden="0" w:uiPriority="68" w:unhideWhenUsed="0"/>
-    <w:lsdException w:name="Medium Grid 3 Accent 1" w:semiHidden="0" w:uiPriority="69" w:unhideWhenUsed="0"/>
-    <w:lsdException w:name="Dark List Accent 1" w:semiHidden="0" w:uiPriority="70" w:unhideWhenUsed="0"/>
-    <w:lsdException w:name="Colorful Shading Accent 1" w:semiHidden="0" w:uiPriority="71" w:unhideWhenUsed="0"/>
-    <w:lsdException w:name="Colorful List Accent 1" w:semiHidden="0" w:uiPriority="72" w:unhideWhenUsed="0"/>
-    <w:lsdException w:name="Colorful Grid Accent 1" w:semiHidden="0" w:uiPriority="73" w:unhideWhenUsed="0"/>
-    <w:lsdException w:name="Light Shading Accent 2" w:semiHidden="0" w:uiPriority="60" w:unhideWhenUsed="0"/>
-    <w:lsdException w:name="Light List Accent 2" w:semiHidden="0" w:uiPriority="61" w:unhideWhenUsed="0"/>
-    <w:lsdException w:name="Light Grid Accent 2" w:semiHidden="0" w:uiPriority="62" w:unhideWhenUsed="0"/>
-    <w:lsdException w:name="Medium Shading 1 Accent 2" w:semiHidden="0" w:uiPriority="63" w:unhideWhenUsed="0"/>
-    <w:lsdException w:name="Medium Shading 2 Accent 2" w:semiHidden="0" w:uiPriority="64" w:unhideWhenUsed="0"/>
-    <w:lsdException w:name="Medium List 1 Accent 2" w:semiHidden="0" w:uiPriority="65" w:unhideWhenUsed="0"/>
-    <w:lsdException w:name="Medium List 2 Accent 2" w:semiHidden="0" w:uiPriority="66" w:unhideWhenUsed="0"/>
-    <w:lsdException w:name="Medium Grid 1 Accent 2" w:semiHidden="0" w:uiPriority="67" w:unhideWhenUsed="0"/>
-    <w:lsdException w:name="Medium Grid 2 Accent 2" w:semiHidden="0" w:uiPriority="68" w:unhideWhenUsed="0"/>
-    <w:lsdException w:name="Medium Grid 3 Accent 2" w:semiHidden="0" w:uiPriority="69" w:unhideWhenUsed="0"/>
-    <w:lsdException w:name="Dark List Accent 2" w:semiHidden="0" w:uiPriority="70" w:unhideWhenUsed="0"/>
-    <w:lsdException w:name="Colorful Shading Accent 2" w:semiHidden="0" w:uiPriority="71" w:unhideWhenUsed="0"/>
-    <w:lsdException w:name="Colorful List Accent 2" w:semiHidden="0" w:uiPriority="72" w:unhideWhenUsed="0"/>
-    <w:lsdException w:name="Colorful Grid Accent 2" w:semiHidden="0" w:uiPriority="73" w:unhideWhenUsed="0"/>
-    <w:lsdException w:name="Light Shading Accent 3" w:semiHidden="0" w:uiPriority="60" w:unhideWhenUsed="0"/>
-    <w:lsdException w:name="Light List Accent 3" w:semiHidden="0" w:uiPriority="61" w:unhideWhenUsed="0"/>
-    <w:lsdException w:name="Light Grid Accent 3" w:semiHidden="0" w:uiPriority="62" w:unhideWhenUsed="0"/>
-    <w:lsdException w:name="Medium Shading 1 Accent 3" w:semiHidden="0" w:uiPriority="63" w:unhideWhenUsed="0"/>
-    <w:lsdException w:name="Medium Shading 2 Accent 3" w:semiHidden="0" w:uiPriority="64" w:unhideWhenUsed="0"/>
-    <w:lsdException w:name="Medium List 1 Accent 3" w:semiHidden="0" w:uiPriority="65" w:unhideWhenUsed="0"/>
-    <w:lsdException w:name="Medium List 2 Accent 3" w:semiHidden="0" w:uiPriority="66" w:unhideWhenUsed="0"/>
-    <w:lsdException w:name="Medium Grid 1 Accent 3" w:semiHidden="0" w:uiPriority="67" w:unhideWhenUsed="0"/>
-    <w:lsdException w:name="Medium Grid 2 Accent 3" w:semiHidden="0" w:uiPriority="68" w:unhideWhenUsed="0"/>
-    <w:lsdException w:name="Medium Grid 3 Accent 3" w:semiHidden="0" w:uiPriority="69" w:unhideWhenUsed="0"/>
-    <w:lsdException w:name="Dark List Accent 3" w:semiHidden="0" w:uiPriority="70" w:unhideWhenUsed="0"/>
-    <w:lsdException w:name="Colorful Shading Accent 3" w:semiHidden="0" w:uiPriority="71" w:unhideWhenUsed="0"/>
-    <w:lsdException w:name="Colorful List Accent 3" w:semiHidden="0" w:uiPriority="72" w:unhideWhenUsed="0"/>
-    <w:lsdException w:name="Colorful Grid Accent 3" w:semiHidden="0" w:uiPriority="73" w:unhideWhenUsed="0"/>
-    <w:lsdException w:name="Light Shading Accent 4" w:semiHidden="0" w:uiPriority="60" w:unhideWhenUsed="0"/>
-    <w:lsdException w:name="Light List Accent 4" w:semiHidden="0" w:uiPriority="61" w:unhideWhenUsed="0"/>
-    <w:lsdException w:name="Light Grid Accent 4" w:semiHidden="0" w:uiPriority="62" w:unhideWhenUsed="0"/>
-    <w:lsdException w:name="Medium Shading 1 Accent 4" w:semiHidden="0" w:uiPriority="63" w:unhideWhenUsed="0"/>
-    <w:lsdException w:name="Medium Shading 2 Accent 4" w:semiHidden="0" w:uiPriority="64" w:unhideWhenUsed="0"/>
-    <w:lsdException w:name="Medium List 1 Accent 4" w:semiHidden="0" w:uiPriority="65" w:unhideWhenUsed="0"/>
-    <w:lsdException w:name="Medium List 2 Accent 4" w:semiHidden="0" w:uiPriority="66" w:unhideWhenUsed="0"/>
-    <w:lsdException w:name="Medium Grid 1 Accent 4" w:semiHidden="0" w:uiPriority="67" w:unhideWhenUsed="0"/>
-    <w:lsdException w:name="Medium Grid 2 Accent 4" w:semiHidden="0" w:uiPriority="68" w:unhideWhenUsed="0"/>
-    <w:lsdException w:name="Medium Grid 3 Accent 4" w:semiHidden="0" w:uiPriority="69" w:unhideWhenUsed="0"/>
-    <w:lsdException w:name="Dark List Accent 4" w:semiHidden="0" w:uiPriority="70" w:unhideWhenUsed="0"/>
-    <w:lsdException w:name="Colorful Shading Accent 4" w:semiHidden="0" w:uiPriority="71" w:unhideWhenUsed="0"/>
-    <w:lsdException w:name="Colorful List Accent 4" w:semiHidden="0" w:uiPriority="72" w:unhideWhenUsed="0"/>
-    <w:lsdException w:name="Colorful Grid Accent 4" w:semiHidden="0" w:uiPriority="73" w:unhideWhenUsed="0"/>
-    <w:lsdException w:name="Light Shading Accent 5" w:semiHidden="0" w:uiPriority="60" w:unhideWhenUsed="0"/>
-    <w:lsdException w:name="Light List Accent 5" w:semiHidden="0" w:uiPriority="61" w:unhideWhenUsed="0"/>
-    <w:lsdException w:name="Light Grid Accent 5" w:semiHidden="0" w:uiPriority="62" w:unhideWhenUsed="0"/>
-    <w:lsdException w:name="Medium Shading 1 Accent 5" w:semiHidden="0" w:uiPriority="63" w:unhideWhenUsed="0"/>
-    <w:lsdException w:name="Medium Shading 2 Accent 5" w:semiHidden="0" w:uiPriority="64" w:unhideWhenUsed="0"/>
-    <w:lsdException w:name="Medium List 1 Accent 5" w:semiHidden="0" w:uiPriority="65" w:unhideWhenUsed="0"/>
-    <w:lsdException w:name="Medium List 2 Accent 5" w:semiHidden="0" w:uiPriority="66" w:unhideWhenUsed="0"/>
-    <w:lsdException w:name="Medium Grid 1 Accent 5" w:semiHidden="0" w:uiPriority="67" w:unhideWhenUsed="0"/>
-    <w:lsdException w:name="Medium Grid 2 Accent 5" w:semiHidden="0" w:uiPriority="68" w:unhideWhenUsed="0"/>
-    <w:lsdException w:name="Medium Grid 3 Accent 5" w:semiHidden="0" w:uiPriority="69" w:unhideWhenUsed="0"/>
-    <w:lsdException w:name="Dark List Accent 5" w:semiHidden="0" w:uiPriority="70" w:unhideWhenUsed="0"/>
-    <w:lsdException w:name="Colorful Shading Accent 5" w:semiHidden="0" w:uiPriority="71" w:unhideWhenUsed="0"/>
-    <w:lsdException w:name="Colorful List Accent 5" w:semiHidden="0" w:uiPriority="72" w:unhideWhenUsed="0"/>
-    <w:lsdException w:name="Colorful Grid Accent 5" w:semiHidden="0" w:uiPriority="73" w:unhideWhenUsed="0"/>
-    <w:lsdException w:name="Light Shading Accent 6" w:semiHidden="0" w:uiPriority="60" w:unhideWhenUsed="0"/>
-    <w:lsdException w:name="Light List Accent 6" w:semiHidden="0" w:uiPriority="61" w:unhideWhenUsed="0"/>
-    <w:lsdException w:name="Light Grid Accent 6" w:semiHidden="0" w:uiPriority="62" w:unhideWhenUsed="0"/>
-    <w:lsdException w:name="Medium Shading 1 Accent 6" w:semiHidden="0" w:uiPriority="63" w:unhideWhenUsed="0"/>
-    <w:lsdException w:name="Medium Shading 2 Accent 6" w:semiHidden="0" w:uiPriority="64" w:unhideWhenUsed="0"/>
-    <w:lsdException w:name="Medium List 1 Accent 6" w:semiHidden="0" w:uiPriority="65" w:unhideWhenUsed="0"/>
-    <w:lsdException w:name="Medium List 2 Accent 6" w:semiHidden="0" w:uiPriority="66" w:unhideWhenUsed="0"/>
-    <w:lsdException w:name="Medium Grid 1 Accent 6" w:semiHidden="0" w:uiPriority="67" w:unhideWhenUsed="0"/>
-    <w:lsdException w:name="Medium Grid 2 Accent 6" w:semiHidden="0" w:uiPriority="68" w:unhideWhenUsed="0"/>
-    <w:lsdException w:name="Medium Grid 3 Accent 6" w:semiHidden="0" w:uiPriority="69" w:unhideWhenUsed="0"/>
-    <w:lsdException w:name="Dark List Accent 6" w:semiHidden="0" w:uiPriority="70" w:unhideWhenUsed="0"/>
-    <w:lsdException w:name="Colorful Shading Accent 6" w:semiHidden="0" w:uiPriority="71" w:unhideWhenUsed="0"/>
-    <w:lsdException w:name="Colorful List Accent 6" w:semiHidden="0" w:uiPriority="72" w:unhideWhenUsed="0"/>
-    <w:lsdException w:name="Colorful Grid Accent 6" w:semiHidden="0" w:uiPriority="73" w:unhideWhenUsed="0"/>
-    <w:lsdException w:name="Subtle Emphasis" w:semiHidden="0" w:uiPriority="19" w:unhideWhenUsed="0" w:qFormat="1"/>
-    <w:lsdException w:name="Intense Emphasis" w:semiHidden="0" w:uiPriority="21" w:unhideWhenUsed="0" w:qFormat="1"/>
-    <w:lsdException w:name="Subtle Reference" w:semiHidden="0" w:uiPriority="31" w:unhideWhenUsed="0" w:qFormat="1"/>
-    <w:lsdException w:name="Intense Reference" w:semiHidden="0" w:uiPriority="32" w:unhideWhenUsed="0" w:qFormat="1"/>
-    <w:lsdException w:name="Book Title" w:semiHidden="0" w:uiPriority="33" w:unhideWhenUsed="0" w:qFormat="1"/>
-    <w:lsdException w:name="Bibliography" w:uiPriority="37"/>
-    <w:lsdException w:name="TOC Heading" w:uiPriority="39" w:qFormat="1"/>
-  </w:latentStyles>
-  <w:style w:type="paragraph" w:default="1" w:styleId="a">
-    <w:name w:val="Normal"/>
-    <w:qFormat/>
-  </w:style>
-  <w:style w:type="character" w:default="1" w:styleId="a0">
-    <w:name w:val="Default Paragraph Font"/>
-    <w:uiPriority w:val="1"/>
-    <w:semiHidden/>
-    <w:unhideWhenUsed/>
-  </w:style>
-  <w:style w:type="table" w:default="1" w:styleId="a1">
-    <w:name w:val="Normal Table"/>
-    <w:uiPriority w:val="99"/>
-    <w:semiHidden/>
-    <w:unhideWhenUsed/>
-    <w:tblPr>
-      <w:tblInd w:w="0" w:type="dxa"/>
-      <w:tblCellMar>
-        <w:top w:w="0" w:type="dxa"/>
-        <w:left w:w="108" w:type="dxa"/>
-        <w:bottom w:w="0" w:type="dxa"/>
-        <w:right w:w="108" w:type="dxa"/>
-      </w:tblCellMar>
-    </w:tblPr>
-  </w:style>
-  <w:style w:type="numbering" w:default="1" w:styleId="a2">
-    <w:name w:val="No List"/>
-    <w:uiPriority w:val="99"/>
-    <w:semiHidden/>
-    <w:unhideWhenUsed/>
-  </w:style>
-  <w:style w:type="character" w:styleId="a3">
-    <w:name w:val="Placeholder Text"/>
-    <w:basedOn w:val="a0"/>
-    <w:uiPriority w:val="99"/>
-    <w:semiHidden/>
-    <w:rsid w:val="00322B09"/>
-    <w:rPr>
-      <w:color w:val="808080"/>
-    </w:rPr>
-  </w:style>
-</w:styles>
-</file>
-
 <file path=word/glossary/webSettings.xml><?xml version="1.0" encoding="utf-8"?>
-<w:webSettings xmlns:mc="http://schemas.openxmlformats.org/markup-compatibility/2006" xmlns:r="http://schemas.openxmlformats.org/officeDocument/2006/relationships" xmlns:w="http://schemas.openxmlformats.org/wordprocessingml/2006/main" xmlns:w14="http://schemas.microsoft.com/office/word/2010/wordml" mc:Ignorable="w14">
+<w:webSettings xmlns:mc="http://schemas.openxmlformats.org/markup-compatibility/2006" xmlns:r="http://schemas.openxmlformats.org/officeDocument/2006/relationships" xmlns:w="http://schemas.openxmlformats.org/wordprocessingml/2006/main" xmlns:w14="http://schemas.microsoft.com/office/word/2010/wordml" xmlns:w15="http://schemas.microsoft.com/office/word/2012/wordml" xmlns:w16cid="http://schemas.microsoft.com/office/word/2016/wordml/cid" xmlns:w16se="http://schemas.microsoft.com/office/word/2015/wordml/symex" mc:Ignorable="w14 w15 w16se w16cid">
   <w:optimizeForBrowser/>
   <w:allowPNG/>
 </w:webSettings>

</xml_diff>